<commit_message>
Casos de uso - 2 nuevos casos
</commit_message>
<xml_diff>
--- a/Casos_de_uso.docx
+++ b/Casos_de_uso.docx
@@ -423,7 +423,13 @@
     </w:p>
     <w:p>
       <w:r>
-        <w:t>Actor principal: estudiante.</w:t>
+        <w:t xml:space="preserve">Actor principal: </w:t>
+      </w:r>
+      <w:r>
+        <w:t>bibliotecario</w:t>
+      </w:r>
+      <w:r>
+        <w:t>.</w:t>
       </w:r>
     </w:p>
     <w:p>
@@ -440,10 +446,34 @@
         </w:numPr>
       </w:pPr>
       <w:r>
-        <w:t xml:space="preserve">Estudiante: </w:t>
-      </w:r>
-      <w:r>
-        <w:t>desea obtener el libro físicamente y que el sistema registre el préstamo.</w:t>
+        <w:t>Bibliotecario</w:t>
+      </w:r>
+      <w:r>
+        <w:t xml:space="preserve">: </w:t>
+      </w:r>
+      <w:r>
+        <w:t xml:space="preserve">desea </w:t>
+      </w:r>
+      <w:r>
+        <w:t xml:space="preserve">registrar un préstamo en el sistema </w:t>
+      </w:r>
+      <w:r>
+        <w:t>tener control del inventario</w:t>
+      </w:r>
+      <w:r>
+        <w:t>.</w:t>
+      </w:r>
+    </w:p>
+    <w:p>
+      <w:pPr>
+        <w:pStyle w:val="Prrafodelista"/>
+        <w:numPr>
+          <w:ilvl w:val="0"/>
+          <w:numId w:val="1"/>
+        </w:numPr>
+      </w:pPr>
+      <w:r>
+        <w:t>Estudiante: desea obtener un ejemplar físico de un libro.</w:t>
       </w:r>
     </w:p>
     <w:p>
@@ -478,7 +508,31 @@
         </w:numPr>
       </w:pPr>
       <w:r>
-        <w:t>El estudiante debe haber iniciado sesión en el sistema.</w:t>
+        <w:t xml:space="preserve">El </w:t>
+      </w:r>
+      <w:r>
+        <w:t>bibliotecario</w:t>
+      </w:r>
+      <w:r>
+        <w:t xml:space="preserve"> debe haber iniciado sesión en el sistema.</w:t>
+      </w:r>
+    </w:p>
+    <w:p>
+      <w:pPr>
+        <w:pStyle w:val="Prrafodelista"/>
+        <w:numPr>
+          <w:ilvl w:val="0"/>
+          <w:numId w:val="1"/>
+        </w:numPr>
+      </w:pPr>
+      <w:r>
+        <w:t xml:space="preserve">El </w:t>
+      </w:r>
+      <w:r>
+        <w:t>e</w:t>
+      </w:r>
+      <w:r>
+        <w:t>studiante debe estar previamente registrado en el sistema.</w:t>
       </w:r>
     </w:p>
     <w:p>
@@ -519,7 +573,19 @@
         </w:numPr>
       </w:pPr>
       <w:r>
-        <w:t>El estudiante accede a la sección de préstamos.</w:t>
+        <w:t xml:space="preserve">El </w:t>
+      </w:r>
+      <w:r>
+        <w:t>bibliotecario</w:t>
+      </w:r>
+      <w:r>
+        <w:t xml:space="preserve"> </w:t>
+      </w:r>
+      <w:r>
+        <w:t>accede a la sección “Gestión de préstamos”</w:t>
+      </w:r>
+      <w:r>
+        <w:t>.</w:t>
       </w:r>
     </w:p>
     <w:p>
@@ -531,10 +597,19 @@
         </w:numPr>
       </w:pPr>
       <w:r>
-        <w:t>El estudiante introduce el ISBN del libro</w:t>
-      </w:r>
-      <w:r>
-        <w:t xml:space="preserve"> y le da al botón “Realizar préstamo”</w:t>
+        <w:t xml:space="preserve">El </w:t>
+      </w:r>
+      <w:r>
+        <w:t>bibliotecario</w:t>
+      </w:r>
+      <w:r>
+        <w:t xml:space="preserve"> </w:t>
+      </w:r>
+      <w:r>
+        <w:t>introduce el ISBN y el identificador del estudiante, y le da a realizar préstamo</w:t>
+      </w:r>
+      <w:r>
+        <w:t>.</w:t>
       </w:r>
     </w:p>
     <w:p>
@@ -582,7 +657,14 @@
         </w:numPr>
       </w:pPr>
       <w:r>
-        <w:t>El estudiante confirma el préstamo.</w:t>
+        <w:lastRenderedPageBreak/>
+        <w:t xml:space="preserve">El </w:t>
+      </w:r>
+      <w:r>
+        <w:t>bibliotecario</w:t>
+      </w:r>
+      <w:r>
+        <w:t xml:space="preserve"> confirma el préstamo.</w:t>
       </w:r>
     </w:p>
     <w:p>
@@ -594,7 +676,6 @@
         </w:numPr>
       </w:pPr>
       <w:r>
-        <w:lastRenderedPageBreak/>
         <w:t>El sistema actualiza el atributo de préstamo del libro y actualiza el contador de préstamos del estudiante.</w:t>
       </w:r>
     </w:p>
@@ -1699,7 +1780,7 @@
           <w:sz w:val="28"/>
           <w:szCs w:val="28"/>
         </w:rPr>
-        <w:t>Consultar préstamos activos</w:t>
+        <w:t>Prorrogar préstamo</w:t>
       </w:r>
       <w:r>
         <w:rPr>
@@ -1745,21 +1826,30 @@
         </w:numPr>
       </w:pPr>
       <w:r>
-        <w:t xml:space="preserve">Estudiante: desea </w:t>
-      </w:r>
-      <w:r>
-        <w:t>disponer de más tiempo de préstamo</w:t>
+        <w:t>Estudiante: desea disponer de más tiempo de préstamo.</w:t>
+      </w:r>
+    </w:p>
+    <w:p>
+      <w:r>
+        <w:t xml:space="preserve">Precondiciones: </w:t>
+      </w:r>
+    </w:p>
+    <w:p>
+      <w:pPr>
+        <w:pStyle w:val="Prrafodelista"/>
+        <w:numPr>
+          <w:ilvl w:val="0"/>
+          <w:numId w:val="1"/>
+        </w:numPr>
+      </w:pPr>
+      <w:r>
+        <w:t>El sistema debe estar conectado a la red local y la base de datos operativa</w:t>
       </w:r>
       <w:r>
         <w:t>.</w:t>
       </w:r>
     </w:p>
     <w:p>
-      <w:r>
-        <w:t xml:space="preserve">Precondiciones: </w:t>
-      </w:r>
-    </w:p>
-    <w:p>
       <w:pPr>
         <w:pStyle w:val="Prrafodelista"/>
         <w:numPr>
@@ -1768,10 +1858,7 @@
         </w:numPr>
       </w:pPr>
       <w:r>
-        <w:t>El sistema debe estar conectado a la red local y la base de datos operativa</w:t>
-      </w:r>
-      <w:r>
-        <w:t>.</w:t>
+        <w:t>El estudiante debe haber iniciado sesión en su cuenta.</w:t>
       </w:r>
     </w:p>
     <w:p>
@@ -1783,27 +1870,12 @@
         </w:numPr>
       </w:pPr>
       <w:r>
-        <w:t>El estudiante debe haber iniciado sesión en su cuenta.</w:t>
-      </w:r>
-    </w:p>
-    <w:p>
-      <w:pPr>
-        <w:pStyle w:val="Prrafodelista"/>
-        <w:numPr>
-          <w:ilvl w:val="0"/>
-          <w:numId w:val="1"/>
-        </w:numPr>
-      </w:pPr>
-      <w:r>
         <w:t>El estudiante debe tener un libro en préstamo.</w:t>
       </w:r>
     </w:p>
     <w:p>
       <w:r>
-        <w:t xml:space="preserve">Garantías de éxito: </w:t>
-      </w:r>
-      <w:r>
-        <w:t>e</w:t>
+        <w:t>Garantías de éxito: e</w:t>
       </w:r>
       <w:r>
         <w:t>l sistema actualiza la fecha de devolución sumando 7 días adicionales a la fecha límite original</w:t>
@@ -1989,7 +2061,7 @@
         <w:pStyle w:val="Prrafodelista"/>
         <w:numPr>
           <w:ilvl w:val="0"/>
-          <w:numId w:val="18"/>
+          <w:numId w:val="31"/>
         </w:numPr>
       </w:pPr>
       <w:r>
@@ -2006,7 +2078,7 @@
         <w:pStyle w:val="Prrafodelista"/>
         <w:numPr>
           <w:ilvl w:val="0"/>
-          <w:numId w:val="19"/>
+          <w:numId w:val="32"/>
         </w:numPr>
       </w:pPr>
       <w:r>
@@ -2053,7 +2125,10 @@
     </w:p>
     <w:p>
       <w:r>
-        <w:t xml:space="preserve">4ª. </w:t>
+        <w:t>4</w:t>
+      </w:r>
+      <w:r>
+        <w:t>a. El sistema calcula la nueva fecha sumando 7 días a la anterior fecha límite.</w:t>
       </w:r>
     </w:p>
     <w:p>
@@ -2130,7 +2205,7 @@
           <w:sz w:val="28"/>
           <w:szCs w:val="28"/>
         </w:rPr>
-        <w:t>Gestionar catalogo</w:t>
+        <w:t xml:space="preserve">Gestionar </w:t>
       </w:r>
       <w:r>
         <w:rPr>
@@ -2139,6 +2214,15 @@
           <w:sz w:val="28"/>
           <w:szCs w:val="28"/>
         </w:rPr>
+        <w:t>catálogo</w:t>
+      </w:r>
+      <w:r>
+        <w:rPr>
+          <w:b/>
+          <w:bCs/>
+          <w:sz w:val="28"/>
+          <w:szCs w:val="28"/>
+        </w:rPr>
         <w:t>.</w:t>
       </w:r>
     </w:p>
@@ -2160,56 +2244,248 @@
     <w:p>
       <w:r>
         <w:lastRenderedPageBreak/>
-        <w:t xml:space="preserve">Actor principal: </w:t>
+        <w:t>Actor principal: bibliotecario.</w:t>
+      </w:r>
+    </w:p>
+    <w:p>
+      <w:r>
+        <w:t>Personal involucrado e intereses:</w:t>
+      </w:r>
+    </w:p>
+    <w:p>
+      <w:pPr>
+        <w:pStyle w:val="Prrafodelista"/>
+        <w:numPr>
+          <w:ilvl w:val="0"/>
+          <w:numId w:val="1"/>
+        </w:numPr>
+      </w:pPr>
+      <w:r>
+        <w:t>Bibliotecario: desea mantener actualizado el inventario de la biblioteca, añadiendo adquisiciones o retirando los no aptos.</w:t>
+      </w:r>
+    </w:p>
+    <w:p>
+      <w:r>
+        <w:t xml:space="preserve">Precondiciones: </w:t>
+      </w:r>
+    </w:p>
+    <w:p>
+      <w:pPr>
+        <w:pStyle w:val="Prrafodelista"/>
+        <w:numPr>
+          <w:ilvl w:val="0"/>
+          <w:numId w:val="1"/>
+        </w:numPr>
+      </w:pPr>
+      <w:r>
+        <w:t>El sistema debe estar conectado a la red local y la base de datos operativa</w:t>
+      </w:r>
+      <w:r>
+        <w:t>.</w:t>
+      </w:r>
+    </w:p>
+    <w:p>
+      <w:pPr>
+        <w:pStyle w:val="Prrafodelista"/>
+        <w:numPr>
+          <w:ilvl w:val="0"/>
+          <w:numId w:val="1"/>
+        </w:numPr>
+      </w:pPr>
+      <w:r>
+        <w:t xml:space="preserve">El </w:t>
       </w:r>
       <w:r>
         <w:t>bibliotecario</w:t>
       </w:r>
       <w:r>
+        <w:t xml:space="preserve"> debe haber iniciado sesión en su cuenta.</w:t>
+      </w:r>
+    </w:p>
+    <w:p>
+      <w:r>
+        <w:t xml:space="preserve">Garantías de éxito: </w:t>
+      </w:r>
+      <w:r>
+        <w:t xml:space="preserve">el </w:t>
+      </w:r>
+      <w:r>
+        <w:t>sistema actualiza la base de datos reflejando el alta del nuevo libro o la eliminación del ejemplar retirado</w:t>
+      </w:r>
+      <w:r>
         <w:t>.</w:t>
       </w:r>
     </w:p>
     <w:p>
-      <w:r>
-        <w:t>Personal involucrado e intereses:</w:t>
-      </w:r>
-    </w:p>
-    <w:p>
-      <w:pPr>
-        <w:pStyle w:val="Prrafodelista"/>
-        <w:numPr>
-          <w:ilvl w:val="0"/>
-          <w:numId w:val="1"/>
-        </w:numPr>
-      </w:pPr>
-      <w:r>
-        <w:t>Bibliotecario</w:t>
-      </w:r>
-      <w:r>
-        <w:t xml:space="preserve">: desea </w:t>
-      </w:r>
-      <w:r>
-        <w:t>mantener actualizado el inventario de la biblioteca, añadiendo adquisiciones o retirando los no aptos</w:t>
+      <w:pPr>
+        <w:rPr>
+          <w:b/>
+          <w:bCs/>
+        </w:rPr>
+      </w:pPr>
+      <w:r>
+        <w:rPr>
+          <w:b/>
+          <w:bCs/>
+        </w:rPr>
+        <w:t>Flujo básico:</w:t>
+      </w:r>
+    </w:p>
+    <w:p>
+      <w:pPr>
+        <w:pStyle w:val="Prrafodelista"/>
+        <w:numPr>
+          <w:ilvl w:val="0"/>
+          <w:numId w:val="26"/>
+        </w:numPr>
+      </w:pPr>
+      <w:r>
+        <w:t>El bibliotecario accede a la sección “Gestionar inventario”.</w:t>
+      </w:r>
+    </w:p>
+    <w:p>
+      <w:pPr>
+        <w:pStyle w:val="Prrafodelista"/>
+        <w:numPr>
+          <w:ilvl w:val="0"/>
+          <w:numId w:val="26"/>
+        </w:numPr>
+      </w:pPr>
+      <w:r>
+        <w:t>El bibliotecario selecciona la operación que desea: Alta o Baja.</w:t>
+      </w:r>
+    </w:p>
+    <w:p>
+      <w:pPr>
+        <w:pStyle w:val="Prrafodelista"/>
+        <w:numPr>
+          <w:ilvl w:val="0"/>
+          <w:numId w:val="26"/>
+        </w:numPr>
+      </w:pPr>
+      <w:r>
+        <w:t>Si es alta: el bibliotecario introduce los datos del nuevo libro (ISBN, título, autor, tema, fecha de llegada).</w:t>
+      </w:r>
+    </w:p>
+    <w:p>
+      <w:pPr>
+        <w:pStyle w:val="Prrafodelista"/>
+        <w:numPr>
+          <w:ilvl w:val="0"/>
+          <w:numId w:val="26"/>
+        </w:numPr>
+      </w:pPr>
+      <w:r>
+        <w:t>Si es baja: el bibliotecario busca el libro por ISBN y selecciona “Retirar” indicando el motivo.</w:t>
+      </w:r>
+    </w:p>
+    <w:p>
+      <w:pPr>
+        <w:pStyle w:val="Prrafodelista"/>
+        <w:numPr>
+          <w:ilvl w:val="0"/>
+          <w:numId w:val="26"/>
+        </w:numPr>
+      </w:pPr>
+      <w:r>
+        <w:t xml:space="preserve">El sistema </w:t>
+      </w:r>
+      <w:r>
+        <w:t>comprueba que el libro no tenga préstamos o reservas activas.</w:t>
+      </w:r>
+    </w:p>
+    <w:p>
+      <w:pPr>
+        <w:pStyle w:val="Prrafodelista"/>
+        <w:numPr>
+          <w:ilvl w:val="0"/>
+          <w:numId w:val="26"/>
+        </w:numPr>
+      </w:pPr>
+      <w:r>
+        <w:t>El sistema actualiza la base de datos e informa que la operación ha sido realizada.</w:t>
+      </w:r>
+      <w:r>
+        <w:t xml:space="preserve"> </w:t>
+      </w:r>
+    </w:p>
+    <w:p>
+      <w:r>
+        <w:rPr>
+          <w:b/>
+          <w:bCs/>
+        </w:rPr>
+        <w:t>Flujos alternativos:</w:t>
+      </w:r>
+    </w:p>
+    <w:p>
+      <w:r>
+        <w:t xml:space="preserve">3a. </w:t>
+      </w:r>
+      <w:r>
+        <w:t>El ISBN ya existe en el sistema</w:t>
+      </w:r>
+      <w:r>
+        <w:t>:</w:t>
+      </w:r>
+    </w:p>
+    <w:p>
+      <w:pPr>
+        <w:pStyle w:val="Prrafodelista"/>
+        <w:numPr>
+          <w:ilvl w:val="0"/>
+          <w:numId w:val="27"/>
+        </w:numPr>
+      </w:pPr>
+      <w:r>
+        <w:t xml:space="preserve">El sistema </w:t>
+      </w:r>
+      <w:r>
+        <w:t>indica que el ejemplar ya está registrado y ofrece la opción de aumentar el número de copias</w:t>
       </w:r>
       <w:r>
         <w:t>.</w:t>
       </w:r>
     </w:p>
     <w:p>
-      <w:r>
-        <w:t xml:space="preserve">Precondiciones: </w:t>
-      </w:r>
-    </w:p>
-    <w:p>
-      <w:pPr>
-        <w:pStyle w:val="Prrafodelista"/>
-        <w:numPr>
-          <w:ilvl w:val="0"/>
-          <w:numId w:val="1"/>
-        </w:numPr>
-      </w:pPr>
-      <w:r>
-        <w:t>El sistema debe estar conectado a la red local y la base de datos operativa</w:t>
+      <w:pPr>
+        <w:pStyle w:val="Prrafodelista"/>
+        <w:numPr>
+          <w:ilvl w:val="0"/>
+          <w:numId w:val="27"/>
+        </w:numPr>
+      </w:pPr>
+      <w:r>
+        <w:t>El caso de uso finaliza.</w:t>
+      </w:r>
+    </w:p>
+    <w:p>
+      <w:r>
+        <w:t>5a</w:t>
+      </w:r>
+      <w:r>
+        <w:t>. El</w:t>
+      </w:r>
+      <w:r>
+        <w:t xml:space="preserve"> libro tiene préstamos o reservas</w:t>
+      </w:r>
+      <w:r>
+        <w:t>:</w:t>
+      </w:r>
+    </w:p>
+    <w:p>
+      <w:pPr>
+        <w:pStyle w:val="Prrafodelista"/>
+        <w:numPr>
+          <w:ilvl w:val="0"/>
+          <w:numId w:val="28"/>
+        </w:numPr>
+      </w:pPr>
+      <w:r>
+        <w:t>El sistema</w:t>
+      </w:r>
+      <w:r>
+        <w:t xml:space="preserve"> bloquea la baja y muestra un error indicando que el libro esta comprometido</w:t>
       </w:r>
       <w:r>
         <w:t>.</w:t>
@@ -2220,273 +2496,103 @@
         <w:pStyle w:val="Prrafodelista"/>
         <w:numPr>
           <w:ilvl w:val="0"/>
-          <w:numId w:val="1"/>
-        </w:numPr>
-      </w:pPr>
-      <w:r>
-        <w:t>El estudiante debe haber iniciado sesión en su cuenta.</w:t>
-      </w:r>
-    </w:p>
-    <w:p>
-      <w:pPr>
-        <w:pStyle w:val="Prrafodelista"/>
-        <w:numPr>
-          <w:ilvl w:val="0"/>
-          <w:numId w:val="1"/>
-        </w:numPr>
-      </w:pPr>
-      <w:r>
-        <w:t>El estudiante debe tener un libro en préstamo.</w:t>
-      </w:r>
-    </w:p>
-    <w:p>
-      <w:r>
-        <w:t>Garantías de éxito: e</w:t>
-      </w:r>
-      <w:r>
-        <w:t>l sistema actualiza la fecha de devolución sumando 7 días adicionales a la fecha límite original</w:t>
+          <w:numId w:val="28"/>
+        </w:numPr>
+      </w:pPr>
+      <w:r>
+        <w:t>El caso de uso finaliza.</w:t>
+      </w:r>
+    </w:p>
+    <w:p>
+      <w:r>
+        <w:t>*a. El sistema falla al conectar con la base de datos:</w:t>
+      </w:r>
+    </w:p>
+    <w:p>
+      <w:pPr>
+        <w:pStyle w:val="Prrafodelista"/>
+        <w:numPr>
+          <w:ilvl w:val="0"/>
+          <w:numId w:val="29"/>
+        </w:numPr>
+      </w:pPr>
+      <w:r>
+        <w:t>El sistema muestra un mensaje indicando que hay un error.</w:t>
+      </w:r>
+    </w:p>
+    <w:p>
+      <w:r>
+        <w:t>*b. El sistema no puede conectar con la red local:</w:t>
+      </w:r>
+    </w:p>
+    <w:p>
+      <w:pPr>
+        <w:pStyle w:val="Prrafodelista"/>
+        <w:numPr>
+          <w:ilvl w:val="0"/>
+          <w:numId w:val="30"/>
+        </w:numPr>
+      </w:pPr>
+      <w:r>
+        <w:t>El sistema muestra un mensaje indicando que hay un error.</w:t>
+      </w:r>
+    </w:p>
+    <w:p>
+      <w:pPr>
+        <w:rPr>
+          <w:b/>
+          <w:bCs/>
+        </w:rPr>
+      </w:pPr>
+      <w:r>
+        <w:rPr>
+          <w:b/>
+          <w:bCs/>
+        </w:rPr>
+        <w:t>Lista de tecnología y variaciones de datos:</w:t>
+      </w:r>
+    </w:p>
+    <w:p>
+      <w:r>
+        <w:lastRenderedPageBreak/>
+        <w:t>3-4a. El ISBN debe ser formato ISBN-13.</w:t>
+      </w:r>
+    </w:p>
+    <w:p>
+      <w:pPr>
+        <w:rPr>
+          <w:b/>
+          <w:bCs/>
+        </w:rPr>
+      </w:pPr>
+      <w:r>
+        <w:rPr>
+          <w:b/>
+          <w:bCs/>
+        </w:rPr>
+        <w:t>Información relacionada:</w:t>
+      </w:r>
+    </w:p>
+    <w:p>
+      <w:r>
+        <w:t xml:space="preserve">Prioridad: </w:t>
+      </w:r>
+      <w:r>
+        <w:t>media</w:t>
       </w:r>
       <w:r>
         <w:t>.</w:t>
       </w:r>
     </w:p>
     <w:p>
-      <w:pPr>
-        <w:rPr>
-          <w:b/>
-          <w:bCs/>
-        </w:rPr>
-      </w:pPr>
-      <w:r>
-        <w:rPr>
-          <w:b/>
-          <w:bCs/>
-        </w:rPr>
-        <w:t>Flujo básico:</w:t>
-      </w:r>
-    </w:p>
-    <w:p>
-      <w:pPr>
-        <w:pStyle w:val="Prrafodelista"/>
-        <w:numPr>
-          <w:ilvl w:val="0"/>
-          <w:numId w:val="23"/>
-        </w:numPr>
-      </w:pPr>
-      <w:r>
-        <w:t>El estudiante accede a la sección “Mis Préstamos”.</w:t>
-      </w:r>
-    </w:p>
-    <w:p>
-      <w:pPr>
-        <w:pStyle w:val="Prrafodelista"/>
-        <w:numPr>
-          <w:ilvl w:val="0"/>
-          <w:numId w:val="23"/>
-        </w:numPr>
-      </w:pPr>
-      <w:r>
-        <w:t>El estudiante selecciona el libro que desea prorrogar.</w:t>
-      </w:r>
-    </w:p>
-    <w:p>
-      <w:pPr>
-        <w:pStyle w:val="Prrafodelista"/>
-        <w:numPr>
-          <w:ilvl w:val="0"/>
-          <w:numId w:val="23"/>
-        </w:numPr>
-      </w:pPr>
-      <w:r>
-        <w:t>El sistema valida que el libro no tenga ninguna reserva activa por parte de otro usuario.</w:t>
-      </w:r>
-    </w:p>
-    <w:p>
-      <w:pPr>
-        <w:pStyle w:val="Prrafodelista"/>
-        <w:numPr>
-          <w:ilvl w:val="0"/>
-          <w:numId w:val="23"/>
-        </w:numPr>
-      </w:pPr>
-      <w:r>
-        <w:t>El sistema modifica el atributo "fecha devolución", extendiéndolo 7 días más sobre la fecha límite anterior.</w:t>
-      </w:r>
-    </w:p>
-    <w:p>
-      <w:pPr>
-        <w:pStyle w:val="Prrafodelista"/>
-        <w:numPr>
-          <w:ilvl w:val="0"/>
-          <w:numId w:val="23"/>
-        </w:numPr>
-      </w:pPr>
-      <w:r>
-        <w:t>El sistema muestra la nueva fecha de devolución al estudiante.</w:t>
-      </w:r>
-    </w:p>
-    <w:p>
-      <w:r>
-        <w:rPr>
-          <w:b/>
-          <w:bCs/>
-        </w:rPr>
-        <w:t>Flujos alternativos:</w:t>
-      </w:r>
-    </w:p>
-    <w:p>
-      <w:r>
-        <w:t>3a. El libro tiene reservas activas:</w:t>
-      </w:r>
-    </w:p>
-    <w:p>
-      <w:pPr>
-        <w:pStyle w:val="Prrafodelista"/>
-        <w:numPr>
-          <w:ilvl w:val="0"/>
-          <w:numId w:val="24"/>
-        </w:numPr>
-      </w:pPr>
-      <w:r>
-        <w:t xml:space="preserve">El sistema muestra un mensaje indicando que </w:t>
-      </w:r>
-      <w:r>
-        <w:t>el libro ha sido reservado y no puede prorrogarse.</w:t>
-      </w:r>
-    </w:p>
-    <w:p>
-      <w:pPr>
-        <w:pStyle w:val="Prrafodelista"/>
-        <w:numPr>
-          <w:ilvl w:val="0"/>
-          <w:numId w:val="24"/>
-        </w:numPr>
-      </w:pPr>
-      <w:r>
-        <w:t>El caso de uso finaliza.</w:t>
-      </w:r>
-    </w:p>
-    <w:p>
-      <w:r>
-        <w:t>3b. El estudiante ya ha realizado una prórroga en ese préstamo:</w:t>
-      </w:r>
-    </w:p>
-    <w:p>
-      <w:pPr>
-        <w:pStyle w:val="Prrafodelista"/>
-        <w:numPr>
-          <w:ilvl w:val="0"/>
-          <w:numId w:val="25"/>
-        </w:numPr>
-      </w:pPr>
-      <w:r>
-        <w:t>El sistema informa de que se ha alcanzado el máximo de 21 días de préstamo.</w:t>
-      </w:r>
-    </w:p>
-    <w:p>
-      <w:pPr>
-        <w:pStyle w:val="Prrafodelista"/>
-        <w:numPr>
-          <w:ilvl w:val="0"/>
-          <w:numId w:val="25"/>
-        </w:numPr>
-      </w:pPr>
-      <w:r>
-        <w:t>El caso de uso finaliza.</w:t>
-      </w:r>
-    </w:p>
-    <w:p>
-      <w:r>
-        <w:t>*a. El sistema falla al conectar con la base de datos:</w:t>
-      </w:r>
-    </w:p>
-    <w:p>
-      <w:pPr>
-        <w:pStyle w:val="Prrafodelista"/>
-        <w:numPr>
-          <w:ilvl w:val="0"/>
-          <w:numId w:val="18"/>
-        </w:numPr>
-      </w:pPr>
-      <w:r>
-        <w:t>El sistema muestra un mensaje indicando que hay un error.</w:t>
-      </w:r>
-    </w:p>
-    <w:p>
-      <w:r>
-        <w:t>*b. El sistema no puede conectar con la red local:</w:t>
-      </w:r>
-    </w:p>
-    <w:p>
-      <w:pPr>
-        <w:pStyle w:val="Prrafodelista"/>
-        <w:numPr>
-          <w:ilvl w:val="0"/>
-          <w:numId w:val="19"/>
-        </w:numPr>
-      </w:pPr>
-      <w:r>
-        <w:t>El sistema muestra un mensaje indicando que hay un error.</w:t>
-      </w:r>
-    </w:p>
-    <w:p>
-      <w:pPr>
-        <w:rPr>
-          <w:b/>
-          <w:bCs/>
-        </w:rPr>
-      </w:pPr>
-      <w:r>
-        <w:rPr>
-          <w:b/>
-          <w:bCs/>
-        </w:rPr>
-        <w:t>Lista de tecnología y variaciones de datos:</w:t>
-      </w:r>
-    </w:p>
-    <w:p>
-      <w:r>
-        <w:lastRenderedPageBreak/>
-        <w:t xml:space="preserve">2a. </w:t>
-      </w:r>
-      <w:r>
-        <w:t xml:space="preserve">La </w:t>
-      </w:r>
-      <w:r>
-        <w:t>prórroga se solicita a través de la interfaz de la terminal</w:t>
+      <w:r>
+        <w:t xml:space="preserve">Frecuencia: </w:t>
+      </w:r>
+      <w:r>
+        <w:t>media</w:t>
       </w:r>
       <w:r>
         <w:t>.</w:t>
-      </w:r>
-    </w:p>
-    <w:p>
-      <w:r>
-        <w:t xml:space="preserve">4ª. </w:t>
-      </w:r>
-    </w:p>
-    <w:p>
-      <w:pPr>
-        <w:rPr>
-          <w:b/>
-          <w:bCs/>
-        </w:rPr>
-      </w:pPr>
-      <w:r>
-        <w:rPr>
-          <w:b/>
-          <w:bCs/>
-        </w:rPr>
-        <w:t>Información relacionada:</w:t>
-      </w:r>
-    </w:p>
-    <w:p>
-      <w:r>
-        <w:t>Prioridad: alta.</w:t>
-      </w:r>
-    </w:p>
-    <w:p>
-      <w:r>
-        <w:t>Frecuencia: alta.</w:t>
       </w:r>
     </w:p>
     <w:p>
@@ -2511,7 +2617,10 @@
     <w:p/>
     <w:p>
       <w:r>
-        <w:t>Caso de uso: Recibir notificación?</w:t>
+        <w:t xml:space="preserve">Caso de uso: </w:t>
+      </w:r>
+      <w:r>
+        <w:t>¿Recibir notificación?</w:t>
       </w:r>
     </w:p>
     <w:p/>
@@ -2706,6 +2815,95 @@
     </w:lvl>
   </w:abstractNum>
   <w:abstractNum w:abstractNumId="2" w15:restartNumberingAfterBreak="0">
+    <w:nsid w:val="04B70B3B"/>
+    <w:multiLevelType w:val="hybridMultilevel"/>
+    <w:tmpl w:val="67943264"/>
+    <w:lvl w:ilvl="0" w:tplc="FFFFFFFF">
+      <w:start w:val="1"/>
+      <w:numFmt w:val="decimal"/>
+      <w:lvlText w:val="%1."/>
+      <w:lvlJc w:val="left"/>
+      <w:pPr>
+        <w:ind w:left="720" w:hanging="360"/>
+      </w:pPr>
+      <w:rPr>
+        <w:rFonts w:hint="default"/>
+      </w:rPr>
+    </w:lvl>
+    <w:lvl w:ilvl="1" w:tplc="FFFFFFFF" w:tentative="1">
+      <w:start w:val="1"/>
+      <w:numFmt w:val="lowerLetter"/>
+      <w:lvlText w:val="%2."/>
+      <w:lvlJc w:val="left"/>
+      <w:pPr>
+        <w:ind w:left="1440" w:hanging="360"/>
+      </w:pPr>
+    </w:lvl>
+    <w:lvl w:ilvl="2" w:tplc="FFFFFFFF" w:tentative="1">
+      <w:start w:val="1"/>
+      <w:numFmt w:val="lowerRoman"/>
+      <w:lvlText w:val="%3."/>
+      <w:lvlJc w:val="right"/>
+      <w:pPr>
+        <w:ind w:left="2160" w:hanging="180"/>
+      </w:pPr>
+    </w:lvl>
+    <w:lvl w:ilvl="3" w:tplc="FFFFFFFF" w:tentative="1">
+      <w:start w:val="1"/>
+      <w:numFmt w:val="decimal"/>
+      <w:lvlText w:val="%4."/>
+      <w:lvlJc w:val="left"/>
+      <w:pPr>
+        <w:ind w:left="2880" w:hanging="360"/>
+      </w:pPr>
+    </w:lvl>
+    <w:lvl w:ilvl="4" w:tplc="FFFFFFFF" w:tentative="1">
+      <w:start w:val="1"/>
+      <w:numFmt w:val="lowerLetter"/>
+      <w:lvlText w:val="%5."/>
+      <w:lvlJc w:val="left"/>
+      <w:pPr>
+        <w:ind w:left="3600" w:hanging="360"/>
+      </w:pPr>
+    </w:lvl>
+    <w:lvl w:ilvl="5" w:tplc="FFFFFFFF" w:tentative="1">
+      <w:start w:val="1"/>
+      <w:numFmt w:val="lowerRoman"/>
+      <w:lvlText w:val="%6."/>
+      <w:lvlJc w:val="right"/>
+      <w:pPr>
+        <w:ind w:left="4320" w:hanging="180"/>
+      </w:pPr>
+    </w:lvl>
+    <w:lvl w:ilvl="6" w:tplc="FFFFFFFF" w:tentative="1">
+      <w:start w:val="1"/>
+      <w:numFmt w:val="decimal"/>
+      <w:lvlText w:val="%7."/>
+      <w:lvlJc w:val="left"/>
+      <w:pPr>
+        <w:ind w:left="5040" w:hanging="360"/>
+      </w:pPr>
+    </w:lvl>
+    <w:lvl w:ilvl="7" w:tplc="FFFFFFFF" w:tentative="1">
+      <w:start w:val="1"/>
+      <w:numFmt w:val="lowerLetter"/>
+      <w:lvlText w:val="%8."/>
+      <w:lvlJc w:val="left"/>
+      <w:pPr>
+        <w:ind w:left="5760" w:hanging="360"/>
+      </w:pPr>
+    </w:lvl>
+    <w:lvl w:ilvl="8" w:tplc="FFFFFFFF" w:tentative="1">
+      <w:start w:val="1"/>
+      <w:numFmt w:val="lowerRoman"/>
+      <w:lvlText w:val="%9."/>
+      <w:lvlJc w:val="right"/>
+      <w:pPr>
+        <w:ind w:left="6480" w:hanging="180"/>
+      </w:pPr>
+    </w:lvl>
+  </w:abstractNum>
+  <w:abstractNum w:abstractNumId="3" w15:restartNumberingAfterBreak="0">
     <w:nsid w:val="0D053642"/>
     <w:multiLevelType w:val="hybridMultilevel"/>
     <w:tmpl w:val="2FCC281C"/>
@@ -2794,7 +2992,7 @@
       </w:pPr>
     </w:lvl>
   </w:abstractNum>
-  <w:abstractNum w:abstractNumId="3" w15:restartNumberingAfterBreak="0">
+  <w:abstractNum w:abstractNumId="4" w15:restartNumberingAfterBreak="0">
     <w:nsid w:val="0E687120"/>
     <w:multiLevelType w:val="hybridMultilevel"/>
     <w:tmpl w:val="13E6CE20"/>
@@ -2907,7 +3105,7 @@
       </w:rPr>
     </w:lvl>
   </w:abstractNum>
-  <w:abstractNum w:abstractNumId="4" w15:restartNumberingAfterBreak="0">
+  <w:abstractNum w:abstractNumId="5" w15:restartNumberingAfterBreak="0">
     <w:nsid w:val="14860C17"/>
     <w:multiLevelType w:val="hybridMultilevel"/>
     <w:tmpl w:val="0E681FEC"/>
@@ -2993,7 +3191,7 @@
       </w:pPr>
     </w:lvl>
   </w:abstractNum>
-  <w:abstractNum w:abstractNumId="5" w15:restartNumberingAfterBreak="0">
+  <w:abstractNum w:abstractNumId="6" w15:restartNumberingAfterBreak="0">
     <w:nsid w:val="17F11C4F"/>
     <w:multiLevelType w:val="hybridMultilevel"/>
     <w:tmpl w:val="67943264"/>
@@ -3082,7 +3280,7 @@
       </w:pPr>
     </w:lvl>
   </w:abstractNum>
-  <w:abstractNum w:abstractNumId="6" w15:restartNumberingAfterBreak="0">
+  <w:abstractNum w:abstractNumId="7" w15:restartNumberingAfterBreak="0">
     <w:nsid w:val="1993492F"/>
     <w:multiLevelType w:val="hybridMultilevel"/>
     <w:tmpl w:val="0A90B32C"/>
@@ -3171,7 +3369,7 @@
       </w:pPr>
     </w:lvl>
   </w:abstractNum>
-  <w:abstractNum w:abstractNumId="7" w15:restartNumberingAfterBreak="0">
+  <w:abstractNum w:abstractNumId="8" w15:restartNumberingAfterBreak="0">
     <w:nsid w:val="1B274D17"/>
     <w:multiLevelType w:val="hybridMultilevel"/>
     <w:tmpl w:val="55249C14"/>
@@ -3260,7 +3458,7 @@
       </w:pPr>
     </w:lvl>
   </w:abstractNum>
-  <w:abstractNum w:abstractNumId="8" w15:restartNumberingAfterBreak="0">
+  <w:abstractNum w:abstractNumId="9" w15:restartNumberingAfterBreak="0">
     <w:nsid w:val="201C1953"/>
     <w:multiLevelType w:val="hybridMultilevel"/>
     <w:tmpl w:val="2FCC281C"/>
@@ -3349,7 +3547,96 @@
       </w:pPr>
     </w:lvl>
   </w:abstractNum>
-  <w:abstractNum w:abstractNumId="9" w15:restartNumberingAfterBreak="0">
+  <w:abstractNum w:abstractNumId="10" w15:restartNumberingAfterBreak="0">
+    <w:nsid w:val="219E5590"/>
+    <w:multiLevelType w:val="hybridMultilevel"/>
+    <w:tmpl w:val="CF8E17D6"/>
+    <w:lvl w:ilvl="0" w:tplc="FFFFFFFF">
+      <w:start w:val="1"/>
+      <w:numFmt w:val="decimal"/>
+      <w:lvlText w:val="%1."/>
+      <w:lvlJc w:val="left"/>
+      <w:pPr>
+        <w:ind w:left="720" w:hanging="360"/>
+      </w:pPr>
+      <w:rPr>
+        <w:rFonts w:hint="default"/>
+      </w:rPr>
+    </w:lvl>
+    <w:lvl w:ilvl="1" w:tplc="FFFFFFFF" w:tentative="1">
+      <w:start w:val="1"/>
+      <w:numFmt w:val="lowerLetter"/>
+      <w:lvlText w:val="%2."/>
+      <w:lvlJc w:val="left"/>
+      <w:pPr>
+        <w:ind w:left="1440" w:hanging="360"/>
+      </w:pPr>
+    </w:lvl>
+    <w:lvl w:ilvl="2" w:tplc="FFFFFFFF" w:tentative="1">
+      <w:start w:val="1"/>
+      <w:numFmt w:val="lowerRoman"/>
+      <w:lvlText w:val="%3."/>
+      <w:lvlJc w:val="right"/>
+      <w:pPr>
+        <w:ind w:left="2160" w:hanging="180"/>
+      </w:pPr>
+    </w:lvl>
+    <w:lvl w:ilvl="3" w:tplc="FFFFFFFF" w:tentative="1">
+      <w:start w:val="1"/>
+      <w:numFmt w:val="decimal"/>
+      <w:lvlText w:val="%4."/>
+      <w:lvlJc w:val="left"/>
+      <w:pPr>
+        <w:ind w:left="2880" w:hanging="360"/>
+      </w:pPr>
+    </w:lvl>
+    <w:lvl w:ilvl="4" w:tplc="FFFFFFFF" w:tentative="1">
+      <w:start w:val="1"/>
+      <w:numFmt w:val="lowerLetter"/>
+      <w:lvlText w:val="%5."/>
+      <w:lvlJc w:val="left"/>
+      <w:pPr>
+        <w:ind w:left="3600" w:hanging="360"/>
+      </w:pPr>
+    </w:lvl>
+    <w:lvl w:ilvl="5" w:tplc="FFFFFFFF" w:tentative="1">
+      <w:start w:val="1"/>
+      <w:numFmt w:val="lowerRoman"/>
+      <w:lvlText w:val="%6."/>
+      <w:lvlJc w:val="right"/>
+      <w:pPr>
+        <w:ind w:left="4320" w:hanging="180"/>
+      </w:pPr>
+    </w:lvl>
+    <w:lvl w:ilvl="6" w:tplc="FFFFFFFF" w:tentative="1">
+      <w:start w:val="1"/>
+      <w:numFmt w:val="decimal"/>
+      <w:lvlText w:val="%7."/>
+      <w:lvlJc w:val="left"/>
+      <w:pPr>
+        <w:ind w:left="5040" w:hanging="360"/>
+      </w:pPr>
+    </w:lvl>
+    <w:lvl w:ilvl="7" w:tplc="FFFFFFFF" w:tentative="1">
+      <w:start w:val="1"/>
+      <w:numFmt w:val="lowerLetter"/>
+      <w:lvlText w:val="%8."/>
+      <w:lvlJc w:val="left"/>
+      <w:pPr>
+        <w:ind w:left="5760" w:hanging="360"/>
+      </w:pPr>
+    </w:lvl>
+    <w:lvl w:ilvl="8" w:tplc="FFFFFFFF" w:tentative="1">
+      <w:start w:val="1"/>
+      <w:numFmt w:val="lowerRoman"/>
+      <w:lvlText w:val="%9."/>
+      <w:lvlJc w:val="right"/>
+      <w:pPr>
+        <w:ind w:left="6480" w:hanging="180"/>
+      </w:pPr>
+    </w:lvl>
+  </w:abstractNum>
+  <w:abstractNum w:abstractNumId="11" w15:restartNumberingAfterBreak="0">
     <w:nsid w:val="239411E4"/>
     <w:multiLevelType w:val="hybridMultilevel"/>
     <w:tmpl w:val="5F62B224"/>
@@ -3435,7 +3722,7 @@
       </w:pPr>
     </w:lvl>
   </w:abstractNum>
-  <w:abstractNum w:abstractNumId="10" w15:restartNumberingAfterBreak="0">
+  <w:abstractNum w:abstractNumId="12" w15:restartNumberingAfterBreak="0">
     <w:nsid w:val="245A501C"/>
     <w:multiLevelType w:val="hybridMultilevel"/>
     <w:tmpl w:val="0E681FEC"/>
@@ -3521,7 +3808,7 @@
       </w:pPr>
     </w:lvl>
   </w:abstractNum>
-  <w:abstractNum w:abstractNumId="11" w15:restartNumberingAfterBreak="0">
+  <w:abstractNum w:abstractNumId="13" w15:restartNumberingAfterBreak="0">
     <w:nsid w:val="246042B4"/>
     <w:multiLevelType w:val="hybridMultilevel"/>
     <w:tmpl w:val="8496E028"/>
@@ -3634,7 +3921,7 @@
       </w:rPr>
     </w:lvl>
   </w:abstractNum>
-  <w:abstractNum w:abstractNumId="12" w15:restartNumberingAfterBreak="0">
+  <w:abstractNum w:abstractNumId="14" w15:restartNumberingAfterBreak="0">
     <w:nsid w:val="28446F04"/>
     <w:multiLevelType w:val="hybridMultilevel"/>
     <w:tmpl w:val="C78CCDE2"/>
@@ -3723,7 +4010,7 @@
       </w:pPr>
     </w:lvl>
   </w:abstractNum>
-  <w:abstractNum w:abstractNumId="13" w15:restartNumberingAfterBreak="0">
+  <w:abstractNum w:abstractNumId="15" w15:restartNumberingAfterBreak="0">
     <w:nsid w:val="32036CE0"/>
     <w:multiLevelType w:val="hybridMultilevel"/>
     <w:tmpl w:val="A704C338"/>
@@ -3812,7 +4099,7 @@
       </w:pPr>
     </w:lvl>
   </w:abstractNum>
-  <w:abstractNum w:abstractNumId="14" w15:restartNumberingAfterBreak="0">
+  <w:abstractNum w:abstractNumId="16" w15:restartNumberingAfterBreak="0">
     <w:nsid w:val="396F1E33"/>
     <w:multiLevelType w:val="hybridMultilevel"/>
     <w:tmpl w:val="3704E778"/>
@@ -3901,7 +4188,7 @@
       </w:pPr>
     </w:lvl>
   </w:abstractNum>
-  <w:abstractNum w:abstractNumId="15" w15:restartNumberingAfterBreak="0">
+  <w:abstractNum w:abstractNumId="17" w15:restartNumberingAfterBreak="0">
     <w:nsid w:val="3A6B633B"/>
     <w:multiLevelType w:val="hybridMultilevel"/>
     <w:tmpl w:val="C78CCDE2"/>
@@ -3990,7 +4277,96 @@
       </w:pPr>
     </w:lvl>
   </w:abstractNum>
-  <w:abstractNum w:abstractNumId="16" w15:restartNumberingAfterBreak="0">
+  <w:abstractNum w:abstractNumId="18" w15:restartNumberingAfterBreak="0">
+    <w:nsid w:val="3B777710"/>
+    <w:multiLevelType w:val="hybridMultilevel"/>
+    <w:tmpl w:val="9CB65D00"/>
+    <w:lvl w:ilvl="0" w:tplc="0C0A000F">
+      <w:start w:val="1"/>
+      <w:numFmt w:val="decimal"/>
+      <w:lvlText w:val="%1."/>
+      <w:lvlJc w:val="left"/>
+      <w:pPr>
+        <w:ind w:left="720" w:hanging="360"/>
+      </w:pPr>
+      <w:rPr>
+        <w:rFonts w:hint="default"/>
+      </w:rPr>
+    </w:lvl>
+    <w:lvl w:ilvl="1" w:tplc="0C0A0019" w:tentative="1">
+      <w:start w:val="1"/>
+      <w:numFmt w:val="lowerLetter"/>
+      <w:lvlText w:val="%2."/>
+      <w:lvlJc w:val="left"/>
+      <w:pPr>
+        <w:ind w:left="1440" w:hanging="360"/>
+      </w:pPr>
+    </w:lvl>
+    <w:lvl w:ilvl="2" w:tplc="0C0A001B" w:tentative="1">
+      <w:start w:val="1"/>
+      <w:numFmt w:val="lowerRoman"/>
+      <w:lvlText w:val="%3."/>
+      <w:lvlJc w:val="right"/>
+      <w:pPr>
+        <w:ind w:left="2160" w:hanging="180"/>
+      </w:pPr>
+    </w:lvl>
+    <w:lvl w:ilvl="3" w:tplc="0C0A000F" w:tentative="1">
+      <w:start w:val="1"/>
+      <w:numFmt w:val="decimal"/>
+      <w:lvlText w:val="%4."/>
+      <w:lvlJc w:val="left"/>
+      <w:pPr>
+        <w:ind w:left="2880" w:hanging="360"/>
+      </w:pPr>
+    </w:lvl>
+    <w:lvl w:ilvl="4" w:tplc="0C0A0019" w:tentative="1">
+      <w:start w:val="1"/>
+      <w:numFmt w:val="lowerLetter"/>
+      <w:lvlText w:val="%5."/>
+      <w:lvlJc w:val="left"/>
+      <w:pPr>
+        <w:ind w:left="3600" w:hanging="360"/>
+      </w:pPr>
+    </w:lvl>
+    <w:lvl w:ilvl="5" w:tplc="0C0A001B" w:tentative="1">
+      <w:start w:val="1"/>
+      <w:numFmt w:val="lowerRoman"/>
+      <w:lvlText w:val="%6."/>
+      <w:lvlJc w:val="right"/>
+      <w:pPr>
+        <w:ind w:left="4320" w:hanging="180"/>
+      </w:pPr>
+    </w:lvl>
+    <w:lvl w:ilvl="6" w:tplc="0C0A000F" w:tentative="1">
+      <w:start w:val="1"/>
+      <w:numFmt w:val="decimal"/>
+      <w:lvlText w:val="%7."/>
+      <w:lvlJc w:val="left"/>
+      <w:pPr>
+        <w:ind w:left="5040" w:hanging="360"/>
+      </w:pPr>
+    </w:lvl>
+    <w:lvl w:ilvl="7" w:tplc="0C0A0019" w:tentative="1">
+      <w:start w:val="1"/>
+      <w:numFmt w:val="lowerLetter"/>
+      <w:lvlText w:val="%8."/>
+      <w:lvlJc w:val="left"/>
+      <w:pPr>
+        <w:ind w:left="5760" w:hanging="360"/>
+      </w:pPr>
+    </w:lvl>
+    <w:lvl w:ilvl="8" w:tplc="0C0A001B" w:tentative="1">
+      <w:start w:val="1"/>
+      <w:numFmt w:val="lowerRoman"/>
+      <w:lvlText w:val="%9."/>
+      <w:lvlJc w:val="right"/>
+      <w:pPr>
+        <w:ind w:left="6480" w:hanging="180"/>
+      </w:pPr>
+    </w:lvl>
+  </w:abstractNum>
+  <w:abstractNum w:abstractNumId="19" w15:restartNumberingAfterBreak="0">
     <w:nsid w:val="3F0B52D5"/>
     <w:multiLevelType w:val="hybridMultilevel"/>
     <w:tmpl w:val="E5C8E908"/>
@@ -4079,7 +4455,7 @@
       </w:pPr>
     </w:lvl>
   </w:abstractNum>
-  <w:abstractNum w:abstractNumId="17" w15:restartNumberingAfterBreak="0">
+  <w:abstractNum w:abstractNumId="20" w15:restartNumberingAfterBreak="0">
     <w:nsid w:val="45602A6B"/>
     <w:multiLevelType w:val="hybridMultilevel"/>
     <w:tmpl w:val="FB6AB67C"/>
@@ -4165,7 +4541,7 @@
       </w:pPr>
     </w:lvl>
   </w:abstractNum>
-  <w:abstractNum w:abstractNumId="18" w15:restartNumberingAfterBreak="0">
+  <w:abstractNum w:abstractNumId="21" w15:restartNumberingAfterBreak="0">
     <w:nsid w:val="46335C31"/>
     <w:multiLevelType w:val="hybridMultilevel"/>
     <w:tmpl w:val="3704E778"/>
@@ -4254,7 +4630,7 @@
       </w:pPr>
     </w:lvl>
   </w:abstractNum>
-  <w:abstractNum w:abstractNumId="19" w15:restartNumberingAfterBreak="0">
+  <w:abstractNum w:abstractNumId="22" w15:restartNumberingAfterBreak="0">
     <w:nsid w:val="48036643"/>
     <w:multiLevelType w:val="hybridMultilevel"/>
     <w:tmpl w:val="CF8E17D6"/>
@@ -4343,7 +4719,7 @@
       </w:pPr>
     </w:lvl>
   </w:abstractNum>
-  <w:abstractNum w:abstractNumId="20" w15:restartNumberingAfterBreak="0">
+  <w:abstractNum w:abstractNumId="23" w15:restartNumberingAfterBreak="0">
     <w:nsid w:val="4FCE6458"/>
     <w:multiLevelType w:val="hybridMultilevel"/>
     <w:tmpl w:val="6BDC69D8"/>
@@ -4432,7 +4808,7 @@
       </w:pPr>
     </w:lvl>
   </w:abstractNum>
-  <w:abstractNum w:abstractNumId="21" w15:restartNumberingAfterBreak="0">
+  <w:abstractNum w:abstractNumId="24" w15:restartNumberingAfterBreak="0">
     <w:nsid w:val="50330460"/>
     <w:multiLevelType w:val="hybridMultilevel"/>
     <w:tmpl w:val="3704E778"/>
@@ -4521,7 +4897,274 @@
       </w:pPr>
     </w:lvl>
   </w:abstractNum>
-  <w:abstractNum w:abstractNumId="22" w15:restartNumberingAfterBreak="0">
+  <w:abstractNum w:abstractNumId="25" w15:restartNumberingAfterBreak="0">
+    <w:nsid w:val="5FDE06FA"/>
+    <w:multiLevelType w:val="hybridMultilevel"/>
+    <w:tmpl w:val="2FCC281C"/>
+    <w:lvl w:ilvl="0" w:tplc="FFFFFFFF">
+      <w:start w:val="1"/>
+      <w:numFmt w:val="decimal"/>
+      <w:lvlText w:val="%1."/>
+      <w:lvlJc w:val="left"/>
+      <w:pPr>
+        <w:ind w:left="720" w:hanging="360"/>
+      </w:pPr>
+      <w:rPr>
+        <w:rFonts w:hint="default"/>
+      </w:rPr>
+    </w:lvl>
+    <w:lvl w:ilvl="1" w:tplc="FFFFFFFF" w:tentative="1">
+      <w:start w:val="1"/>
+      <w:numFmt w:val="lowerLetter"/>
+      <w:lvlText w:val="%2."/>
+      <w:lvlJc w:val="left"/>
+      <w:pPr>
+        <w:ind w:left="1440" w:hanging="360"/>
+      </w:pPr>
+    </w:lvl>
+    <w:lvl w:ilvl="2" w:tplc="FFFFFFFF" w:tentative="1">
+      <w:start w:val="1"/>
+      <w:numFmt w:val="lowerRoman"/>
+      <w:lvlText w:val="%3."/>
+      <w:lvlJc w:val="right"/>
+      <w:pPr>
+        <w:ind w:left="2160" w:hanging="180"/>
+      </w:pPr>
+    </w:lvl>
+    <w:lvl w:ilvl="3" w:tplc="FFFFFFFF" w:tentative="1">
+      <w:start w:val="1"/>
+      <w:numFmt w:val="decimal"/>
+      <w:lvlText w:val="%4."/>
+      <w:lvlJc w:val="left"/>
+      <w:pPr>
+        <w:ind w:left="2880" w:hanging="360"/>
+      </w:pPr>
+    </w:lvl>
+    <w:lvl w:ilvl="4" w:tplc="FFFFFFFF" w:tentative="1">
+      <w:start w:val="1"/>
+      <w:numFmt w:val="lowerLetter"/>
+      <w:lvlText w:val="%5."/>
+      <w:lvlJc w:val="left"/>
+      <w:pPr>
+        <w:ind w:left="3600" w:hanging="360"/>
+      </w:pPr>
+    </w:lvl>
+    <w:lvl w:ilvl="5" w:tplc="FFFFFFFF" w:tentative="1">
+      <w:start w:val="1"/>
+      <w:numFmt w:val="lowerRoman"/>
+      <w:lvlText w:val="%6."/>
+      <w:lvlJc w:val="right"/>
+      <w:pPr>
+        <w:ind w:left="4320" w:hanging="180"/>
+      </w:pPr>
+    </w:lvl>
+    <w:lvl w:ilvl="6" w:tplc="FFFFFFFF" w:tentative="1">
+      <w:start w:val="1"/>
+      <w:numFmt w:val="decimal"/>
+      <w:lvlText w:val="%7."/>
+      <w:lvlJc w:val="left"/>
+      <w:pPr>
+        <w:ind w:left="5040" w:hanging="360"/>
+      </w:pPr>
+    </w:lvl>
+    <w:lvl w:ilvl="7" w:tplc="FFFFFFFF" w:tentative="1">
+      <w:start w:val="1"/>
+      <w:numFmt w:val="lowerLetter"/>
+      <w:lvlText w:val="%8."/>
+      <w:lvlJc w:val="left"/>
+      <w:pPr>
+        <w:ind w:left="5760" w:hanging="360"/>
+      </w:pPr>
+    </w:lvl>
+    <w:lvl w:ilvl="8" w:tplc="FFFFFFFF" w:tentative="1">
+      <w:start w:val="1"/>
+      <w:numFmt w:val="lowerRoman"/>
+      <w:lvlText w:val="%9."/>
+      <w:lvlJc w:val="right"/>
+      <w:pPr>
+        <w:ind w:left="6480" w:hanging="180"/>
+      </w:pPr>
+    </w:lvl>
+  </w:abstractNum>
+  <w:abstractNum w:abstractNumId="26" w15:restartNumberingAfterBreak="0">
+    <w:nsid w:val="73CE75DB"/>
+    <w:multiLevelType w:val="hybridMultilevel"/>
+    <w:tmpl w:val="3704E778"/>
+    <w:lvl w:ilvl="0" w:tplc="FFFFFFFF">
+      <w:start w:val="1"/>
+      <w:numFmt w:val="decimal"/>
+      <w:lvlText w:val="%1."/>
+      <w:lvlJc w:val="left"/>
+      <w:pPr>
+        <w:ind w:left="720" w:hanging="360"/>
+      </w:pPr>
+      <w:rPr>
+        <w:rFonts w:hint="default"/>
+      </w:rPr>
+    </w:lvl>
+    <w:lvl w:ilvl="1" w:tplc="FFFFFFFF" w:tentative="1">
+      <w:start w:val="1"/>
+      <w:numFmt w:val="lowerLetter"/>
+      <w:lvlText w:val="%2."/>
+      <w:lvlJc w:val="left"/>
+      <w:pPr>
+        <w:ind w:left="1440" w:hanging="360"/>
+      </w:pPr>
+    </w:lvl>
+    <w:lvl w:ilvl="2" w:tplc="FFFFFFFF" w:tentative="1">
+      <w:start w:val="1"/>
+      <w:numFmt w:val="lowerRoman"/>
+      <w:lvlText w:val="%3."/>
+      <w:lvlJc w:val="right"/>
+      <w:pPr>
+        <w:ind w:left="2160" w:hanging="180"/>
+      </w:pPr>
+    </w:lvl>
+    <w:lvl w:ilvl="3" w:tplc="FFFFFFFF" w:tentative="1">
+      <w:start w:val="1"/>
+      <w:numFmt w:val="decimal"/>
+      <w:lvlText w:val="%4."/>
+      <w:lvlJc w:val="left"/>
+      <w:pPr>
+        <w:ind w:left="2880" w:hanging="360"/>
+      </w:pPr>
+    </w:lvl>
+    <w:lvl w:ilvl="4" w:tplc="FFFFFFFF" w:tentative="1">
+      <w:start w:val="1"/>
+      <w:numFmt w:val="lowerLetter"/>
+      <w:lvlText w:val="%5."/>
+      <w:lvlJc w:val="left"/>
+      <w:pPr>
+        <w:ind w:left="3600" w:hanging="360"/>
+      </w:pPr>
+    </w:lvl>
+    <w:lvl w:ilvl="5" w:tplc="FFFFFFFF" w:tentative="1">
+      <w:start w:val="1"/>
+      <w:numFmt w:val="lowerRoman"/>
+      <w:lvlText w:val="%6."/>
+      <w:lvlJc w:val="right"/>
+      <w:pPr>
+        <w:ind w:left="4320" w:hanging="180"/>
+      </w:pPr>
+    </w:lvl>
+    <w:lvl w:ilvl="6" w:tplc="FFFFFFFF" w:tentative="1">
+      <w:start w:val="1"/>
+      <w:numFmt w:val="decimal"/>
+      <w:lvlText w:val="%7."/>
+      <w:lvlJc w:val="left"/>
+      <w:pPr>
+        <w:ind w:left="5040" w:hanging="360"/>
+      </w:pPr>
+    </w:lvl>
+    <w:lvl w:ilvl="7" w:tplc="FFFFFFFF" w:tentative="1">
+      <w:start w:val="1"/>
+      <w:numFmt w:val="lowerLetter"/>
+      <w:lvlText w:val="%8."/>
+      <w:lvlJc w:val="left"/>
+      <w:pPr>
+        <w:ind w:left="5760" w:hanging="360"/>
+      </w:pPr>
+    </w:lvl>
+    <w:lvl w:ilvl="8" w:tplc="FFFFFFFF" w:tentative="1">
+      <w:start w:val="1"/>
+      <w:numFmt w:val="lowerRoman"/>
+      <w:lvlText w:val="%9."/>
+      <w:lvlJc w:val="right"/>
+      <w:pPr>
+        <w:ind w:left="6480" w:hanging="180"/>
+      </w:pPr>
+    </w:lvl>
+  </w:abstractNum>
+  <w:abstractNum w:abstractNumId="27" w15:restartNumberingAfterBreak="0">
+    <w:nsid w:val="754A6DA3"/>
+    <w:multiLevelType w:val="hybridMultilevel"/>
+    <w:tmpl w:val="67943264"/>
+    <w:lvl w:ilvl="0" w:tplc="FFFFFFFF">
+      <w:start w:val="1"/>
+      <w:numFmt w:val="decimal"/>
+      <w:lvlText w:val="%1."/>
+      <w:lvlJc w:val="left"/>
+      <w:pPr>
+        <w:ind w:left="720" w:hanging="360"/>
+      </w:pPr>
+      <w:rPr>
+        <w:rFonts w:hint="default"/>
+      </w:rPr>
+    </w:lvl>
+    <w:lvl w:ilvl="1" w:tplc="FFFFFFFF" w:tentative="1">
+      <w:start w:val="1"/>
+      <w:numFmt w:val="lowerLetter"/>
+      <w:lvlText w:val="%2."/>
+      <w:lvlJc w:val="left"/>
+      <w:pPr>
+        <w:ind w:left="1440" w:hanging="360"/>
+      </w:pPr>
+    </w:lvl>
+    <w:lvl w:ilvl="2" w:tplc="FFFFFFFF" w:tentative="1">
+      <w:start w:val="1"/>
+      <w:numFmt w:val="lowerRoman"/>
+      <w:lvlText w:val="%3."/>
+      <w:lvlJc w:val="right"/>
+      <w:pPr>
+        <w:ind w:left="2160" w:hanging="180"/>
+      </w:pPr>
+    </w:lvl>
+    <w:lvl w:ilvl="3" w:tplc="FFFFFFFF" w:tentative="1">
+      <w:start w:val="1"/>
+      <w:numFmt w:val="decimal"/>
+      <w:lvlText w:val="%4."/>
+      <w:lvlJc w:val="left"/>
+      <w:pPr>
+        <w:ind w:left="2880" w:hanging="360"/>
+      </w:pPr>
+    </w:lvl>
+    <w:lvl w:ilvl="4" w:tplc="FFFFFFFF" w:tentative="1">
+      <w:start w:val="1"/>
+      <w:numFmt w:val="lowerLetter"/>
+      <w:lvlText w:val="%5."/>
+      <w:lvlJc w:val="left"/>
+      <w:pPr>
+        <w:ind w:left="3600" w:hanging="360"/>
+      </w:pPr>
+    </w:lvl>
+    <w:lvl w:ilvl="5" w:tplc="FFFFFFFF" w:tentative="1">
+      <w:start w:val="1"/>
+      <w:numFmt w:val="lowerRoman"/>
+      <w:lvlText w:val="%6."/>
+      <w:lvlJc w:val="right"/>
+      <w:pPr>
+        <w:ind w:left="4320" w:hanging="180"/>
+      </w:pPr>
+    </w:lvl>
+    <w:lvl w:ilvl="6" w:tplc="FFFFFFFF" w:tentative="1">
+      <w:start w:val="1"/>
+      <w:numFmt w:val="decimal"/>
+      <w:lvlText w:val="%7."/>
+      <w:lvlJc w:val="left"/>
+      <w:pPr>
+        <w:ind w:left="5040" w:hanging="360"/>
+      </w:pPr>
+    </w:lvl>
+    <w:lvl w:ilvl="7" w:tplc="FFFFFFFF" w:tentative="1">
+      <w:start w:val="1"/>
+      <w:numFmt w:val="lowerLetter"/>
+      <w:lvlText w:val="%8."/>
+      <w:lvlJc w:val="left"/>
+      <w:pPr>
+        <w:ind w:left="5760" w:hanging="360"/>
+      </w:pPr>
+    </w:lvl>
+    <w:lvl w:ilvl="8" w:tplc="FFFFFFFF" w:tentative="1">
+      <w:start w:val="1"/>
+      <w:numFmt w:val="lowerRoman"/>
+      <w:lvlText w:val="%9."/>
+      <w:lvlJc w:val="right"/>
+      <w:pPr>
+        <w:ind w:left="6480" w:hanging="180"/>
+      </w:pPr>
+    </w:lvl>
+  </w:abstractNum>
+  <w:abstractNum w:abstractNumId="28" w15:restartNumberingAfterBreak="0">
     <w:nsid w:val="76520C70"/>
     <w:multiLevelType w:val="hybridMultilevel"/>
     <w:tmpl w:val="C28897EC"/>
@@ -4607,7 +5250,7 @@
       </w:pPr>
     </w:lvl>
   </w:abstractNum>
-  <w:abstractNum w:abstractNumId="23" w15:restartNumberingAfterBreak="0">
+  <w:abstractNum w:abstractNumId="29" w15:restartNumberingAfterBreak="0">
     <w:nsid w:val="797F4C85"/>
     <w:multiLevelType w:val="hybridMultilevel"/>
     <w:tmpl w:val="2FCC281C"/>
@@ -4696,7 +5339,7 @@
       </w:pPr>
     </w:lvl>
   </w:abstractNum>
-  <w:abstractNum w:abstractNumId="24" w15:restartNumberingAfterBreak="0">
+  <w:abstractNum w:abstractNumId="30" w15:restartNumberingAfterBreak="0">
     <w:nsid w:val="798079C1"/>
     <w:multiLevelType w:val="hybridMultilevel"/>
     <w:tmpl w:val="6A6C1FD0"/>
@@ -4782,80 +5425,190 @@
       </w:pPr>
     </w:lvl>
   </w:abstractNum>
+  <w:abstractNum w:abstractNumId="31" w15:restartNumberingAfterBreak="0">
+    <w:nsid w:val="7EAE2E3E"/>
+    <w:multiLevelType w:val="hybridMultilevel"/>
+    <w:tmpl w:val="2FCC281C"/>
+    <w:lvl w:ilvl="0" w:tplc="FFFFFFFF">
+      <w:start w:val="1"/>
+      <w:numFmt w:val="decimal"/>
+      <w:lvlText w:val="%1."/>
+      <w:lvlJc w:val="left"/>
+      <w:pPr>
+        <w:ind w:left="720" w:hanging="360"/>
+      </w:pPr>
+      <w:rPr>
+        <w:rFonts w:hint="default"/>
+      </w:rPr>
+    </w:lvl>
+    <w:lvl w:ilvl="1" w:tplc="FFFFFFFF" w:tentative="1">
+      <w:start w:val="1"/>
+      <w:numFmt w:val="lowerLetter"/>
+      <w:lvlText w:val="%2."/>
+      <w:lvlJc w:val="left"/>
+      <w:pPr>
+        <w:ind w:left="1440" w:hanging="360"/>
+      </w:pPr>
+    </w:lvl>
+    <w:lvl w:ilvl="2" w:tplc="FFFFFFFF" w:tentative="1">
+      <w:start w:val="1"/>
+      <w:numFmt w:val="lowerRoman"/>
+      <w:lvlText w:val="%3."/>
+      <w:lvlJc w:val="right"/>
+      <w:pPr>
+        <w:ind w:left="2160" w:hanging="180"/>
+      </w:pPr>
+    </w:lvl>
+    <w:lvl w:ilvl="3" w:tplc="FFFFFFFF" w:tentative="1">
+      <w:start w:val="1"/>
+      <w:numFmt w:val="decimal"/>
+      <w:lvlText w:val="%4."/>
+      <w:lvlJc w:val="left"/>
+      <w:pPr>
+        <w:ind w:left="2880" w:hanging="360"/>
+      </w:pPr>
+    </w:lvl>
+    <w:lvl w:ilvl="4" w:tplc="FFFFFFFF" w:tentative="1">
+      <w:start w:val="1"/>
+      <w:numFmt w:val="lowerLetter"/>
+      <w:lvlText w:val="%5."/>
+      <w:lvlJc w:val="left"/>
+      <w:pPr>
+        <w:ind w:left="3600" w:hanging="360"/>
+      </w:pPr>
+    </w:lvl>
+    <w:lvl w:ilvl="5" w:tplc="FFFFFFFF" w:tentative="1">
+      <w:start w:val="1"/>
+      <w:numFmt w:val="lowerRoman"/>
+      <w:lvlText w:val="%6."/>
+      <w:lvlJc w:val="right"/>
+      <w:pPr>
+        <w:ind w:left="4320" w:hanging="180"/>
+      </w:pPr>
+    </w:lvl>
+    <w:lvl w:ilvl="6" w:tplc="FFFFFFFF" w:tentative="1">
+      <w:start w:val="1"/>
+      <w:numFmt w:val="decimal"/>
+      <w:lvlText w:val="%7."/>
+      <w:lvlJc w:val="left"/>
+      <w:pPr>
+        <w:ind w:left="5040" w:hanging="360"/>
+      </w:pPr>
+    </w:lvl>
+    <w:lvl w:ilvl="7" w:tplc="FFFFFFFF" w:tentative="1">
+      <w:start w:val="1"/>
+      <w:numFmt w:val="lowerLetter"/>
+      <w:lvlText w:val="%8."/>
+      <w:lvlJc w:val="left"/>
+      <w:pPr>
+        <w:ind w:left="5760" w:hanging="360"/>
+      </w:pPr>
+    </w:lvl>
+    <w:lvl w:ilvl="8" w:tplc="FFFFFFFF" w:tentative="1">
+      <w:start w:val="1"/>
+      <w:numFmt w:val="lowerRoman"/>
+      <w:lvlText w:val="%9."/>
+      <w:lvlJc w:val="right"/>
+      <w:pPr>
+        <w:ind w:left="6480" w:hanging="180"/>
+      </w:pPr>
+    </w:lvl>
+  </w:abstractNum>
   <w:num w:numId="1" w16cid:durableId="1156336084">
-    <w:abstractNumId w:val="3"/>
+    <w:abstractNumId w:val="4"/>
   </w:num>
   <w:num w:numId="2" w16cid:durableId="1582522846">
-    <w:abstractNumId w:val="13"/>
+    <w:abstractNumId w:val="15"/>
   </w:num>
   <w:num w:numId="3" w16cid:durableId="461188822">
-    <w:abstractNumId w:val="6"/>
+    <w:abstractNumId w:val="7"/>
   </w:num>
   <w:num w:numId="4" w16cid:durableId="1642230097">
-    <w:abstractNumId w:val="16"/>
+    <w:abstractNumId w:val="19"/>
   </w:num>
   <w:num w:numId="5" w16cid:durableId="1795058492">
-    <w:abstractNumId w:val="9"/>
+    <w:abstractNumId w:val="11"/>
   </w:num>
   <w:num w:numId="6" w16cid:durableId="2006665820">
-    <w:abstractNumId w:val="17"/>
+    <w:abstractNumId w:val="20"/>
   </w:num>
   <w:num w:numId="7" w16cid:durableId="304553465">
     <w:abstractNumId w:val="0"/>
   </w:num>
   <w:num w:numId="8" w16cid:durableId="465397582">
+    <w:abstractNumId w:val="14"/>
+  </w:num>
+  <w:num w:numId="9" w16cid:durableId="941299325">
+    <w:abstractNumId w:val="28"/>
+  </w:num>
+  <w:num w:numId="10" w16cid:durableId="176239456">
     <w:abstractNumId w:val="12"/>
   </w:num>
-  <w:num w:numId="9" w16cid:durableId="941299325">
-    <w:abstractNumId w:val="22"/>
-  </w:num>
-  <w:num w:numId="10" w16cid:durableId="176239456">
-    <w:abstractNumId w:val="10"/>
-  </w:num>
   <w:num w:numId="11" w16cid:durableId="2035841068">
-    <w:abstractNumId w:val="4"/>
+    <w:abstractNumId w:val="5"/>
   </w:num>
   <w:num w:numId="12" w16cid:durableId="2028944099">
-    <w:abstractNumId w:val="5"/>
+    <w:abstractNumId w:val="6"/>
   </w:num>
   <w:num w:numId="13" w16cid:durableId="1170680782">
-    <w:abstractNumId w:val="8"/>
+    <w:abstractNumId w:val="9"/>
   </w:num>
   <w:num w:numId="14" w16cid:durableId="1732146217">
-    <w:abstractNumId w:val="11"/>
+    <w:abstractNumId w:val="13"/>
   </w:num>
   <w:num w:numId="15" w16cid:durableId="1632592837">
-    <w:abstractNumId w:val="23"/>
+    <w:abstractNumId w:val="29"/>
   </w:num>
   <w:num w:numId="16" w16cid:durableId="583413260">
-    <w:abstractNumId w:val="15"/>
+    <w:abstractNumId w:val="17"/>
   </w:num>
   <w:num w:numId="17" w16cid:durableId="1659530784">
-    <w:abstractNumId w:val="14"/>
+    <w:abstractNumId w:val="16"/>
   </w:num>
   <w:num w:numId="18" w16cid:durableId="534006800">
     <w:abstractNumId w:val="1"/>
   </w:num>
   <w:num w:numId="19" w16cid:durableId="968126754">
+    <w:abstractNumId w:val="3"/>
+  </w:num>
+  <w:num w:numId="20" w16cid:durableId="1553224610">
+    <w:abstractNumId w:val="23"/>
+  </w:num>
+  <w:num w:numId="21" w16cid:durableId="2100322992">
+    <w:abstractNumId w:val="24"/>
+  </w:num>
+  <w:num w:numId="22" w16cid:durableId="512383415">
+    <w:abstractNumId w:val="8"/>
+  </w:num>
+  <w:num w:numId="23" w16cid:durableId="1597639659">
+    <w:abstractNumId w:val="30"/>
+  </w:num>
+  <w:num w:numId="24" w16cid:durableId="301085384">
+    <w:abstractNumId w:val="21"/>
+  </w:num>
+  <w:num w:numId="25" w16cid:durableId="1259215891">
+    <w:abstractNumId w:val="22"/>
+  </w:num>
+  <w:num w:numId="26" w16cid:durableId="1942908283">
+    <w:abstractNumId w:val="18"/>
+  </w:num>
+  <w:num w:numId="27" w16cid:durableId="906843712">
+    <w:abstractNumId w:val="26"/>
+  </w:num>
+  <w:num w:numId="28" w16cid:durableId="995649532">
+    <w:abstractNumId w:val="10"/>
+  </w:num>
+  <w:num w:numId="29" w16cid:durableId="1182744798">
+    <w:abstractNumId w:val="27"/>
+  </w:num>
+  <w:num w:numId="30" w16cid:durableId="915239554">
+    <w:abstractNumId w:val="31"/>
+  </w:num>
+  <w:num w:numId="31" w16cid:durableId="263539129">
     <w:abstractNumId w:val="2"/>
   </w:num>
-  <w:num w:numId="20" w16cid:durableId="1553224610">
-    <w:abstractNumId w:val="20"/>
-  </w:num>
-  <w:num w:numId="21" w16cid:durableId="2100322992">
-    <w:abstractNumId w:val="21"/>
-  </w:num>
-  <w:num w:numId="22" w16cid:durableId="512383415">
-    <w:abstractNumId w:val="7"/>
-  </w:num>
-  <w:num w:numId="23" w16cid:durableId="1597639659">
-    <w:abstractNumId w:val="24"/>
-  </w:num>
-  <w:num w:numId="24" w16cid:durableId="301085384">
-    <w:abstractNumId w:val="18"/>
-  </w:num>
-  <w:num w:numId="25" w16cid:durableId="1259215891">
-    <w:abstractNumId w:val="19"/>
+  <w:num w:numId="32" w16cid:durableId="1254827101">
+    <w:abstractNumId w:val="25"/>
   </w:num>
 </w:numbering>
 </file>
@@ -5260,7 +6013,7 @@
   <w:style w:type="paragraph" w:default="1" w:styleId="Normal">
     <w:name w:val="Normal"/>
     <w:qFormat/>
-    <w:rsid w:val="00AD286C"/>
+    <w:rsid w:val="00720174"/>
   </w:style>
   <w:style w:type="paragraph" w:styleId="Ttulo1">
     <w:name w:val="heading 1"/>

</xml_diff>

<commit_message>
Casos de uso - CU08-10
</commit_message>
<xml_diff>
--- a/Casos_de_uso.docx
+++ b/Casos_de_uso.docx
@@ -1950,25 +1950,7 @@
         </w:numPr>
       </w:pPr>
       <w:r>
-        <w:t>Se realiza el caso de uso CU0</w:t>
-      </w:r>
-      <w:r>
-        <w:t>4</w:t>
-      </w:r>
-      <w:r>
-        <w:t xml:space="preserve"> “CU0</w:t>
-      </w:r>
-      <w:r>
-        <w:t>4</w:t>
-      </w:r>
-      <w:r>
-        <w:t xml:space="preserve">: Consultar </w:t>
-      </w:r>
-      <w:r>
-        <w:t>prestamos activos</w:t>
-      </w:r>
-      <w:r>
-        <w:t>”. El estudiante selecciona el libro que desea prorrogar.</w:t>
+        <w:t>Se realiza el caso de uso CU04 “CU04: Consultar prestamos activos”. El estudiante selecciona el libro que desea prorrogar.</w:t>
       </w:r>
     </w:p>
     <w:p>
@@ -2599,8 +2581,6 @@
       </w:r>
     </w:p>
     <w:p/>
-    <w:p/>
-    <w:p/>
     <w:p>
       <w:pPr>
         <w:rPr>
@@ -2690,13 +2670,801 @@
         </w:numPr>
       </w:pPr>
       <w:r>
-        <w:t>Bibliotecario: desea mantener actualizado el inventario de la biblioteca</w:t>
-      </w:r>
-      <w:r>
+        <w:t>Bibliotecario: desea mantener actualizado el inventario de la biblioteca retirando los no aptos.</w:t>
+      </w:r>
+    </w:p>
+    <w:p>
+      <w:r>
+        <w:t xml:space="preserve">Precondiciones: </w:t>
+      </w:r>
+    </w:p>
+    <w:p>
+      <w:pPr>
+        <w:pStyle w:val="Prrafodelista"/>
+        <w:numPr>
+          <w:ilvl w:val="0"/>
+          <w:numId w:val="1"/>
+        </w:numPr>
+      </w:pPr>
+      <w:r>
+        <w:t>El sistema debe estar conectado a la red local y la base de datos operativa</w:t>
+      </w:r>
+      <w:r>
+        <w:t>.</w:t>
+      </w:r>
+    </w:p>
+    <w:p>
+      <w:pPr>
+        <w:pStyle w:val="Prrafodelista"/>
+        <w:numPr>
+          <w:ilvl w:val="0"/>
+          <w:numId w:val="1"/>
+        </w:numPr>
+      </w:pPr>
+      <w:r>
+        <w:t xml:space="preserve">El </w:t>
+      </w:r>
+      <w:r>
+        <w:t>bibliotecario</w:t>
+      </w:r>
+      <w:r>
+        <w:t xml:space="preserve"> debe haber iniciado sesión en su cuenta.</w:t>
+      </w:r>
+    </w:p>
+    <w:p>
+      <w:r>
+        <w:t xml:space="preserve">Garantías de éxito: el </w:t>
+      </w:r>
+      <w:r>
+        <w:t>sistema actualiza la base de datos reflejando el alta del nuevo libro o la eliminación del ejemplar retirado</w:t>
+      </w:r>
+      <w:r>
+        <w:t>.</w:t>
+      </w:r>
+    </w:p>
+    <w:p>
+      <w:pPr>
+        <w:rPr>
+          <w:b/>
+          <w:bCs/>
+        </w:rPr>
+      </w:pPr>
+      <w:r>
+        <w:rPr>
+          <w:b/>
+          <w:bCs/>
+        </w:rPr>
+        <w:t>Flujo básico:</w:t>
+      </w:r>
+    </w:p>
+    <w:p>
+      <w:pPr>
+        <w:pStyle w:val="Prrafodelista"/>
+        <w:numPr>
+          <w:ilvl w:val="0"/>
+          <w:numId w:val="33"/>
+        </w:numPr>
+      </w:pPr>
+      <w:r>
+        <w:t>El bibliotecario accede a la sección “Gestionar inventario”.</w:t>
+      </w:r>
+    </w:p>
+    <w:p>
+      <w:pPr>
+        <w:pStyle w:val="Prrafodelista"/>
+        <w:numPr>
+          <w:ilvl w:val="0"/>
+          <w:numId w:val="33"/>
+        </w:numPr>
+      </w:pPr>
+      <w:r>
+        <w:t>El bibliotecario selecciona la operación “Retirar libro”</w:t>
+      </w:r>
+    </w:p>
+    <w:p>
+      <w:pPr>
+        <w:pStyle w:val="Prrafodelista"/>
+        <w:numPr>
+          <w:ilvl w:val="0"/>
+          <w:numId w:val="33"/>
+        </w:numPr>
+      </w:pPr>
+      <w:r>
+        <w:t>El bibliotecario busca el libro por ISBN y selecciona “Retirar” indicando el motivo.</w:t>
+      </w:r>
+    </w:p>
+    <w:p>
+      <w:pPr>
+        <w:pStyle w:val="Prrafodelista"/>
+        <w:numPr>
+          <w:ilvl w:val="0"/>
+          <w:numId w:val="33"/>
+        </w:numPr>
+      </w:pPr>
+      <w:r>
+        <w:t>El sistema comprueba que el libro no tenga préstamos o reservas activas.</w:t>
+      </w:r>
+    </w:p>
+    <w:p>
+      <w:pPr>
+        <w:pStyle w:val="Prrafodelista"/>
+        <w:numPr>
+          <w:ilvl w:val="0"/>
+          <w:numId w:val="33"/>
+        </w:numPr>
+      </w:pPr>
+      <w:r>
+        <w:t xml:space="preserve">El sistema actualiza la base de datos e informa que la operación ha sido realizada. </w:t>
+      </w:r>
+    </w:p>
+    <w:p>
+      <w:r>
+        <w:rPr>
+          <w:b/>
+          <w:bCs/>
+        </w:rPr>
+        <w:t>Flujos alternativos:</w:t>
+      </w:r>
+    </w:p>
+    <w:p>
+      <w:r>
+        <w:t>4a. El libro tiene préstamos o reservas:</w:t>
+      </w:r>
+    </w:p>
+    <w:p>
+      <w:pPr>
+        <w:pStyle w:val="Prrafodelista"/>
+        <w:numPr>
+          <w:ilvl w:val="0"/>
+          <w:numId w:val="28"/>
+        </w:numPr>
+      </w:pPr>
+      <w:r>
+        <w:t>El sistema bloquea la baja y muestra un error indicando que el libro está comprometido.</w:t>
+      </w:r>
+    </w:p>
+    <w:p>
+      <w:pPr>
+        <w:pStyle w:val="Prrafodelista"/>
+        <w:numPr>
+          <w:ilvl w:val="0"/>
+          <w:numId w:val="28"/>
+        </w:numPr>
+      </w:pPr>
+      <w:r>
+        <w:t>El caso de uso finaliza.</w:t>
+      </w:r>
+    </w:p>
+    <w:p>
+      <w:r>
+        <w:t>*a. El sistema falla al conectar con la base de datos:</w:t>
+      </w:r>
+    </w:p>
+    <w:p>
+      <w:pPr>
+        <w:pStyle w:val="Prrafodelista"/>
+        <w:numPr>
+          <w:ilvl w:val="0"/>
+          <w:numId w:val="34"/>
+        </w:numPr>
+      </w:pPr>
+      <w:r>
+        <w:t>El sistema muestra un mensaje indicando que hay un error.</w:t>
+      </w:r>
+    </w:p>
+    <w:p>
+      <w:r>
+        <w:lastRenderedPageBreak/>
+        <w:t>*b. El sistema no puede conectar con la red local:</w:t>
+      </w:r>
+    </w:p>
+    <w:p>
+      <w:pPr>
+        <w:pStyle w:val="Prrafodelista"/>
+        <w:numPr>
+          <w:ilvl w:val="0"/>
+          <w:numId w:val="35"/>
+        </w:numPr>
+      </w:pPr>
+      <w:r>
+        <w:t>El sistema muestra un mensaje indicando que hay un error.</w:t>
+      </w:r>
+    </w:p>
+    <w:p>
+      <w:pPr>
+        <w:rPr>
+          <w:b/>
+          <w:bCs/>
+        </w:rPr>
+      </w:pPr>
+      <w:r>
+        <w:rPr>
+          <w:b/>
+          <w:bCs/>
+        </w:rPr>
+        <w:t>Lista de tecnología y variaciones de datos:</w:t>
+      </w:r>
+    </w:p>
+    <w:p>
+      <w:r>
+        <w:t>3a. El ISBN debe ser formato ISBN-13.</w:t>
+      </w:r>
+    </w:p>
+    <w:p>
+      <w:pPr>
+        <w:rPr>
+          <w:b/>
+          <w:bCs/>
+        </w:rPr>
+      </w:pPr>
+      <w:r>
+        <w:rPr>
+          <w:b/>
+          <w:bCs/>
+        </w:rPr>
+        <w:t>Información relacionada:</w:t>
+      </w:r>
+    </w:p>
+    <w:p>
+      <w:r>
+        <w:t>Prioridad: media.</w:t>
+      </w:r>
+    </w:p>
+    <w:p>
+      <w:r>
+        <w:t>Frecuencia: media.</w:t>
+      </w:r>
+    </w:p>
+    <w:p>
+      <w:r>
+        <w:t>Requisitos especiales: el tiempo de respuesta debe ser inferior a 5 segundos.</w:t>
+      </w:r>
+    </w:p>
+    <w:p/>
+    <w:p>
+      <w:pPr>
+        <w:rPr>
+          <w:b/>
+          <w:bCs/>
+          <w:sz w:val="28"/>
+          <w:szCs w:val="28"/>
+        </w:rPr>
+      </w:pPr>
+      <w:r>
+        <w:rPr>
+          <w:b/>
+          <w:bCs/>
+          <w:sz w:val="28"/>
+          <w:szCs w:val="28"/>
+        </w:rPr>
+        <w:t>CU0</w:t>
+      </w:r>
+      <w:r>
+        <w:rPr>
+          <w:b/>
+          <w:bCs/>
+          <w:sz w:val="28"/>
+          <w:szCs w:val="28"/>
+        </w:rPr>
+        <w:t>8</w:t>
+      </w:r>
+      <w:r>
+        <w:rPr>
+          <w:b/>
+          <w:bCs/>
+          <w:sz w:val="28"/>
+          <w:szCs w:val="28"/>
+        </w:rPr>
+        <w:t>:</w:t>
+      </w:r>
+      <w:r>
+        <w:rPr>
+          <w:b/>
+          <w:bCs/>
+          <w:sz w:val="28"/>
+          <w:szCs w:val="28"/>
+        </w:rPr>
+        <w:t xml:space="preserve"> Crear cuenta de bibliotecario</w:t>
+      </w:r>
+      <w:r>
+        <w:rPr>
+          <w:b/>
+          <w:bCs/>
+          <w:sz w:val="28"/>
+          <w:szCs w:val="28"/>
+        </w:rPr>
+        <w:t>.</w:t>
+      </w:r>
+    </w:p>
+    <w:p>
+      <w:pPr>
+        <w:rPr>
+          <w:b/>
+          <w:bCs/>
+        </w:rPr>
+      </w:pPr>
+      <w:r>
+        <w:rPr>
+          <w:b/>
+          <w:bCs/>
+        </w:rPr>
+        <w:t>Prólogo:</w:t>
+      </w:r>
+    </w:p>
+    <w:p>
+      <w:r>
+        <w:t xml:space="preserve">Actor principal: </w:t>
+      </w:r>
+      <w:r>
+        <w:t>administrador</w:t>
+      </w:r>
+      <w:r>
+        <w:t>.</w:t>
+      </w:r>
+    </w:p>
+    <w:p>
+      <w:r>
+        <w:t>Personal involucrado e intereses:</w:t>
+      </w:r>
+    </w:p>
+    <w:p>
+      <w:pPr>
+        <w:pStyle w:val="Prrafodelista"/>
+        <w:numPr>
+          <w:ilvl w:val="0"/>
+          <w:numId w:val="1"/>
+        </w:numPr>
+      </w:pPr>
+      <w:r>
+        <w:t>Administrador: desea crear una cuenta para que un bibliotecario pueda operar en el sistema.</w:t>
+      </w:r>
+    </w:p>
+    <w:p>
+      <w:pPr>
+        <w:pStyle w:val="Prrafodelista"/>
+        <w:numPr>
+          <w:ilvl w:val="0"/>
+          <w:numId w:val="1"/>
+        </w:numPr>
+      </w:pPr>
+      <w:r>
+        <w:t>Bibliotecario:</w:t>
+      </w:r>
+      <w:r>
+        <w:t xml:space="preserve"> desea acceder al sistema</w:t>
+      </w:r>
+      <w:r>
+        <w:t>.</w:t>
+      </w:r>
+    </w:p>
+    <w:p>
+      <w:r>
+        <w:t xml:space="preserve">Precondiciones: </w:t>
+      </w:r>
+    </w:p>
+    <w:p>
+      <w:pPr>
+        <w:pStyle w:val="Prrafodelista"/>
+        <w:numPr>
+          <w:ilvl w:val="0"/>
+          <w:numId w:val="1"/>
+        </w:numPr>
+      </w:pPr>
+      <w:r>
+        <w:t>El sistema debe estar conectado a la red local y la base de datos operativa</w:t>
+      </w:r>
+      <w:r>
+        <w:t>.</w:t>
+      </w:r>
+    </w:p>
+    <w:p>
+      <w:pPr>
+        <w:pStyle w:val="Prrafodelista"/>
+        <w:numPr>
+          <w:ilvl w:val="0"/>
+          <w:numId w:val="1"/>
+        </w:numPr>
+      </w:pPr>
+      <w:r>
+        <w:t xml:space="preserve">El </w:t>
+      </w:r>
+      <w:r>
+        <w:t>administrador</w:t>
+      </w:r>
+      <w:r>
+        <w:t xml:space="preserve"> debe haber iniciado sesión en su cuenta.</w:t>
+      </w:r>
+    </w:p>
+    <w:p>
+      <w:r>
+        <w:t xml:space="preserve">Garantías de éxito: el </w:t>
+      </w:r>
+      <w:r>
+        <w:t xml:space="preserve">sistema </w:t>
+      </w:r>
+      <w:r>
+        <w:t>crea la cuenta de bibliotecario con sus datos y horario</w:t>
+      </w:r>
+      <w:r>
+        <w:t>.</w:t>
+      </w:r>
+    </w:p>
+    <w:p>
+      <w:pPr>
+        <w:rPr>
+          <w:b/>
+          <w:bCs/>
+        </w:rPr>
+      </w:pPr>
+      <w:r>
+        <w:rPr>
+          <w:b/>
+          <w:bCs/>
+        </w:rPr>
+        <w:t>Flujo básico:</w:t>
+      </w:r>
+    </w:p>
+    <w:p>
+      <w:pPr>
+        <w:pStyle w:val="Prrafodelista"/>
+        <w:numPr>
+          <w:ilvl w:val="0"/>
+          <w:numId w:val="36"/>
+        </w:numPr>
+      </w:pPr>
+      <w:r>
+        <w:t>El administrador accede al panel de “Gestión de Personal”.</w:t>
+      </w:r>
+    </w:p>
+    <w:p>
+      <w:pPr>
+        <w:pStyle w:val="Prrafodelista"/>
+        <w:numPr>
+          <w:ilvl w:val="0"/>
+          <w:numId w:val="36"/>
+        </w:numPr>
+      </w:pPr>
+      <w:r>
+        <w:t>El administrador selecciona la opción “Añadir bibliotecario”.</w:t>
+      </w:r>
+    </w:p>
+    <w:p>
+      <w:pPr>
+        <w:pStyle w:val="Prrafodelista"/>
+        <w:numPr>
+          <w:ilvl w:val="0"/>
+          <w:numId w:val="36"/>
+        </w:numPr>
+      </w:pPr>
+      <w:r>
+        <w:t>El administrador introduce los datos del bibliotecario: nombre de usuario, correo, nombre completo, horario.</w:t>
+      </w:r>
+    </w:p>
+    <w:p>
+      <w:pPr>
+        <w:pStyle w:val="Prrafodelista"/>
+        <w:numPr>
+          <w:ilvl w:val="0"/>
+          <w:numId w:val="36"/>
+        </w:numPr>
+      </w:pPr>
+      <w:r>
+        <w:t>El sistema comprueba que el correo electrónico no este duplicado en la base de datos.</w:t>
+      </w:r>
+    </w:p>
+    <w:p>
+      <w:pPr>
+        <w:pStyle w:val="Prrafodelista"/>
+        <w:numPr>
+          <w:ilvl w:val="0"/>
+          <w:numId w:val="36"/>
+        </w:numPr>
+      </w:pPr>
+      <w:r>
+        <w:t>El sistema crea la cuenta y le asigna permisos de bibliotecario.</w:t>
+      </w:r>
+    </w:p>
+    <w:p>
+      <w:pPr>
+        <w:pStyle w:val="Prrafodelista"/>
+        <w:numPr>
+          <w:ilvl w:val="0"/>
+          <w:numId w:val="36"/>
+        </w:numPr>
+      </w:pPr>
+      <w:r>
+        <w:t>El sistema confirma la operación y muestra un resumen de la cuenta</w:t>
+      </w:r>
+      <w:r>
+        <w:t>.</w:t>
+      </w:r>
+    </w:p>
+    <w:p>
+      <w:r>
+        <w:rPr>
+          <w:b/>
+          <w:bCs/>
+        </w:rPr>
+        <w:t>Flujos alternativos:</w:t>
+      </w:r>
+    </w:p>
+    <w:p>
+      <w:r>
+        <w:lastRenderedPageBreak/>
+        <w:t xml:space="preserve">4a. El </w:t>
+      </w:r>
+      <w:r>
+        <w:t>correo electrónico ya existe en el sistema</w:t>
+      </w:r>
+      <w:r>
+        <w:t>:</w:t>
+      </w:r>
+    </w:p>
+    <w:p>
+      <w:pPr>
+        <w:pStyle w:val="Prrafodelista"/>
+        <w:numPr>
+          <w:ilvl w:val="0"/>
+          <w:numId w:val="37"/>
+        </w:numPr>
+      </w:pPr>
+      <w:r>
+        <w:t xml:space="preserve">El sistema </w:t>
+      </w:r>
+      <w:r>
+        <w:t>muestra un mensaje indicando que la cuenta ya existe</w:t>
+      </w:r>
+      <w:r>
+        <w:t>.</w:t>
+      </w:r>
+    </w:p>
+    <w:p>
+      <w:pPr>
+        <w:pStyle w:val="Prrafodelista"/>
+        <w:numPr>
+          <w:ilvl w:val="0"/>
+          <w:numId w:val="37"/>
+        </w:numPr>
+      </w:pPr>
+      <w:r>
+        <w:t>El caso de uso vuelve al paso 3</w:t>
+      </w:r>
+      <w:r>
+        <w:t>.</w:t>
+      </w:r>
+    </w:p>
+    <w:p>
+      <w:r>
+        <w:t>*a. El sistema falla al conectar con la base de datos:</w:t>
+      </w:r>
+    </w:p>
+    <w:p>
+      <w:pPr>
+        <w:pStyle w:val="Prrafodelista"/>
+        <w:numPr>
+          <w:ilvl w:val="0"/>
+          <w:numId w:val="38"/>
+        </w:numPr>
+      </w:pPr>
+      <w:r>
+        <w:t>El sistema muestra un mensaje indicando que hay un error.</w:t>
+      </w:r>
+    </w:p>
+    <w:p>
+      <w:r>
+        <w:t>*b. El sistema no puede conectar con la red local:</w:t>
+      </w:r>
+    </w:p>
+    <w:p>
+      <w:pPr>
+        <w:pStyle w:val="Prrafodelista"/>
+        <w:numPr>
+          <w:ilvl w:val="0"/>
+          <w:numId w:val="39"/>
+        </w:numPr>
+      </w:pPr>
+      <w:r>
+        <w:t>El sistema muestra un mensaje indicando que hay un error.</w:t>
+      </w:r>
+    </w:p>
+    <w:p>
+      <w:pPr>
+        <w:rPr>
+          <w:b/>
+          <w:bCs/>
+        </w:rPr>
+      </w:pPr>
+      <w:r>
+        <w:rPr>
+          <w:b/>
+          <w:bCs/>
+        </w:rPr>
+        <w:t>Lista de tecnología y variaciones de datos:</w:t>
+      </w:r>
+    </w:p>
+    <w:p>
+      <w:r>
+        <w:t xml:space="preserve">3a. </w:t>
+      </w:r>
+      <w:r>
+        <w:t>La introducción de datos se realiza mediante teclado y ratón en la aplicación de escritorio</w:t>
+      </w:r>
+      <w:r>
+        <w:t>.</w:t>
+      </w:r>
+    </w:p>
+    <w:p>
+      <w:pPr>
+        <w:rPr>
+          <w:b/>
+          <w:bCs/>
+        </w:rPr>
+      </w:pPr>
+      <w:r>
+        <w:rPr>
+          <w:b/>
+          <w:bCs/>
+        </w:rPr>
+        <w:t>Información relacionada:</w:t>
+      </w:r>
+    </w:p>
+    <w:p>
+      <w:r>
+        <w:t xml:space="preserve">Prioridad: </w:t>
+      </w:r>
+      <w:r>
+        <w:t>alta</w:t>
+      </w:r>
+      <w:r>
+        <w:t>.</w:t>
+      </w:r>
+    </w:p>
+    <w:p>
+      <w:pPr>
+        <w:ind w:left="708" w:hanging="708"/>
+      </w:pPr>
+      <w:r>
+        <w:t xml:space="preserve">Frecuencia: </w:t>
+      </w:r>
+      <w:r>
+        <w:t>baja</w:t>
+      </w:r>
+      <w:r>
+        <w:t>.</w:t>
+      </w:r>
+    </w:p>
+    <w:p>
+      <w:r>
+        <w:t>Requisitos especiales: el tiempo de respuesta debe ser inferior a 5 segundos.</w:t>
+      </w:r>
+      <w:r>
+        <w:t xml:space="preserve"> La contraseña de la cuenta será una genérica que el bibliotecario deberá cambiar más adelante.</w:t>
+      </w:r>
+    </w:p>
+    <w:p/>
+    <w:p>
+      <w:pPr>
+        <w:rPr>
+          <w:b/>
+          <w:bCs/>
+          <w:sz w:val="28"/>
+          <w:szCs w:val="28"/>
+        </w:rPr>
+      </w:pPr>
+      <w:r>
+        <w:rPr>
+          <w:b/>
+          <w:bCs/>
+          <w:sz w:val="28"/>
+          <w:szCs w:val="28"/>
+        </w:rPr>
+        <w:t>CU0</w:t>
+      </w:r>
+      <w:r>
+        <w:rPr>
+          <w:b/>
+          <w:bCs/>
+          <w:sz w:val="28"/>
+          <w:szCs w:val="28"/>
+        </w:rPr>
+        <w:t>9</w:t>
+      </w:r>
+      <w:r>
+        <w:rPr>
+          <w:b/>
+          <w:bCs/>
+          <w:sz w:val="28"/>
+          <w:szCs w:val="28"/>
+        </w:rPr>
+        <w:t>:</w:t>
+      </w:r>
+      <w:r>
+        <w:rPr>
+          <w:b/>
+          <w:bCs/>
+          <w:sz w:val="28"/>
+          <w:szCs w:val="28"/>
+        </w:rPr>
         <w:t xml:space="preserve"> </w:t>
       </w:r>
       <w:r>
-        <w:t>retirando los no aptos.</w:t>
+        <w:rPr>
+          <w:b/>
+          <w:bCs/>
+          <w:sz w:val="28"/>
+          <w:szCs w:val="28"/>
+        </w:rPr>
+        <w:t>Gestionar horario</w:t>
+      </w:r>
+      <w:r>
+        <w:rPr>
+          <w:b/>
+          <w:bCs/>
+          <w:sz w:val="28"/>
+          <w:szCs w:val="28"/>
+        </w:rPr>
+        <w:t>.</w:t>
+      </w:r>
+    </w:p>
+    <w:p>
+      <w:pPr>
+        <w:rPr>
+          <w:b/>
+          <w:bCs/>
+        </w:rPr>
+      </w:pPr>
+      <w:r>
+        <w:rPr>
+          <w:b/>
+          <w:bCs/>
+        </w:rPr>
+        <w:t>Prólogo:</w:t>
+      </w:r>
+    </w:p>
+    <w:p>
+      <w:r>
+        <w:t>Actor principal: administrador.</w:t>
+      </w:r>
+    </w:p>
+    <w:p>
+      <w:r>
+        <w:t>Personal involucrado e intereses:</w:t>
+      </w:r>
+    </w:p>
+    <w:p>
+      <w:pPr>
+        <w:pStyle w:val="Prrafodelista"/>
+        <w:numPr>
+          <w:ilvl w:val="0"/>
+          <w:numId w:val="1"/>
+        </w:numPr>
+      </w:pPr>
+      <w:r>
+        <w:t xml:space="preserve">Administrador: desea </w:t>
+      </w:r>
+      <w:r>
+        <w:t>organizar y actualizar las jornadas de trabajo del personal para asegurar la cobertura del servicio de biblioteca</w:t>
+      </w:r>
+      <w:r>
+        <w:t>.</w:t>
+      </w:r>
+    </w:p>
+    <w:p>
+      <w:pPr>
+        <w:pStyle w:val="Prrafodelista"/>
+        <w:numPr>
+          <w:ilvl w:val="0"/>
+          <w:numId w:val="1"/>
+        </w:numPr>
+      </w:pPr>
+      <w:r>
+        <w:t xml:space="preserve">Bibliotecario: desea </w:t>
+      </w:r>
+      <w:r>
+        <w:t>que su horario laboral esté correctamente reflejado para que el sistema valide sus funciones durante su jornada</w:t>
+      </w:r>
+      <w:r>
+        <w:t>.</w:t>
       </w:r>
     </w:p>
     <w:p>
@@ -2731,18 +3499,33 @@
         <w:t xml:space="preserve">El </w:t>
       </w:r>
       <w:r>
-        <w:t>bibliotecario</w:t>
+        <w:t>administrador</w:t>
       </w:r>
       <w:r>
         <w:t xml:space="preserve"> debe haber iniciado sesión en su cuenta.</w:t>
       </w:r>
     </w:p>
     <w:p>
+      <w:pPr>
+        <w:pStyle w:val="Prrafodelista"/>
+        <w:numPr>
+          <w:ilvl w:val="0"/>
+          <w:numId w:val="1"/>
+        </w:numPr>
+      </w:pPr>
+      <w:r>
+        <w:t>El bibliotecario al que se cambia su horario debe estar registrado en el sistema.</w:t>
+      </w:r>
+    </w:p>
+    <w:p>
       <w:r>
         <w:t xml:space="preserve">Garantías de éxito: el </w:t>
       </w:r>
       <w:r>
-        <w:t>sistema actualiza la base de datos reflejando el alta del nuevo libro o la eliminación del ejemplar retirado</w:t>
+        <w:t xml:space="preserve">sistema </w:t>
+      </w:r>
+      <w:r>
+        <w:t>actualiza el horario del bibliotecario</w:t>
       </w:r>
       <w:r>
         <w:t>.</w:t>
@@ -2760,6 +3543,7 @@
           <w:b/>
           <w:bCs/>
         </w:rPr>
+        <w:lastRenderedPageBreak/>
         <w:t>Flujo básico:</w:t>
       </w:r>
     </w:p>
@@ -2768,68 +3552,569 @@
         <w:pStyle w:val="Prrafodelista"/>
         <w:numPr>
           <w:ilvl w:val="0"/>
-          <w:numId w:val="33"/>
-        </w:numPr>
-      </w:pPr>
-      <w:r>
-        <w:t>El bibliotecario accede a la sección “Gestionar inventario”.</w:t>
-      </w:r>
-    </w:p>
-    <w:p>
-      <w:pPr>
-        <w:pStyle w:val="Prrafodelista"/>
-        <w:numPr>
-          <w:ilvl w:val="0"/>
-          <w:numId w:val="33"/>
-        </w:numPr>
-      </w:pPr>
-      <w:r>
-        <w:t>El bibliotecario selecciona la operación “</w:t>
-      </w:r>
-      <w:r>
-        <w:t>Retirar</w:t>
-      </w:r>
-      <w:r>
-        <w:t xml:space="preserve"> libro”</w:t>
-      </w:r>
-    </w:p>
-    <w:p>
-      <w:pPr>
-        <w:pStyle w:val="Prrafodelista"/>
-        <w:numPr>
-          <w:ilvl w:val="0"/>
-          <w:numId w:val="33"/>
+          <w:numId w:val="42"/>
+        </w:numPr>
+      </w:pPr>
+      <w:r>
+        <w:t>El administrador accede al panel de “Gestión de Personal”.</w:t>
+      </w:r>
+    </w:p>
+    <w:p>
+      <w:pPr>
+        <w:pStyle w:val="Prrafodelista"/>
+        <w:numPr>
+          <w:ilvl w:val="0"/>
+          <w:numId w:val="42"/>
+        </w:numPr>
+      </w:pPr>
+      <w:r>
+        <w:t>El administrador selecciona</w:t>
+      </w:r>
+      <w:r>
+        <w:t xml:space="preserve"> el bibliotecario de la lista con botón derecho</w:t>
+      </w:r>
+      <w:r>
+        <w:t>.</w:t>
+      </w:r>
+    </w:p>
+    <w:p>
+      <w:pPr>
+        <w:pStyle w:val="Prrafodelista"/>
+        <w:numPr>
+          <w:ilvl w:val="0"/>
+          <w:numId w:val="42"/>
+        </w:numPr>
+      </w:pPr>
+      <w:r>
+        <w:t>El administrador selecciona “Modificar horario” en el menú contextual.</w:t>
+      </w:r>
+    </w:p>
+    <w:p>
+      <w:pPr>
+        <w:pStyle w:val="Prrafodelista"/>
+        <w:numPr>
+          <w:ilvl w:val="0"/>
+          <w:numId w:val="42"/>
+        </w:numPr>
+      </w:pPr>
+      <w:r>
+        <w:t xml:space="preserve">El administrador </w:t>
+      </w:r>
+      <w:r>
+        <w:t>introdúcelos días y</w:t>
+      </w:r>
+      <w:r>
+        <w:t xml:space="preserve"> </w:t>
+      </w:r>
+      <w:r>
+        <w:t>las nuevas horas de entrada y salida</w:t>
+      </w:r>
+      <w:r>
+        <w:t>.</w:t>
+      </w:r>
+    </w:p>
+    <w:p>
+      <w:pPr>
+        <w:pStyle w:val="Prrafodelista"/>
+        <w:numPr>
+          <w:ilvl w:val="0"/>
+          <w:numId w:val="42"/>
+        </w:numPr>
+      </w:pPr>
+      <w:r>
+        <w:t>El sistema comprueba que el formato de tiempo sea correcto</w:t>
+      </w:r>
+      <w:r>
+        <w:t>.</w:t>
+      </w:r>
+    </w:p>
+    <w:p>
+      <w:pPr>
+        <w:pStyle w:val="Prrafodelista"/>
+        <w:numPr>
+          <w:ilvl w:val="0"/>
+          <w:numId w:val="42"/>
+        </w:numPr>
+      </w:pPr>
+      <w:r>
+        <w:t>El sistema muestra un mensaje de confirmación con el nuevo horario actualizado</w:t>
+      </w:r>
+      <w:r>
+        <w:t>.</w:t>
+      </w:r>
+    </w:p>
+    <w:p>
+      <w:r>
+        <w:rPr>
+          <w:b/>
+          <w:bCs/>
+        </w:rPr>
+        <w:t>Flujos alternativos:</w:t>
+      </w:r>
+    </w:p>
+    <w:p>
+      <w:r>
+        <w:t>2</w:t>
+      </w:r>
+      <w:r>
+        <w:t xml:space="preserve">a. El </w:t>
+      </w:r>
+      <w:r>
+        <w:t>bibliotecario no aparece en la lista</w:t>
+      </w:r>
+      <w:r>
+        <w:t>:</w:t>
+      </w:r>
+    </w:p>
+    <w:p>
+      <w:pPr>
+        <w:pStyle w:val="Prrafodelista"/>
+        <w:numPr>
+          <w:ilvl w:val="0"/>
+          <w:numId w:val="40"/>
         </w:numPr>
       </w:pPr>
       <w:r>
         <w:t xml:space="preserve">El </w:t>
       </w:r>
       <w:r>
-        <w:t>bibliotecario busca el libro por ISBN y selecciona “Retirar” indicando el motivo.</w:t>
-      </w:r>
-    </w:p>
-    <w:p>
-      <w:pPr>
-        <w:pStyle w:val="Prrafodelista"/>
-        <w:numPr>
-          <w:ilvl w:val="0"/>
-          <w:numId w:val="33"/>
-        </w:numPr>
-      </w:pPr>
-      <w:r>
-        <w:t>El sistema comprueba que el libro no tenga préstamos o reservas activas.</w:t>
-      </w:r>
-    </w:p>
-    <w:p>
-      <w:pPr>
-        <w:pStyle w:val="Prrafodelista"/>
-        <w:numPr>
-          <w:ilvl w:val="0"/>
-          <w:numId w:val="33"/>
-        </w:numPr>
-      </w:pPr>
-      <w:r>
-        <w:t xml:space="preserve">El sistema actualiza la base de datos e informa que la operación ha sido realizada. </w:t>
+        <w:t>administrador realiza una búsqueda por nombre o correo electrónico</w:t>
+      </w:r>
+      <w:r>
+        <w:t>.</w:t>
+      </w:r>
+    </w:p>
+    <w:p>
+      <w:pPr>
+        <w:pStyle w:val="Prrafodelista"/>
+        <w:numPr>
+          <w:ilvl w:val="0"/>
+          <w:numId w:val="40"/>
+        </w:numPr>
+      </w:pPr>
+      <w:r>
+        <w:t>Si sigue sin aparecer, el Administrador debe proceder primero al alta del usuario</w:t>
+      </w:r>
+      <w:r>
+        <w:t xml:space="preserve"> (CU08)</w:t>
+      </w:r>
+      <w:r>
+        <w:t>.</w:t>
+      </w:r>
+    </w:p>
+    <w:p>
+      <w:r>
+        <w:t>5a. Formato de horario inválido:</w:t>
+      </w:r>
+    </w:p>
+    <w:p>
+      <w:pPr>
+        <w:pStyle w:val="Prrafodelista"/>
+        <w:numPr>
+          <w:ilvl w:val="0"/>
+          <w:numId w:val="41"/>
+        </w:numPr>
+      </w:pPr>
+      <w:r>
+        <w:t>El sistema informa que el formato no es válido.</w:t>
+      </w:r>
+    </w:p>
+    <w:p>
+      <w:pPr>
+        <w:pStyle w:val="Prrafodelista"/>
+        <w:numPr>
+          <w:ilvl w:val="0"/>
+          <w:numId w:val="41"/>
+        </w:numPr>
+      </w:pPr>
+      <w:r>
+        <w:t>El administrador vuelve al paso 4.</w:t>
+      </w:r>
+    </w:p>
+    <w:p>
+      <w:r>
+        <w:t>*a. El sistema falla al conectar con la base de datos:</w:t>
+      </w:r>
+    </w:p>
+    <w:p>
+      <w:pPr>
+        <w:pStyle w:val="Prrafodelista"/>
+        <w:numPr>
+          <w:ilvl w:val="0"/>
+          <w:numId w:val="48"/>
+        </w:numPr>
+      </w:pPr>
+      <w:r>
+        <w:t>El sistema muestra un mensaje indicando que hay un error.</w:t>
+      </w:r>
+    </w:p>
+    <w:p>
+      <w:r>
+        <w:t>*b. El sistema no puede conectar con la red local:</w:t>
+      </w:r>
+    </w:p>
+    <w:p>
+      <w:pPr>
+        <w:pStyle w:val="Prrafodelista"/>
+        <w:numPr>
+          <w:ilvl w:val="0"/>
+          <w:numId w:val="49"/>
+        </w:numPr>
+      </w:pPr>
+      <w:r>
+        <w:t>El sistema muestra un mensaje indicando que hay un error.</w:t>
+      </w:r>
+    </w:p>
+    <w:p>
+      <w:pPr>
+        <w:rPr>
+          <w:b/>
+          <w:bCs/>
+        </w:rPr>
+      </w:pPr>
+      <w:r>
+        <w:rPr>
+          <w:b/>
+          <w:bCs/>
+        </w:rPr>
+        <w:t>Lista de tecnología y variaciones de datos:</w:t>
+      </w:r>
+    </w:p>
+    <w:p>
+      <w:r>
+        <w:t>4</w:t>
+      </w:r>
+      <w:r>
+        <w:t xml:space="preserve">a. </w:t>
+      </w:r>
+      <w:r>
+        <w:t>La introducción d</w:t>
+      </w:r>
+      <w:r>
+        <w:t>el horario</w:t>
+      </w:r>
+      <w:r>
+        <w:t xml:space="preserve"> se realiza mediante teclado y ratón en la aplicación de escritorio</w:t>
+      </w:r>
+      <w:r>
+        <w:t>.</w:t>
+      </w:r>
+    </w:p>
+    <w:p>
+      <w:pPr>
+        <w:rPr>
+          <w:b/>
+          <w:bCs/>
+        </w:rPr>
+      </w:pPr>
+      <w:r>
+        <w:rPr>
+          <w:b/>
+          <w:bCs/>
+        </w:rPr>
+        <w:t>Información relacionada:</w:t>
+      </w:r>
+    </w:p>
+    <w:p>
+      <w:r>
+        <w:t xml:space="preserve">Prioridad: </w:t>
+      </w:r>
+      <w:r>
+        <w:t>media</w:t>
+      </w:r>
+      <w:r>
+        <w:t>.</w:t>
+      </w:r>
+    </w:p>
+    <w:p>
+      <w:pPr>
+        <w:ind w:left="708" w:hanging="708"/>
+      </w:pPr>
+      <w:r>
+        <w:t>Frecuencia: baja.</w:t>
+      </w:r>
+    </w:p>
+    <w:p>
+      <w:r>
+        <w:t>Requisitos especiales: el tiempo de respuesta debe ser inferior a 5 segundos.</w:t>
+      </w:r>
+    </w:p>
+    <w:p/>
+    <w:p>
+      <w:pPr>
+        <w:rPr>
+          <w:b/>
+          <w:bCs/>
+          <w:sz w:val="28"/>
+          <w:szCs w:val="28"/>
+        </w:rPr>
+      </w:pPr>
+      <w:r>
+        <w:rPr>
+          <w:b/>
+          <w:bCs/>
+          <w:sz w:val="28"/>
+          <w:szCs w:val="28"/>
+        </w:rPr>
+        <w:t>CU</w:t>
+      </w:r>
+      <w:r>
+        <w:rPr>
+          <w:b/>
+          <w:bCs/>
+          <w:sz w:val="28"/>
+          <w:szCs w:val="28"/>
+        </w:rPr>
+        <w:t>10</w:t>
+      </w:r>
+      <w:r>
+        <w:rPr>
+          <w:b/>
+          <w:bCs/>
+          <w:sz w:val="28"/>
+          <w:szCs w:val="28"/>
+        </w:rPr>
+        <w:t>:</w:t>
+      </w:r>
+      <w:r>
+        <w:rPr>
+          <w:b/>
+          <w:bCs/>
+          <w:sz w:val="28"/>
+          <w:szCs w:val="28"/>
+        </w:rPr>
+        <w:t xml:space="preserve"> </w:t>
+      </w:r>
+      <w:r>
+        <w:rPr>
+          <w:b/>
+          <w:bCs/>
+          <w:sz w:val="28"/>
+          <w:szCs w:val="28"/>
+        </w:rPr>
+        <w:t>Cambiar contraseña</w:t>
+      </w:r>
+      <w:r>
+        <w:rPr>
+          <w:b/>
+          <w:bCs/>
+          <w:sz w:val="28"/>
+          <w:szCs w:val="28"/>
+        </w:rPr>
+        <w:t>.</w:t>
+      </w:r>
+    </w:p>
+    <w:p>
+      <w:pPr>
+        <w:rPr>
+          <w:b/>
+          <w:bCs/>
+        </w:rPr>
+      </w:pPr>
+      <w:r>
+        <w:rPr>
+          <w:b/>
+          <w:bCs/>
+        </w:rPr>
+        <w:t>Prólogo:</w:t>
+      </w:r>
+    </w:p>
+    <w:p>
+      <w:r>
+        <w:t>Actor principal: administrador</w:t>
+      </w:r>
+      <w:r>
+        <w:t>, bibliotecario o estudiante</w:t>
+      </w:r>
+      <w:r>
+        <w:t>.</w:t>
+      </w:r>
+    </w:p>
+    <w:p>
+      <w:r>
+        <w:lastRenderedPageBreak/>
+        <w:t>Personal involucrado e intereses:</w:t>
+      </w:r>
+    </w:p>
+    <w:p>
+      <w:pPr>
+        <w:pStyle w:val="Prrafodelista"/>
+        <w:numPr>
+          <w:ilvl w:val="0"/>
+          <w:numId w:val="1"/>
+        </w:numPr>
+      </w:pPr>
+      <w:r>
+        <w:t>Usuario: desea cambiar su contraseña para mantener su cuenta segura.</w:t>
+      </w:r>
+    </w:p>
+    <w:p>
+      <w:r>
+        <w:t xml:space="preserve">Precondiciones: </w:t>
+      </w:r>
+    </w:p>
+    <w:p>
+      <w:pPr>
+        <w:pStyle w:val="Prrafodelista"/>
+        <w:numPr>
+          <w:ilvl w:val="0"/>
+          <w:numId w:val="1"/>
+        </w:numPr>
+      </w:pPr>
+      <w:r>
+        <w:t>El sistema debe estar conectado a la red local y la base de datos operativa</w:t>
+      </w:r>
+      <w:r>
+        <w:t>.</w:t>
+      </w:r>
+    </w:p>
+    <w:p>
+      <w:pPr>
+        <w:pStyle w:val="Prrafodelista"/>
+        <w:numPr>
+          <w:ilvl w:val="0"/>
+          <w:numId w:val="1"/>
+        </w:numPr>
+      </w:pPr>
+      <w:r>
+        <w:t xml:space="preserve">El </w:t>
+      </w:r>
+      <w:r>
+        <w:t>usuario</w:t>
+      </w:r>
+      <w:r>
+        <w:t xml:space="preserve"> debe haber iniciado sesión en su cuenta.</w:t>
+      </w:r>
+    </w:p>
+    <w:p>
+      <w:r>
+        <w:t xml:space="preserve">Garantías de éxito: el </w:t>
+      </w:r>
+      <w:r>
+        <w:t xml:space="preserve">sistema </w:t>
+      </w:r>
+      <w:r>
+        <w:t xml:space="preserve">actualiza </w:t>
+      </w:r>
+      <w:r>
+        <w:t>la nueva contraseña en la base de datos con la que el usuario accederá a partir de ahora</w:t>
+      </w:r>
+      <w:r>
+        <w:t>.</w:t>
+      </w:r>
+    </w:p>
+    <w:p>
+      <w:pPr>
+        <w:rPr>
+          <w:b/>
+          <w:bCs/>
+        </w:rPr>
+      </w:pPr>
+      <w:r>
+        <w:rPr>
+          <w:b/>
+          <w:bCs/>
+        </w:rPr>
+        <w:t>Flujo básico:</w:t>
+      </w:r>
+    </w:p>
+    <w:p>
+      <w:pPr>
+        <w:pStyle w:val="Prrafodelista"/>
+        <w:numPr>
+          <w:ilvl w:val="0"/>
+          <w:numId w:val="43"/>
+        </w:numPr>
+      </w:pPr>
+      <w:r>
+        <w:t>El usuario pulsa en el engranaje con etiqueta “Ajustes”</w:t>
+      </w:r>
+      <w:r>
+        <w:t>.</w:t>
+      </w:r>
+    </w:p>
+    <w:p>
+      <w:pPr>
+        <w:pStyle w:val="Prrafodelista"/>
+        <w:numPr>
+          <w:ilvl w:val="0"/>
+          <w:numId w:val="43"/>
+        </w:numPr>
+      </w:pPr>
+      <w:r>
+        <w:t>El usuario selecciona la opción “Cambiar contraseña”.</w:t>
+      </w:r>
+    </w:p>
+    <w:p>
+      <w:pPr>
+        <w:pStyle w:val="Prrafodelista"/>
+        <w:numPr>
+          <w:ilvl w:val="0"/>
+          <w:numId w:val="43"/>
+        </w:numPr>
+      </w:pPr>
+      <w:r>
+        <w:t>El sistema solicita la contraseña actual, la nueva contraseña y una confirmación de la nueva contraseña.</w:t>
+      </w:r>
+    </w:p>
+    <w:p>
+      <w:pPr>
+        <w:pStyle w:val="Prrafodelista"/>
+        <w:numPr>
+          <w:ilvl w:val="0"/>
+          <w:numId w:val="43"/>
+        </w:numPr>
+      </w:pPr>
+      <w:r>
+        <w:t>El usuario introduce los datos solicitados.</w:t>
+      </w:r>
+    </w:p>
+    <w:p>
+      <w:pPr>
+        <w:pStyle w:val="Prrafodelista"/>
+        <w:numPr>
+          <w:ilvl w:val="0"/>
+          <w:numId w:val="43"/>
+        </w:numPr>
+      </w:pPr>
+      <w:r>
+        <w:t>El sistema comprueba que la contraseña actual coincida con la de la base de datos.</w:t>
+      </w:r>
+    </w:p>
+    <w:p>
+      <w:pPr>
+        <w:pStyle w:val="Prrafodelista"/>
+        <w:numPr>
+          <w:ilvl w:val="0"/>
+          <w:numId w:val="43"/>
+        </w:numPr>
+      </w:pPr>
+      <w:r>
+        <w:t>El sistema comprueba que la nueva contraseña y su confirmación son idénticas, y que el formato es el adecuado.</w:t>
+      </w:r>
+    </w:p>
+    <w:p>
+      <w:pPr>
+        <w:pStyle w:val="Prrafodelista"/>
+        <w:numPr>
+          <w:ilvl w:val="0"/>
+          <w:numId w:val="43"/>
+        </w:numPr>
+      </w:pPr>
+      <w:r>
+        <w:t>El sistema actualiza la contraseña en la base de datos.</w:t>
+      </w:r>
+    </w:p>
+    <w:p>
+      <w:pPr>
+        <w:pStyle w:val="Prrafodelista"/>
+        <w:numPr>
+          <w:ilvl w:val="0"/>
+          <w:numId w:val="43"/>
+        </w:numPr>
+      </w:pPr>
+      <w:r>
+        <w:t>El sistema informa al usuario que su contraseña se ha cambiado correctamente.</w:t>
       </w:r>
     </w:p>
     <w:p>
@@ -2843,95 +4128,162 @@
     </w:p>
     <w:p>
       <w:r>
+        <w:t>5</w:t>
+      </w:r>
+      <w:r>
+        <w:t xml:space="preserve">a. </w:t>
+      </w:r>
+      <w:r>
+        <w:t>La contraseña actual es incorrecta</w:t>
+      </w:r>
+      <w:r>
+        <w:t>:</w:t>
+      </w:r>
+    </w:p>
+    <w:p>
+      <w:pPr>
+        <w:pStyle w:val="Prrafodelista"/>
+        <w:numPr>
+          <w:ilvl w:val="0"/>
+          <w:numId w:val="44"/>
+        </w:numPr>
+      </w:pPr>
+      <w:r>
+        <w:t>El sistema muestra un mensaje de error</w:t>
+      </w:r>
+      <w:r>
+        <w:t>.</w:t>
+      </w:r>
+    </w:p>
+    <w:p>
+      <w:pPr>
+        <w:pStyle w:val="Prrafodelista"/>
+        <w:numPr>
+          <w:ilvl w:val="0"/>
+          <w:numId w:val="44"/>
+        </w:numPr>
+      </w:pPr>
+      <w:r>
+        <w:t>El caso de uso vuelve al paso 3.</w:t>
+      </w:r>
+    </w:p>
+    <w:p>
+      <w:r>
+        <w:t>5</w:t>
+      </w:r>
+      <w:r>
+        <w:t>b</w:t>
+      </w:r>
+      <w:r>
+        <w:t>.</w:t>
+      </w:r>
+      <w:r>
+        <w:t xml:space="preserve"> Las nuevas contraseñas no coinciden</w:t>
+      </w:r>
+      <w:r>
+        <w:t>:</w:t>
+      </w:r>
+    </w:p>
+    <w:p>
+      <w:pPr>
+        <w:pStyle w:val="Prrafodelista"/>
+        <w:numPr>
+          <w:ilvl w:val="0"/>
+          <w:numId w:val="45"/>
+        </w:numPr>
+      </w:pPr>
+      <w:r>
+        <w:t>El sistema informa que ambas contraseñas deben ser iguales</w:t>
+      </w:r>
+      <w:r>
+        <w:t>.</w:t>
+      </w:r>
+    </w:p>
+    <w:p>
+      <w:pPr>
+        <w:pStyle w:val="Prrafodelista"/>
+        <w:numPr>
+          <w:ilvl w:val="0"/>
+          <w:numId w:val="45"/>
+        </w:numPr>
+      </w:pPr>
+      <w:r>
+        <w:t>El caso de uso vuelve al paso 3.</w:t>
+      </w:r>
+    </w:p>
+    <w:p>
+      <w:r>
+        <w:t>*a. El sistema falla al conectar con la base de datos:</w:t>
+      </w:r>
+    </w:p>
+    <w:p>
+      <w:pPr>
+        <w:pStyle w:val="Prrafodelista"/>
+        <w:numPr>
+          <w:ilvl w:val="0"/>
+          <w:numId w:val="46"/>
+        </w:numPr>
+      </w:pPr>
+      <w:r>
+        <w:t>El sistema muestra un mensaje indicando que hay un error.</w:t>
+      </w:r>
+    </w:p>
+    <w:p>
+      <w:r>
+        <w:t>*b. El sistema no puede conectar con la red local:</w:t>
+      </w:r>
+    </w:p>
+    <w:p>
+      <w:pPr>
+        <w:pStyle w:val="Prrafodelista"/>
+        <w:numPr>
+          <w:ilvl w:val="0"/>
+          <w:numId w:val="47"/>
+        </w:numPr>
+      </w:pPr>
+      <w:r>
+        <w:t>El sistema muestra un mensaje indicando que hay un error.</w:t>
+      </w:r>
+    </w:p>
+    <w:p>
+      <w:pPr>
+        <w:rPr>
+          <w:b/>
+          <w:bCs/>
+        </w:rPr>
+      </w:pPr>
+      <w:r>
+        <w:rPr>
+          <w:b/>
+          <w:bCs/>
+        </w:rPr>
+        <w:t>Lista de tecnología y variaciones de datos:</w:t>
+      </w:r>
+    </w:p>
+    <w:p>
+      <w:r>
+        <w:lastRenderedPageBreak/>
         <w:t>4</w:t>
       </w:r>
       <w:r>
-        <w:t>a. El libro tiene préstamos o reservas:</w:t>
-      </w:r>
-    </w:p>
-    <w:p>
-      <w:pPr>
-        <w:pStyle w:val="Prrafodelista"/>
-        <w:numPr>
-          <w:ilvl w:val="0"/>
-          <w:numId w:val="28"/>
-        </w:numPr>
-      </w:pPr>
-      <w:r>
-        <w:t xml:space="preserve">El sistema bloquea la baja y muestra un error indicando que el libro </w:t>
-      </w:r>
-      <w:r>
-        <w:t>está</w:t>
-      </w:r>
-      <w:r>
-        <w:t xml:space="preserve"> comprometido.</w:t>
-      </w:r>
-    </w:p>
-    <w:p>
-      <w:pPr>
-        <w:pStyle w:val="Prrafodelista"/>
-        <w:numPr>
-          <w:ilvl w:val="0"/>
-          <w:numId w:val="28"/>
-        </w:numPr>
-      </w:pPr>
-      <w:r>
-        <w:t>El caso de uso finaliza.</w:t>
-      </w:r>
-    </w:p>
-    <w:p>
-      <w:r>
-        <w:lastRenderedPageBreak/>
-        <w:t>*a. El sistema falla al conectar con la base de datos:</w:t>
-      </w:r>
-    </w:p>
-    <w:p>
-      <w:pPr>
-        <w:pStyle w:val="Prrafodelista"/>
-        <w:numPr>
-          <w:ilvl w:val="0"/>
-          <w:numId w:val="29"/>
-        </w:numPr>
-      </w:pPr>
-      <w:r>
-        <w:t>El sistema muestra un mensaje indicando que hay un error.</w:t>
-      </w:r>
-    </w:p>
-    <w:p>
-      <w:r>
-        <w:t>*b. El sistema no puede conectar con la red local:</w:t>
-      </w:r>
-    </w:p>
-    <w:p>
-      <w:pPr>
-        <w:pStyle w:val="Prrafodelista"/>
-        <w:numPr>
-          <w:ilvl w:val="0"/>
-          <w:numId w:val="33"/>
-        </w:numPr>
-      </w:pPr>
-      <w:r>
-        <w:t>El sistema muestra un mensaje indicando que hay un error.</w:t>
-      </w:r>
-    </w:p>
-    <w:p>
-      <w:pPr>
-        <w:rPr>
-          <w:b/>
-          <w:bCs/>
-        </w:rPr>
-      </w:pPr>
-      <w:r>
-        <w:rPr>
-          <w:b/>
-          <w:bCs/>
-        </w:rPr>
-        <w:t>Lista de tecnología y variaciones de datos:</w:t>
-      </w:r>
-    </w:p>
-    <w:p>
-      <w:r>
-        <w:t>3a. El ISBN debe ser formato ISBN-13.</w:t>
+        <w:t xml:space="preserve">a. </w:t>
+      </w:r>
+      <w:r>
+        <w:t>La introducción d</w:t>
+      </w:r>
+      <w:r>
+        <w:t>el horario</w:t>
+      </w:r>
+      <w:r>
+        <w:t xml:space="preserve"> se realiza mediante teclado y ratón en la aplicación de escritorio</w:t>
+      </w:r>
+      <w:r>
+        <w:t>.</w:t>
+      </w:r>
+    </w:p>
+    <w:p>
+      <w:r>
+        <w:t>4b. Las contraseñas están ocultas en forma de puntos que pueden ser revelados con el botón de “Mostrar contraseña”.</w:t>
       </w:r>
     </w:p>
     <w:p>
@@ -2951,17 +4303,38 @@
     </w:p>
     <w:p>
       <w:r>
-        <w:t>Prioridad: media.</w:t>
-      </w:r>
-    </w:p>
-    <w:p>
-      <w:r>
-        <w:t>Frecuencia: media.</w:t>
-      </w:r>
-    </w:p>
-    <w:p>
-      <w:r>
-        <w:t>Requisitos especiales: el tiempo de respuesta debe ser inferior a 5 segundos.</w:t>
+        <w:t xml:space="preserve">Prioridad: </w:t>
+      </w:r>
+      <w:r>
+        <w:t>alta</w:t>
+      </w:r>
+      <w:r>
+        <w:t>.</w:t>
+      </w:r>
+    </w:p>
+    <w:p>
+      <w:pPr>
+        <w:ind w:left="708" w:hanging="708"/>
+      </w:pPr>
+      <w:r>
+        <w:t xml:space="preserve">Frecuencia: </w:t>
+      </w:r>
+      <w:r>
+        <w:t>media</w:t>
+      </w:r>
+      <w:r>
+        <w:t>.</w:t>
+      </w:r>
+    </w:p>
+    <w:p>
+      <w:r>
+        <w:t>Requisitos especiales: el tiempo de respuesta</w:t>
+      </w:r>
+      <w:r>
+        <w:t xml:space="preserve"> y la actualización</w:t>
+      </w:r>
+      <w:r>
+        <w:t xml:space="preserve"> debe ser inferior a 5 segundos.</w:t>
       </w:r>
     </w:p>
     <w:p/>
@@ -2976,9 +4349,10 @@
     <w:p/>
     <w:p/>
     <w:p/>
-    <w:p/>
-    <w:p/>
-    <w:p>
+    <w:p>
+      <w:pPr>
+        <w:ind w:left="708" w:hanging="708"/>
+      </w:pPr>
       <w:r>
         <w:t xml:space="preserve">Caso de uso: </w:t>
       </w:r>
@@ -3089,6 +4463,95 @@
     </w:lvl>
   </w:abstractNum>
   <w:abstractNum w:abstractNumId="1" w15:restartNumberingAfterBreak="0">
+    <w:nsid w:val="020D6372"/>
+    <w:multiLevelType w:val="hybridMultilevel"/>
+    <w:tmpl w:val="CF8E17D6"/>
+    <w:lvl w:ilvl="0" w:tplc="FFFFFFFF">
+      <w:start w:val="1"/>
+      <w:numFmt w:val="decimal"/>
+      <w:lvlText w:val="%1."/>
+      <w:lvlJc w:val="left"/>
+      <w:pPr>
+        <w:ind w:left="720" w:hanging="360"/>
+      </w:pPr>
+      <w:rPr>
+        <w:rFonts w:hint="default"/>
+      </w:rPr>
+    </w:lvl>
+    <w:lvl w:ilvl="1" w:tplc="FFFFFFFF" w:tentative="1">
+      <w:start w:val="1"/>
+      <w:numFmt w:val="lowerLetter"/>
+      <w:lvlText w:val="%2."/>
+      <w:lvlJc w:val="left"/>
+      <w:pPr>
+        <w:ind w:left="1440" w:hanging="360"/>
+      </w:pPr>
+    </w:lvl>
+    <w:lvl w:ilvl="2" w:tplc="FFFFFFFF" w:tentative="1">
+      <w:start w:val="1"/>
+      <w:numFmt w:val="lowerRoman"/>
+      <w:lvlText w:val="%3."/>
+      <w:lvlJc w:val="right"/>
+      <w:pPr>
+        <w:ind w:left="2160" w:hanging="180"/>
+      </w:pPr>
+    </w:lvl>
+    <w:lvl w:ilvl="3" w:tplc="FFFFFFFF" w:tentative="1">
+      <w:start w:val="1"/>
+      <w:numFmt w:val="decimal"/>
+      <w:lvlText w:val="%4."/>
+      <w:lvlJc w:val="left"/>
+      <w:pPr>
+        <w:ind w:left="2880" w:hanging="360"/>
+      </w:pPr>
+    </w:lvl>
+    <w:lvl w:ilvl="4" w:tplc="FFFFFFFF" w:tentative="1">
+      <w:start w:val="1"/>
+      <w:numFmt w:val="lowerLetter"/>
+      <w:lvlText w:val="%5."/>
+      <w:lvlJc w:val="left"/>
+      <w:pPr>
+        <w:ind w:left="3600" w:hanging="360"/>
+      </w:pPr>
+    </w:lvl>
+    <w:lvl w:ilvl="5" w:tplc="FFFFFFFF" w:tentative="1">
+      <w:start w:val="1"/>
+      <w:numFmt w:val="lowerRoman"/>
+      <w:lvlText w:val="%6."/>
+      <w:lvlJc w:val="right"/>
+      <w:pPr>
+        <w:ind w:left="4320" w:hanging="180"/>
+      </w:pPr>
+    </w:lvl>
+    <w:lvl w:ilvl="6" w:tplc="FFFFFFFF" w:tentative="1">
+      <w:start w:val="1"/>
+      <w:numFmt w:val="decimal"/>
+      <w:lvlText w:val="%7."/>
+      <w:lvlJc w:val="left"/>
+      <w:pPr>
+        <w:ind w:left="5040" w:hanging="360"/>
+      </w:pPr>
+    </w:lvl>
+    <w:lvl w:ilvl="7" w:tplc="FFFFFFFF" w:tentative="1">
+      <w:start w:val="1"/>
+      <w:numFmt w:val="lowerLetter"/>
+      <w:lvlText w:val="%8."/>
+      <w:lvlJc w:val="left"/>
+      <w:pPr>
+        <w:ind w:left="5760" w:hanging="360"/>
+      </w:pPr>
+    </w:lvl>
+    <w:lvl w:ilvl="8" w:tplc="FFFFFFFF" w:tentative="1">
+      <w:start w:val="1"/>
+      <w:numFmt w:val="lowerRoman"/>
+      <w:lvlText w:val="%9."/>
+      <w:lvlJc w:val="right"/>
+      <w:pPr>
+        <w:ind w:left="6480" w:hanging="180"/>
+      </w:pPr>
+    </w:lvl>
+  </w:abstractNum>
+  <w:abstractNum w:abstractNumId="2" w15:restartNumberingAfterBreak="0">
     <w:nsid w:val="03882A1C"/>
     <w:multiLevelType w:val="hybridMultilevel"/>
     <w:tmpl w:val="67943264"/>
@@ -3177,7 +4640,7 @@
       </w:pPr>
     </w:lvl>
   </w:abstractNum>
-  <w:abstractNum w:abstractNumId="2" w15:restartNumberingAfterBreak="0">
+  <w:abstractNum w:abstractNumId="3" w15:restartNumberingAfterBreak="0">
     <w:nsid w:val="04B70B3B"/>
     <w:multiLevelType w:val="hybridMultilevel"/>
     <w:tmpl w:val="67943264"/>
@@ -3266,7 +4729,7 @@
       </w:pPr>
     </w:lvl>
   </w:abstractNum>
-  <w:abstractNum w:abstractNumId="3" w15:restartNumberingAfterBreak="0">
+  <w:abstractNum w:abstractNumId="4" w15:restartNumberingAfterBreak="0">
     <w:nsid w:val="0D053642"/>
     <w:multiLevelType w:val="hybridMultilevel"/>
     <w:tmpl w:val="2FCC281C"/>
@@ -3355,7 +4818,7 @@
       </w:pPr>
     </w:lvl>
   </w:abstractNum>
-  <w:abstractNum w:abstractNumId="4" w15:restartNumberingAfterBreak="0">
+  <w:abstractNum w:abstractNumId="5" w15:restartNumberingAfterBreak="0">
     <w:nsid w:val="0E687120"/>
     <w:multiLevelType w:val="hybridMultilevel"/>
     <w:tmpl w:val="13E6CE20"/>
@@ -3468,7 +4931,96 @@
       </w:rPr>
     </w:lvl>
   </w:abstractNum>
-  <w:abstractNum w:abstractNumId="5" w15:restartNumberingAfterBreak="0">
+  <w:abstractNum w:abstractNumId="6" w15:restartNumberingAfterBreak="0">
+    <w:nsid w:val="12D22EDA"/>
+    <w:multiLevelType w:val="hybridMultilevel"/>
+    <w:tmpl w:val="67943264"/>
+    <w:lvl w:ilvl="0" w:tplc="FFFFFFFF">
+      <w:start w:val="1"/>
+      <w:numFmt w:val="decimal"/>
+      <w:lvlText w:val="%1."/>
+      <w:lvlJc w:val="left"/>
+      <w:pPr>
+        <w:ind w:left="720" w:hanging="360"/>
+      </w:pPr>
+      <w:rPr>
+        <w:rFonts w:hint="default"/>
+      </w:rPr>
+    </w:lvl>
+    <w:lvl w:ilvl="1" w:tplc="FFFFFFFF" w:tentative="1">
+      <w:start w:val="1"/>
+      <w:numFmt w:val="lowerLetter"/>
+      <w:lvlText w:val="%2."/>
+      <w:lvlJc w:val="left"/>
+      <w:pPr>
+        <w:ind w:left="1440" w:hanging="360"/>
+      </w:pPr>
+    </w:lvl>
+    <w:lvl w:ilvl="2" w:tplc="FFFFFFFF" w:tentative="1">
+      <w:start w:val="1"/>
+      <w:numFmt w:val="lowerRoman"/>
+      <w:lvlText w:val="%3."/>
+      <w:lvlJc w:val="right"/>
+      <w:pPr>
+        <w:ind w:left="2160" w:hanging="180"/>
+      </w:pPr>
+    </w:lvl>
+    <w:lvl w:ilvl="3" w:tplc="FFFFFFFF" w:tentative="1">
+      <w:start w:val="1"/>
+      <w:numFmt w:val="decimal"/>
+      <w:lvlText w:val="%4."/>
+      <w:lvlJc w:val="left"/>
+      <w:pPr>
+        <w:ind w:left="2880" w:hanging="360"/>
+      </w:pPr>
+    </w:lvl>
+    <w:lvl w:ilvl="4" w:tplc="FFFFFFFF" w:tentative="1">
+      <w:start w:val="1"/>
+      <w:numFmt w:val="lowerLetter"/>
+      <w:lvlText w:val="%5."/>
+      <w:lvlJc w:val="left"/>
+      <w:pPr>
+        <w:ind w:left="3600" w:hanging="360"/>
+      </w:pPr>
+    </w:lvl>
+    <w:lvl w:ilvl="5" w:tplc="FFFFFFFF" w:tentative="1">
+      <w:start w:val="1"/>
+      <w:numFmt w:val="lowerRoman"/>
+      <w:lvlText w:val="%6."/>
+      <w:lvlJc w:val="right"/>
+      <w:pPr>
+        <w:ind w:left="4320" w:hanging="180"/>
+      </w:pPr>
+    </w:lvl>
+    <w:lvl w:ilvl="6" w:tplc="FFFFFFFF" w:tentative="1">
+      <w:start w:val="1"/>
+      <w:numFmt w:val="decimal"/>
+      <w:lvlText w:val="%7."/>
+      <w:lvlJc w:val="left"/>
+      <w:pPr>
+        <w:ind w:left="5040" w:hanging="360"/>
+      </w:pPr>
+    </w:lvl>
+    <w:lvl w:ilvl="7" w:tplc="FFFFFFFF" w:tentative="1">
+      <w:start w:val="1"/>
+      <w:numFmt w:val="lowerLetter"/>
+      <w:lvlText w:val="%8."/>
+      <w:lvlJc w:val="left"/>
+      <w:pPr>
+        <w:ind w:left="5760" w:hanging="360"/>
+      </w:pPr>
+    </w:lvl>
+    <w:lvl w:ilvl="8" w:tplc="FFFFFFFF" w:tentative="1">
+      <w:start w:val="1"/>
+      <w:numFmt w:val="lowerRoman"/>
+      <w:lvlText w:val="%9."/>
+      <w:lvlJc w:val="right"/>
+      <w:pPr>
+        <w:ind w:left="6480" w:hanging="180"/>
+      </w:pPr>
+    </w:lvl>
+  </w:abstractNum>
+  <w:abstractNum w:abstractNumId="7" w15:restartNumberingAfterBreak="0">
     <w:nsid w:val="14860C17"/>
     <w:multiLevelType w:val="hybridMultilevel"/>
     <w:tmpl w:val="0E681FEC"/>
@@ -3554,7 +5106,7 @@
       </w:pPr>
     </w:lvl>
   </w:abstractNum>
-  <w:abstractNum w:abstractNumId="6" w15:restartNumberingAfterBreak="0">
+  <w:abstractNum w:abstractNumId="8" w15:restartNumberingAfterBreak="0">
     <w:nsid w:val="176E1D0B"/>
     <w:multiLevelType w:val="hybridMultilevel"/>
     <w:tmpl w:val="A71EAF86"/>
@@ -3643,7 +5195,96 @@
       </w:pPr>
     </w:lvl>
   </w:abstractNum>
-  <w:abstractNum w:abstractNumId="7" w15:restartNumberingAfterBreak="0">
+  <w:abstractNum w:abstractNumId="9" w15:restartNumberingAfterBreak="0">
+    <w:nsid w:val="17891A5C"/>
+    <w:multiLevelType w:val="hybridMultilevel"/>
+    <w:tmpl w:val="47747B36"/>
+    <w:lvl w:ilvl="0" w:tplc="FFFFFFFF">
+      <w:start w:val="1"/>
+      <w:numFmt w:val="decimal"/>
+      <w:lvlText w:val="%1."/>
+      <w:lvlJc w:val="left"/>
+      <w:pPr>
+        <w:ind w:left="720" w:hanging="360"/>
+      </w:pPr>
+      <w:rPr>
+        <w:rFonts w:hint="default"/>
+      </w:rPr>
+    </w:lvl>
+    <w:lvl w:ilvl="1" w:tplc="FFFFFFFF" w:tentative="1">
+      <w:start w:val="1"/>
+      <w:numFmt w:val="lowerLetter"/>
+      <w:lvlText w:val="%2."/>
+      <w:lvlJc w:val="left"/>
+      <w:pPr>
+        <w:ind w:left="1440" w:hanging="360"/>
+      </w:pPr>
+    </w:lvl>
+    <w:lvl w:ilvl="2" w:tplc="FFFFFFFF" w:tentative="1">
+      <w:start w:val="1"/>
+      <w:numFmt w:val="lowerRoman"/>
+      <w:lvlText w:val="%3."/>
+      <w:lvlJc w:val="right"/>
+      <w:pPr>
+        <w:ind w:left="2160" w:hanging="180"/>
+      </w:pPr>
+    </w:lvl>
+    <w:lvl w:ilvl="3" w:tplc="FFFFFFFF" w:tentative="1">
+      <w:start w:val="1"/>
+      <w:numFmt w:val="decimal"/>
+      <w:lvlText w:val="%4."/>
+      <w:lvlJc w:val="left"/>
+      <w:pPr>
+        <w:ind w:left="2880" w:hanging="360"/>
+      </w:pPr>
+    </w:lvl>
+    <w:lvl w:ilvl="4" w:tplc="FFFFFFFF" w:tentative="1">
+      <w:start w:val="1"/>
+      <w:numFmt w:val="lowerLetter"/>
+      <w:lvlText w:val="%5."/>
+      <w:lvlJc w:val="left"/>
+      <w:pPr>
+        <w:ind w:left="3600" w:hanging="360"/>
+      </w:pPr>
+    </w:lvl>
+    <w:lvl w:ilvl="5" w:tplc="FFFFFFFF" w:tentative="1">
+      <w:start w:val="1"/>
+      <w:numFmt w:val="lowerRoman"/>
+      <w:lvlText w:val="%6."/>
+      <w:lvlJc w:val="right"/>
+      <w:pPr>
+        <w:ind w:left="4320" w:hanging="180"/>
+      </w:pPr>
+    </w:lvl>
+    <w:lvl w:ilvl="6" w:tplc="FFFFFFFF" w:tentative="1">
+      <w:start w:val="1"/>
+      <w:numFmt w:val="decimal"/>
+      <w:lvlText w:val="%7."/>
+      <w:lvlJc w:val="left"/>
+      <w:pPr>
+        <w:ind w:left="5040" w:hanging="360"/>
+      </w:pPr>
+    </w:lvl>
+    <w:lvl w:ilvl="7" w:tplc="FFFFFFFF" w:tentative="1">
+      <w:start w:val="1"/>
+      <w:numFmt w:val="lowerLetter"/>
+      <w:lvlText w:val="%8."/>
+      <w:lvlJc w:val="left"/>
+      <w:pPr>
+        <w:ind w:left="5760" w:hanging="360"/>
+      </w:pPr>
+    </w:lvl>
+    <w:lvl w:ilvl="8" w:tplc="FFFFFFFF" w:tentative="1">
+      <w:start w:val="1"/>
+      <w:numFmt w:val="lowerRoman"/>
+      <w:lvlText w:val="%9."/>
+      <w:lvlJc w:val="right"/>
+      <w:pPr>
+        <w:ind w:left="6480" w:hanging="180"/>
+      </w:pPr>
+    </w:lvl>
+  </w:abstractNum>
+  <w:abstractNum w:abstractNumId="10" w15:restartNumberingAfterBreak="0">
     <w:nsid w:val="17F11C4F"/>
     <w:multiLevelType w:val="hybridMultilevel"/>
     <w:tmpl w:val="67943264"/>
@@ -3732,7 +5373,7 @@
       </w:pPr>
     </w:lvl>
   </w:abstractNum>
-  <w:abstractNum w:abstractNumId="8" w15:restartNumberingAfterBreak="0">
+  <w:abstractNum w:abstractNumId="11" w15:restartNumberingAfterBreak="0">
     <w:nsid w:val="1993492F"/>
     <w:multiLevelType w:val="hybridMultilevel"/>
     <w:tmpl w:val="0A90B32C"/>
@@ -3821,7 +5462,7 @@
       </w:pPr>
     </w:lvl>
   </w:abstractNum>
-  <w:abstractNum w:abstractNumId="9" w15:restartNumberingAfterBreak="0">
+  <w:abstractNum w:abstractNumId="12" w15:restartNumberingAfterBreak="0">
     <w:nsid w:val="1B274D17"/>
     <w:multiLevelType w:val="hybridMultilevel"/>
     <w:tmpl w:val="55249C14"/>
@@ -3910,7 +5551,96 @@
       </w:pPr>
     </w:lvl>
   </w:abstractNum>
-  <w:abstractNum w:abstractNumId="10" w15:restartNumberingAfterBreak="0">
+  <w:abstractNum w:abstractNumId="13" w15:restartNumberingAfterBreak="0">
+    <w:nsid w:val="1F006E24"/>
+    <w:multiLevelType w:val="hybridMultilevel"/>
+    <w:tmpl w:val="CF8E17D6"/>
+    <w:lvl w:ilvl="0" w:tplc="FFFFFFFF">
+      <w:start w:val="1"/>
+      <w:numFmt w:val="decimal"/>
+      <w:lvlText w:val="%1."/>
+      <w:lvlJc w:val="left"/>
+      <w:pPr>
+        <w:ind w:left="720" w:hanging="360"/>
+      </w:pPr>
+      <w:rPr>
+        <w:rFonts w:hint="default"/>
+      </w:rPr>
+    </w:lvl>
+    <w:lvl w:ilvl="1" w:tplc="FFFFFFFF" w:tentative="1">
+      <w:start w:val="1"/>
+      <w:numFmt w:val="lowerLetter"/>
+      <w:lvlText w:val="%2."/>
+      <w:lvlJc w:val="left"/>
+      <w:pPr>
+        <w:ind w:left="1440" w:hanging="360"/>
+      </w:pPr>
+    </w:lvl>
+    <w:lvl w:ilvl="2" w:tplc="FFFFFFFF" w:tentative="1">
+      <w:start w:val="1"/>
+      <w:numFmt w:val="lowerRoman"/>
+      <w:lvlText w:val="%3."/>
+      <w:lvlJc w:val="right"/>
+      <w:pPr>
+        <w:ind w:left="2160" w:hanging="180"/>
+      </w:pPr>
+    </w:lvl>
+    <w:lvl w:ilvl="3" w:tplc="FFFFFFFF" w:tentative="1">
+      <w:start w:val="1"/>
+      <w:numFmt w:val="decimal"/>
+      <w:lvlText w:val="%4."/>
+      <w:lvlJc w:val="left"/>
+      <w:pPr>
+        <w:ind w:left="2880" w:hanging="360"/>
+      </w:pPr>
+    </w:lvl>
+    <w:lvl w:ilvl="4" w:tplc="FFFFFFFF" w:tentative="1">
+      <w:start w:val="1"/>
+      <w:numFmt w:val="lowerLetter"/>
+      <w:lvlText w:val="%5."/>
+      <w:lvlJc w:val="left"/>
+      <w:pPr>
+        <w:ind w:left="3600" w:hanging="360"/>
+      </w:pPr>
+    </w:lvl>
+    <w:lvl w:ilvl="5" w:tplc="FFFFFFFF" w:tentative="1">
+      <w:start w:val="1"/>
+      <w:numFmt w:val="lowerRoman"/>
+      <w:lvlText w:val="%6."/>
+      <w:lvlJc w:val="right"/>
+      <w:pPr>
+        <w:ind w:left="4320" w:hanging="180"/>
+      </w:pPr>
+    </w:lvl>
+    <w:lvl w:ilvl="6" w:tplc="FFFFFFFF" w:tentative="1">
+      <w:start w:val="1"/>
+      <w:numFmt w:val="decimal"/>
+      <w:lvlText w:val="%7."/>
+      <w:lvlJc w:val="left"/>
+      <w:pPr>
+        <w:ind w:left="5040" w:hanging="360"/>
+      </w:pPr>
+    </w:lvl>
+    <w:lvl w:ilvl="7" w:tplc="FFFFFFFF" w:tentative="1">
+      <w:start w:val="1"/>
+      <w:numFmt w:val="lowerLetter"/>
+      <w:lvlText w:val="%8."/>
+      <w:lvlJc w:val="left"/>
+      <w:pPr>
+        <w:ind w:left="5760" w:hanging="360"/>
+      </w:pPr>
+    </w:lvl>
+    <w:lvl w:ilvl="8" w:tplc="FFFFFFFF" w:tentative="1">
+      <w:start w:val="1"/>
+      <w:numFmt w:val="lowerRoman"/>
+      <w:lvlText w:val="%9."/>
+      <w:lvlJc w:val="right"/>
+      <w:pPr>
+        <w:ind w:left="6480" w:hanging="180"/>
+      </w:pPr>
+    </w:lvl>
+  </w:abstractNum>
+  <w:abstractNum w:abstractNumId="14" w15:restartNumberingAfterBreak="0">
     <w:nsid w:val="201C1953"/>
     <w:multiLevelType w:val="hybridMultilevel"/>
     <w:tmpl w:val="2FCC281C"/>
@@ -3999,7 +5729,7 @@
       </w:pPr>
     </w:lvl>
   </w:abstractNum>
-  <w:abstractNum w:abstractNumId="11" w15:restartNumberingAfterBreak="0">
+  <w:abstractNum w:abstractNumId="15" w15:restartNumberingAfterBreak="0">
     <w:nsid w:val="219E5590"/>
     <w:multiLevelType w:val="hybridMultilevel"/>
     <w:tmpl w:val="CF8E17D6"/>
@@ -4088,7 +5818,7 @@
       </w:pPr>
     </w:lvl>
   </w:abstractNum>
-  <w:abstractNum w:abstractNumId="12" w15:restartNumberingAfterBreak="0">
+  <w:abstractNum w:abstractNumId="16" w15:restartNumberingAfterBreak="0">
     <w:nsid w:val="239411E4"/>
     <w:multiLevelType w:val="hybridMultilevel"/>
     <w:tmpl w:val="5F62B224"/>
@@ -4174,7 +5904,7 @@
       </w:pPr>
     </w:lvl>
   </w:abstractNum>
-  <w:abstractNum w:abstractNumId="13" w15:restartNumberingAfterBreak="0">
+  <w:abstractNum w:abstractNumId="17" w15:restartNumberingAfterBreak="0">
     <w:nsid w:val="245A501C"/>
     <w:multiLevelType w:val="hybridMultilevel"/>
     <w:tmpl w:val="0E681FEC"/>
@@ -4260,7 +5990,7 @@
       </w:pPr>
     </w:lvl>
   </w:abstractNum>
-  <w:abstractNum w:abstractNumId="14" w15:restartNumberingAfterBreak="0">
+  <w:abstractNum w:abstractNumId="18" w15:restartNumberingAfterBreak="0">
     <w:nsid w:val="246042B4"/>
     <w:multiLevelType w:val="hybridMultilevel"/>
     <w:tmpl w:val="8496E028"/>
@@ -4373,7 +6103,7 @@
       </w:rPr>
     </w:lvl>
   </w:abstractNum>
-  <w:abstractNum w:abstractNumId="15" w15:restartNumberingAfterBreak="0">
+  <w:abstractNum w:abstractNumId="19" w15:restartNumberingAfterBreak="0">
     <w:nsid w:val="28446F04"/>
     <w:multiLevelType w:val="hybridMultilevel"/>
     <w:tmpl w:val="C78CCDE2"/>
@@ -4462,7 +6192,7 @@
       </w:pPr>
     </w:lvl>
   </w:abstractNum>
-  <w:abstractNum w:abstractNumId="16" w15:restartNumberingAfterBreak="0">
+  <w:abstractNum w:abstractNumId="20" w15:restartNumberingAfterBreak="0">
     <w:nsid w:val="32036CE0"/>
     <w:multiLevelType w:val="hybridMultilevel"/>
     <w:tmpl w:val="A704C338"/>
@@ -4551,7 +6281,7 @@
       </w:pPr>
     </w:lvl>
   </w:abstractNum>
-  <w:abstractNum w:abstractNumId="17" w15:restartNumberingAfterBreak="0">
+  <w:abstractNum w:abstractNumId="21" w15:restartNumberingAfterBreak="0">
     <w:nsid w:val="396F1E33"/>
     <w:multiLevelType w:val="hybridMultilevel"/>
     <w:tmpl w:val="3704E778"/>
@@ -4640,7 +6370,7 @@
       </w:pPr>
     </w:lvl>
   </w:abstractNum>
-  <w:abstractNum w:abstractNumId="18" w15:restartNumberingAfterBreak="0">
+  <w:abstractNum w:abstractNumId="22" w15:restartNumberingAfterBreak="0">
     <w:nsid w:val="3A6B633B"/>
     <w:multiLevelType w:val="hybridMultilevel"/>
     <w:tmpl w:val="C78CCDE2"/>
@@ -4729,7 +6459,7 @@
       </w:pPr>
     </w:lvl>
   </w:abstractNum>
-  <w:abstractNum w:abstractNumId="19" w15:restartNumberingAfterBreak="0">
+  <w:abstractNum w:abstractNumId="23" w15:restartNumberingAfterBreak="0">
     <w:nsid w:val="3B777710"/>
     <w:multiLevelType w:val="hybridMultilevel"/>
     <w:tmpl w:val="9CB65D00"/>
@@ -4818,7 +6548,7 @@
       </w:pPr>
     </w:lvl>
   </w:abstractNum>
-  <w:abstractNum w:abstractNumId="20" w15:restartNumberingAfterBreak="0">
+  <w:abstractNum w:abstractNumId="24" w15:restartNumberingAfterBreak="0">
     <w:nsid w:val="3F0B52D5"/>
     <w:multiLevelType w:val="hybridMultilevel"/>
     <w:tmpl w:val="E5C8E908"/>
@@ -4907,7 +6637,7 @@
       </w:pPr>
     </w:lvl>
   </w:abstractNum>
-  <w:abstractNum w:abstractNumId="21" w15:restartNumberingAfterBreak="0">
+  <w:abstractNum w:abstractNumId="25" w15:restartNumberingAfterBreak="0">
     <w:nsid w:val="45602A6B"/>
     <w:multiLevelType w:val="hybridMultilevel"/>
     <w:tmpl w:val="FB6AB67C"/>
@@ -4993,7 +6723,7 @@
       </w:pPr>
     </w:lvl>
   </w:abstractNum>
-  <w:abstractNum w:abstractNumId="22" w15:restartNumberingAfterBreak="0">
+  <w:abstractNum w:abstractNumId="26" w15:restartNumberingAfterBreak="0">
     <w:nsid w:val="46335C31"/>
     <w:multiLevelType w:val="hybridMultilevel"/>
     <w:tmpl w:val="3704E778"/>
@@ -5082,7 +6812,96 @@
       </w:pPr>
     </w:lvl>
   </w:abstractNum>
-  <w:abstractNum w:abstractNumId="23" w15:restartNumberingAfterBreak="0">
+  <w:abstractNum w:abstractNumId="27" w15:restartNumberingAfterBreak="0">
+    <w:nsid w:val="472F109E"/>
+    <w:multiLevelType w:val="hybridMultilevel"/>
+    <w:tmpl w:val="5D645C4C"/>
+    <w:lvl w:ilvl="0" w:tplc="FFFFFFFF">
+      <w:start w:val="1"/>
+      <w:numFmt w:val="decimal"/>
+      <w:lvlText w:val="%1."/>
+      <w:lvlJc w:val="left"/>
+      <w:pPr>
+        <w:ind w:left="720" w:hanging="360"/>
+      </w:pPr>
+      <w:rPr>
+        <w:rFonts w:hint="default"/>
+      </w:rPr>
+    </w:lvl>
+    <w:lvl w:ilvl="1" w:tplc="0C0A0019" w:tentative="1">
+      <w:start w:val="1"/>
+      <w:numFmt w:val="lowerLetter"/>
+      <w:lvlText w:val="%2."/>
+      <w:lvlJc w:val="left"/>
+      <w:pPr>
+        <w:ind w:left="1440" w:hanging="360"/>
+      </w:pPr>
+    </w:lvl>
+    <w:lvl w:ilvl="2" w:tplc="0C0A001B" w:tentative="1">
+      <w:start w:val="1"/>
+      <w:numFmt w:val="lowerRoman"/>
+      <w:lvlText w:val="%3."/>
+      <w:lvlJc w:val="right"/>
+      <w:pPr>
+        <w:ind w:left="2160" w:hanging="180"/>
+      </w:pPr>
+    </w:lvl>
+    <w:lvl w:ilvl="3" w:tplc="0C0A000F" w:tentative="1">
+      <w:start w:val="1"/>
+      <w:numFmt w:val="decimal"/>
+      <w:lvlText w:val="%4."/>
+      <w:lvlJc w:val="left"/>
+      <w:pPr>
+        <w:ind w:left="2880" w:hanging="360"/>
+      </w:pPr>
+    </w:lvl>
+    <w:lvl w:ilvl="4" w:tplc="0C0A0019" w:tentative="1">
+      <w:start w:val="1"/>
+      <w:numFmt w:val="lowerLetter"/>
+      <w:lvlText w:val="%5."/>
+      <w:lvlJc w:val="left"/>
+      <w:pPr>
+        <w:ind w:left="3600" w:hanging="360"/>
+      </w:pPr>
+    </w:lvl>
+    <w:lvl w:ilvl="5" w:tplc="0C0A001B" w:tentative="1">
+      <w:start w:val="1"/>
+      <w:numFmt w:val="lowerRoman"/>
+      <w:lvlText w:val="%6."/>
+      <w:lvlJc w:val="right"/>
+      <w:pPr>
+        <w:ind w:left="4320" w:hanging="180"/>
+      </w:pPr>
+    </w:lvl>
+    <w:lvl w:ilvl="6" w:tplc="0C0A000F" w:tentative="1">
+      <w:start w:val="1"/>
+      <w:numFmt w:val="decimal"/>
+      <w:lvlText w:val="%7."/>
+      <w:lvlJc w:val="left"/>
+      <w:pPr>
+        <w:ind w:left="5040" w:hanging="360"/>
+      </w:pPr>
+    </w:lvl>
+    <w:lvl w:ilvl="7" w:tplc="0C0A0019" w:tentative="1">
+      <w:start w:val="1"/>
+      <w:numFmt w:val="lowerLetter"/>
+      <w:lvlText w:val="%8."/>
+      <w:lvlJc w:val="left"/>
+      <w:pPr>
+        <w:ind w:left="5760" w:hanging="360"/>
+      </w:pPr>
+    </w:lvl>
+    <w:lvl w:ilvl="8" w:tplc="0C0A001B" w:tentative="1">
+      <w:start w:val="1"/>
+      <w:numFmt w:val="lowerRoman"/>
+      <w:lvlText w:val="%9."/>
+      <w:lvlJc w:val="right"/>
+      <w:pPr>
+        <w:ind w:left="6480" w:hanging="180"/>
+      </w:pPr>
+    </w:lvl>
+  </w:abstractNum>
+  <w:abstractNum w:abstractNumId="28" w15:restartNumberingAfterBreak="0">
     <w:nsid w:val="48036643"/>
     <w:multiLevelType w:val="hybridMultilevel"/>
     <w:tmpl w:val="CF8E17D6"/>
@@ -5171,7 +6990,96 @@
       </w:pPr>
     </w:lvl>
   </w:abstractNum>
-  <w:abstractNum w:abstractNumId="24" w15:restartNumberingAfterBreak="0">
+  <w:abstractNum w:abstractNumId="29" w15:restartNumberingAfterBreak="0">
+    <w:nsid w:val="490B7987"/>
+    <w:multiLevelType w:val="hybridMultilevel"/>
+    <w:tmpl w:val="47747B36"/>
+    <w:lvl w:ilvl="0" w:tplc="FFFFFFFF">
+      <w:start w:val="1"/>
+      <w:numFmt w:val="decimal"/>
+      <w:lvlText w:val="%1."/>
+      <w:lvlJc w:val="left"/>
+      <w:pPr>
+        <w:ind w:left="720" w:hanging="360"/>
+      </w:pPr>
+      <w:rPr>
+        <w:rFonts w:hint="default"/>
+      </w:rPr>
+    </w:lvl>
+    <w:lvl w:ilvl="1" w:tplc="FFFFFFFF" w:tentative="1">
+      <w:start w:val="1"/>
+      <w:numFmt w:val="lowerLetter"/>
+      <w:lvlText w:val="%2."/>
+      <w:lvlJc w:val="left"/>
+      <w:pPr>
+        <w:ind w:left="1440" w:hanging="360"/>
+      </w:pPr>
+    </w:lvl>
+    <w:lvl w:ilvl="2" w:tplc="FFFFFFFF" w:tentative="1">
+      <w:start w:val="1"/>
+      <w:numFmt w:val="lowerRoman"/>
+      <w:lvlText w:val="%3."/>
+      <w:lvlJc w:val="right"/>
+      <w:pPr>
+        <w:ind w:left="2160" w:hanging="180"/>
+      </w:pPr>
+    </w:lvl>
+    <w:lvl w:ilvl="3" w:tplc="FFFFFFFF" w:tentative="1">
+      <w:start w:val="1"/>
+      <w:numFmt w:val="decimal"/>
+      <w:lvlText w:val="%4."/>
+      <w:lvlJc w:val="left"/>
+      <w:pPr>
+        <w:ind w:left="2880" w:hanging="360"/>
+      </w:pPr>
+    </w:lvl>
+    <w:lvl w:ilvl="4" w:tplc="FFFFFFFF" w:tentative="1">
+      <w:start w:val="1"/>
+      <w:numFmt w:val="lowerLetter"/>
+      <w:lvlText w:val="%5."/>
+      <w:lvlJc w:val="left"/>
+      <w:pPr>
+        <w:ind w:left="3600" w:hanging="360"/>
+      </w:pPr>
+    </w:lvl>
+    <w:lvl w:ilvl="5" w:tplc="FFFFFFFF" w:tentative="1">
+      <w:start w:val="1"/>
+      <w:numFmt w:val="lowerRoman"/>
+      <w:lvlText w:val="%6."/>
+      <w:lvlJc w:val="right"/>
+      <w:pPr>
+        <w:ind w:left="4320" w:hanging="180"/>
+      </w:pPr>
+    </w:lvl>
+    <w:lvl w:ilvl="6" w:tplc="FFFFFFFF" w:tentative="1">
+      <w:start w:val="1"/>
+      <w:numFmt w:val="decimal"/>
+      <w:lvlText w:val="%7."/>
+      <w:lvlJc w:val="left"/>
+      <w:pPr>
+        <w:ind w:left="5040" w:hanging="360"/>
+      </w:pPr>
+    </w:lvl>
+    <w:lvl w:ilvl="7" w:tplc="FFFFFFFF" w:tentative="1">
+      <w:start w:val="1"/>
+      <w:numFmt w:val="lowerLetter"/>
+      <w:lvlText w:val="%8."/>
+      <w:lvlJc w:val="left"/>
+      <w:pPr>
+        <w:ind w:left="5760" w:hanging="360"/>
+      </w:pPr>
+    </w:lvl>
+    <w:lvl w:ilvl="8" w:tplc="FFFFFFFF" w:tentative="1">
+      <w:start w:val="1"/>
+      <w:numFmt w:val="lowerRoman"/>
+      <w:lvlText w:val="%9."/>
+      <w:lvlJc w:val="right"/>
+      <w:pPr>
+        <w:ind w:left="6480" w:hanging="180"/>
+      </w:pPr>
+    </w:lvl>
+  </w:abstractNum>
+  <w:abstractNum w:abstractNumId="30" w15:restartNumberingAfterBreak="0">
     <w:nsid w:val="4FCE6458"/>
     <w:multiLevelType w:val="hybridMultilevel"/>
     <w:tmpl w:val="6BDC69D8"/>
@@ -5260,7 +7168,7 @@
       </w:pPr>
     </w:lvl>
   </w:abstractNum>
-  <w:abstractNum w:abstractNumId="25" w15:restartNumberingAfterBreak="0">
+  <w:abstractNum w:abstractNumId="31" w15:restartNumberingAfterBreak="0">
     <w:nsid w:val="50330460"/>
     <w:multiLevelType w:val="hybridMultilevel"/>
     <w:tmpl w:val="3704E778"/>
@@ -5349,7 +7257,185 @@
       </w:pPr>
     </w:lvl>
   </w:abstractNum>
-  <w:abstractNum w:abstractNumId="26" w15:restartNumberingAfterBreak="0">
+  <w:abstractNum w:abstractNumId="32" w15:restartNumberingAfterBreak="0">
+    <w:nsid w:val="598A3F28"/>
+    <w:multiLevelType w:val="hybridMultilevel"/>
+    <w:tmpl w:val="CF8E17D6"/>
+    <w:lvl w:ilvl="0" w:tplc="FFFFFFFF">
+      <w:start w:val="1"/>
+      <w:numFmt w:val="decimal"/>
+      <w:lvlText w:val="%1."/>
+      <w:lvlJc w:val="left"/>
+      <w:pPr>
+        <w:ind w:left="720" w:hanging="360"/>
+      </w:pPr>
+      <w:rPr>
+        <w:rFonts w:hint="default"/>
+      </w:rPr>
+    </w:lvl>
+    <w:lvl w:ilvl="1" w:tplc="FFFFFFFF" w:tentative="1">
+      <w:start w:val="1"/>
+      <w:numFmt w:val="lowerLetter"/>
+      <w:lvlText w:val="%2."/>
+      <w:lvlJc w:val="left"/>
+      <w:pPr>
+        <w:ind w:left="1440" w:hanging="360"/>
+      </w:pPr>
+    </w:lvl>
+    <w:lvl w:ilvl="2" w:tplc="FFFFFFFF" w:tentative="1">
+      <w:start w:val="1"/>
+      <w:numFmt w:val="lowerRoman"/>
+      <w:lvlText w:val="%3."/>
+      <w:lvlJc w:val="right"/>
+      <w:pPr>
+        <w:ind w:left="2160" w:hanging="180"/>
+      </w:pPr>
+    </w:lvl>
+    <w:lvl w:ilvl="3" w:tplc="FFFFFFFF" w:tentative="1">
+      <w:start w:val="1"/>
+      <w:numFmt w:val="decimal"/>
+      <w:lvlText w:val="%4."/>
+      <w:lvlJc w:val="left"/>
+      <w:pPr>
+        <w:ind w:left="2880" w:hanging="360"/>
+      </w:pPr>
+    </w:lvl>
+    <w:lvl w:ilvl="4" w:tplc="FFFFFFFF" w:tentative="1">
+      <w:start w:val="1"/>
+      <w:numFmt w:val="lowerLetter"/>
+      <w:lvlText w:val="%5."/>
+      <w:lvlJc w:val="left"/>
+      <w:pPr>
+        <w:ind w:left="3600" w:hanging="360"/>
+      </w:pPr>
+    </w:lvl>
+    <w:lvl w:ilvl="5" w:tplc="FFFFFFFF" w:tentative="1">
+      <w:start w:val="1"/>
+      <w:numFmt w:val="lowerRoman"/>
+      <w:lvlText w:val="%6."/>
+      <w:lvlJc w:val="right"/>
+      <w:pPr>
+        <w:ind w:left="4320" w:hanging="180"/>
+      </w:pPr>
+    </w:lvl>
+    <w:lvl w:ilvl="6" w:tplc="FFFFFFFF" w:tentative="1">
+      <w:start w:val="1"/>
+      <w:numFmt w:val="decimal"/>
+      <w:lvlText w:val="%7."/>
+      <w:lvlJc w:val="left"/>
+      <w:pPr>
+        <w:ind w:left="5040" w:hanging="360"/>
+      </w:pPr>
+    </w:lvl>
+    <w:lvl w:ilvl="7" w:tplc="FFFFFFFF" w:tentative="1">
+      <w:start w:val="1"/>
+      <w:numFmt w:val="lowerLetter"/>
+      <w:lvlText w:val="%8."/>
+      <w:lvlJc w:val="left"/>
+      <w:pPr>
+        <w:ind w:left="5760" w:hanging="360"/>
+      </w:pPr>
+    </w:lvl>
+    <w:lvl w:ilvl="8" w:tplc="FFFFFFFF" w:tentative="1">
+      <w:start w:val="1"/>
+      <w:numFmt w:val="lowerRoman"/>
+      <w:lvlText w:val="%9."/>
+      <w:lvlJc w:val="right"/>
+      <w:pPr>
+        <w:ind w:left="6480" w:hanging="180"/>
+      </w:pPr>
+    </w:lvl>
+  </w:abstractNum>
+  <w:abstractNum w:abstractNumId="33" w15:restartNumberingAfterBreak="0">
+    <w:nsid w:val="5FB73640"/>
+    <w:multiLevelType w:val="hybridMultilevel"/>
+    <w:tmpl w:val="47747B36"/>
+    <w:lvl w:ilvl="0" w:tplc="FFFFFFFF">
+      <w:start w:val="1"/>
+      <w:numFmt w:val="decimal"/>
+      <w:lvlText w:val="%1."/>
+      <w:lvlJc w:val="left"/>
+      <w:pPr>
+        <w:ind w:left="720" w:hanging="360"/>
+      </w:pPr>
+      <w:rPr>
+        <w:rFonts w:hint="default"/>
+      </w:rPr>
+    </w:lvl>
+    <w:lvl w:ilvl="1" w:tplc="FFFFFFFF" w:tentative="1">
+      <w:start w:val="1"/>
+      <w:numFmt w:val="lowerLetter"/>
+      <w:lvlText w:val="%2."/>
+      <w:lvlJc w:val="left"/>
+      <w:pPr>
+        <w:ind w:left="1440" w:hanging="360"/>
+      </w:pPr>
+    </w:lvl>
+    <w:lvl w:ilvl="2" w:tplc="FFFFFFFF" w:tentative="1">
+      <w:start w:val="1"/>
+      <w:numFmt w:val="lowerRoman"/>
+      <w:lvlText w:val="%3."/>
+      <w:lvlJc w:val="right"/>
+      <w:pPr>
+        <w:ind w:left="2160" w:hanging="180"/>
+      </w:pPr>
+    </w:lvl>
+    <w:lvl w:ilvl="3" w:tplc="FFFFFFFF" w:tentative="1">
+      <w:start w:val="1"/>
+      <w:numFmt w:val="decimal"/>
+      <w:lvlText w:val="%4."/>
+      <w:lvlJc w:val="left"/>
+      <w:pPr>
+        <w:ind w:left="2880" w:hanging="360"/>
+      </w:pPr>
+    </w:lvl>
+    <w:lvl w:ilvl="4" w:tplc="FFFFFFFF" w:tentative="1">
+      <w:start w:val="1"/>
+      <w:numFmt w:val="lowerLetter"/>
+      <w:lvlText w:val="%5."/>
+      <w:lvlJc w:val="left"/>
+      <w:pPr>
+        <w:ind w:left="3600" w:hanging="360"/>
+      </w:pPr>
+    </w:lvl>
+    <w:lvl w:ilvl="5" w:tplc="FFFFFFFF" w:tentative="1">
+      <w:start w:val="1"/>
+      <w:numFmt w:val="lowerRoman"/>
+      <w:lvlText w:val="%6."/>
+      <w:lvlJc w:val="right"/>
+      <w:pPr>
+        <w:ind w:left="4320" w:hanging="180"/>
+      </w:pPr>
+    </w:lvl>
+    <w:lvl w:ilvl="6" w:tplc="FFFFFFFF" w:tentative="1">
+      <w:start w:val="1"/>
+      <w:numFmt w:val="decimal"/>
+      <w:lvlText w:val="%7."/>
+      <w:lvlJc w:val="left"/>
+      <w:pPr>
+        <w:ind w:left="5040" w:hanging="360"/>
+      </w:pPr>
+    </w:lvl>
+    <w:lvl w:ilvl="7" w:tplc="FFFFFFFF" w:tentative="1">
+      <w:start w:val="1"/>
+      <w:numFmt w:val="lowerLetter"/>
+      <w:lvlText w:val="%8."/>
+      <w:lvlJc w:val="left"/>
+      <w:pPr>
+        <w:ind w:left="5760" w:hanging="360"/>
+      </w:pPr>
+    </w:lvl>
+    <w:lvl w:ilvl="8" w:tplc="FFFFFFFF" w:tentative="1">
+      <w:start w:val="1"/>
+      <w:numFmt w:val="lowerRoman"/>
+      <w:lvlText w:val="%9."/>
+      <w:lvlJc w:val="right"/>
+      <w:pPr>
+        <w:ind w:left="6480" w:hanging="180"/>
+      </w:pPr>
+    </w:lvl>
+  </w:abstractNum>
+  <w:abstractNum w:abstractNumId="34" w15:restartNumberingAfterBreak="0">
     <w:nsid w:val="5FDE06FA"/>
     <w:multiLevelType w:val="hybridMultilevel"/>
     <w:tmpl w:val="2FCC281C"/>
@@ -5438,7 +7524,541 @@
       </w:pPr>
     </w:lvl>
   </w:abstractNum>
-  <w:abstractNum w:abstractNumId="27" w15:restartNumberingAfterBreak="0">
+  <w:abstractNum w:abstractNumId="35" w15:restartNumberingAfterBreak="0">
+    <w:nsid w:val="62D01892"/>
+    <w:multiLevelType w:val="hybridMultilevel"/>
+    <w:tmpl w:val="67943264"/>
+    <w:lvl w:ilvl="0" w:tplc="FFFFFFFF">
+      <w:start w:val="1"/>
+      <w:numFmt w:val="decimal"/>
+      <w:lvlText w:val="%1."/>
+      <w:lvlJc w:val="left"/>
+      <w:pPr>
+        <w:ind w:left="720" w:hanging="360"/>
+      </w:pPr>
+      <w:rPr>
+        <w:rFonts w:hint="default"/>
+      </w:rPr>
+    </w:lvl>
+    <w:lvl w:ilvl="1" w:tplc="FFFFFFFF" w:tentative="1">
+      <w:start w:val="1"/>
+      <w:numFmt w:val="lowerLetter"/>
+      <w:lvlText w:val="%2."/>
+      <w:lvlJc w:val="left"/>
+      <w:pPr>
+        <w:ind w:left="1440" w:hanging="360"/>
+      </w:pPr>
+    </w:lvl>
+    <w:lvl w:ilvl="2" w:tplc="FFFFFFFF" w:tentative="1">
+      <w:start w:val="1"/>
+      <w:numFmt w:val="lowerRoman"/>
+      <w:lvlText w:val="%3."/>
+      <w:lvlJc w:val="right"/>
+      <w:pPr>
+        <w:ind w:left="2160" w:hanging="180"/>
+      </w:pPr>
+    </w:lvl>
+    <w:lvl w:ilvl="3" w:tplc="FFFFFFFF" w:tentative="1">
+      <w:start w:val="1"/>
+      <w:numFmt w:val="decimal"/>
+      <w:lvlText w:val="%4."/>
+      <w:lvlJc w:val="left"/>
+      <w:pPr>
+        <w:ind w:left="2880" w:hanging="360"/>
+      </w:pPr>
+    </w:lvl>
+    <w:lvl w:ilvl="4" w:tplc="FFFFFFFF" w:tentative="1">
+      <w:start w:val="1"/>
+      <w:numFmt w:val="lowerLetter"/>
+      <w:lvlText w:val="%5."/>
+      <w:lvlJc w:val="left"/>
+      <w:pPr>
+        <w:ind w:left="3600" w:hanging="360"/>
+      </w:pPr>
+    </w:lvl>
+    <w:lvl w:ilvl="5" w:tplc="FFFFFFFF" w:tentative="1">
+      <w:start w:val="1"/>
+      <w:numFmt w:val="lowerRoman"/>
+      <w:lvlText w:val="%6."/>
+      <w:lvlJc w:val="right"/>
+      <w:pPr>
+        <w:ind w:left="4320" w:hanging="180"/>
+      </w:pPr>
+    </w:lvl>
+    <w:lvl w:ilvl="6" w:tplc="FFFFFFFF" w:tentative="1">
+      <w:start w:val="1"/>
+      <w:numFmt w:val="decimal"/>
+      <w:lvlText w:val="%7."/>
+      <w:lvlJc w:val="left"/>
+      <w:pPr>
+        <w:ind w:left="5040" w:hanging="360"/>
+      </w:pPr>
+    </w:lvl>
+    <w:lvl w:ilvl="7" w:tplc="FFFFFFFF" w:tentative="1">
+      <w:start w:val="1"/>
+      <w:numFmt w:val="lowerLetter"/>
+      <w:lvlText w:val="%8."/>
+      <w:lvlJc w:val="left"/>
+      <w:pPr>
+        <w:ind w:left="5760" w:hanging="360"/>
+      </w:pPr>
+    </w:lvl>
+    <w:lvl w:ilvl="8" w:tplc="FFFFFFFF" w:tentative="1">
+      <w:start w:val="1"/>
+      <w:numFmt w:val="lowerRoman"/>
+      <w:lvlText w:val="%9."/>
+      <w:lvlJc w:val="right"/>
+      <w:pPr>
+        <w:ind w:left="6480" w:hanging="180"/>
+      </w:pPr>
+    </w:lvl>
+  </w:abstractNum>
+  <w:abstractNum w:abstractNumId="36" w15:restartNumberingAfterBreak="0">
+    <w:nsid w:val="64567862"/>
+    <w:multiLevelType w:val="hybridMultilevel"/>
+    <w:tmpl w:val="67943264"/>
+    <w:lvl w:ilvl="0" w:tplc="FFFFFFFF">
+      <w:start w:val="1"/>
+      <w:numFmt w:val="decimal"/>
+      <w:lvlText w:val="%1."/>
+      <w:lvlJc w:val="left"/>
+      <w:pPr>
+        <w:ind w:left="720" w:hanging="360"/>
+      </w:pPr>
+      <w:rPr>
+        <w:rFonts w:hint="default"/>
+      </w:rPr>
+    </w:lvl>
+    <w:lvl w:ilvl="1" w:tplc="FFFFFFFF" w:tentative="1">
+      <w:start w:val="1"/>
+      <w:numFmt w:val="lowerLetter"/>
+      <w:lvlText w:val="%2."/>
+      <w:lvlJc w:val="left"/>
+      <w:pPr>
+        <w:ind w:left="1440" w:hanging="360"/>
+      </w:pPr>
+    </w:lvl>
+    <w:lvl w:ilvl="2" w:tplc="FFFFFFFF" w:tentative="1">
+      <w:start w:val="1"/>
+      <w:numFmt w:val="lowerRoman"/>
+      <w:lvlText w:val="%3."/>
+      <w:lvlJc w:val="right"/>
+      <w:pPr>
+        <w:ind w:left="2160" w:hanging="180"/>
+      </w:pPr>
+    </w:lvl>
+    <w:lvl w:ilvl="3" w:tplc="FFFFFFFF" w:tentative="1">
+      <w:start w:val="1"/>
+      <w:numFmt w:val="decimal"/>
+      <w:lvlText w:val="%4."/>
+      <w:lvlJc w:val="left"/>
+      <w:pPr>
+        <w:ind w:left="2880" w:hanging="360"/>
+      </w:pPr>
+    </w:lvl>
+    <w:lvl w:ilvl="4" w:tplc="FFFFFFFF" w:tentative="1">
+      <w:start w:val="1"/>
+      <w:numFmt w:val="lowerLetter"/>
+      <w:lvlText w:val="%5."/>
+      <w:lvlJc w:val="left"/>
+      <w:pPr>
+        <w:ind w:left="3600" w:hanging="360"/>
+      </w:pPr>
+    </w:lvl>
+    <w:lvl w:ilvl="5" w:tplc="FFFFFFFF" w:tentative="1">
+      <w:start w:val="1"/>
+      <w:numFmt w:val="lowerRoman"/>
+      <w:lvlText w:val="%6."/>
+      <w:lvlJc w:val="right"/>
+      <w:pPr>
+        <w:ind w:left="4320" w:hanging="180"/>
+      </w:pPr>
+    </w:lvl>
+    <w:lvl w:ilvl="6" w:tplc="FFFFFFFF" w:tentative="1">
+      <w:start w:val="1"/>
+      <w:numFmt w:val="decimal"/>
+      <w:lvlText w:val="%7."/>
+      <w:lvlJc w:val="left"/>
+      <w:pPr>
+        <w:ind w:left="5040" w:hanging="360"/>
+      </w:pPr>
+    </w:lvl>
+    <w:lvl w:ilvl="7" w:tplc="FFFFFFFF" w:tentative="1">
+      <w:start w:val="1"/>
+      <w:numFmt w:val="lowerLetter"/>
+      <w:lvlText w:val="%8."/>
+      <w:lvlJc w:val="left"/>
+      <w:pPr>
+        <w:ind w:left="5760" w:hanging="360"/>
+      </w:pPr>
+    </w:lvl>
+    <w:lvl w:ilvl="8" w:tplc="FFFFFFFF" w:tentative="1">
+      <w:start w:val="1"/>
+      <w:numFmt w:val="lowerRoman"/>
+      <w:lvlText w:val="%9."/>
+      <w:lvlJc w:val="right"/>
+      <w:pPr>
+        <w:ind w:left="6480" w:hanging="180"/>
+      </w:pPr>
+    </w:lvl>
+  </w:abstractNum>
+  <w:abstractNum w:abstractNumId="37" w15:restartNumberingAfterBreak="0">
+    <w:nsid w:val="65EA07CF"/>
+    <w:multiLevelType w:val="hybridMultilevel"/>
+    <w:tmpl w:val="47747B36"/>
+    <w:lvl w:ilvl="0" w:tplc="FFFFFFFF">
+      <w:start w:val="1"/>
+      <w:numFmt w:val="decimal"/>
+      <w:lvlText w:val="%1."/>
+      <w:lvlJc w:val="left"/>
+      <w:pPr>
+        <w:ind w:left="720" w:hanging="360"/>
+      </w:pPr>
+      <w:rPr>
+        <w:rFonts w:hint="default"/>
+      </w:rPr>
+    </w:lvl>
+    <w:lvl w:ilvl="1" w:tplc="FFFFFFFF" w:tentative="1">
+      <w:start w:val="1"/>
+      <w:numFmt w:val="lowerLetter"/>
+      <w:lvlText w:val="%2."/>
+      <w:lvlJc w:val="left"/>
+      <w:pPr>
+        <w:ind w:left="1440" w:hanging="360"/>
+      </w:pPr>
+    </w:lvl>
+    <w:lvl w:ilvl="2" w:tplc="FFFFFFFF" w:tentative="1">
+      <w:start w:val="1"/>
+      <w:numFmt w:val="lowerRoman"/>
+      <w:lvlText w:val="%3."/>
+      <w:lvlJc w:val="right"/>
+      <w:pPr>
+        <w:ind w:left="2160" w:hanging="180"/>
+      </w:pPr>
+    </w:lvl>
+    <w:lvl w:ilvl="3" w:tplc="FFFFFFFF" w:tentative="1">
+      <w:start w:val="1"/>
+      <w:numFmt w:val="decimal"/>
+      <w:lvlText w:val="%4."/>
+      <w:lvlJc w:val="left"/>
+      <w:pPr>
+        <w:ind w:left="2880" w:hanging="360"/>
+      </w:pPr>
+    </w:lvl>
+    <w:lvl w:ilvl="4" w:tplc="FFFFFFFF" w:tentative="1">
+      <w:start w:val="1"/>
+      <w:numFmt w:val="lowerLetter"/>
+      <w:lvlText w:val="%5."/>
+      <w:lvlJc w:val="left"/>
+      <w:pPr>
+        <w:ind w:left="3600" w:hanging="360"/>
+      </w:pPr>
+    </w:lvl>
+    <w:lvl w:ilvl="5" w:tplc="FFFFFFFF" w:tentative="1">
+      <w:start w:val="1"/>
+      <w:numFmt w:val="lowerRoman"/>
+      <w:lvlText w:val="%6."/>
+      <w:lvlJc w:val="right"/>
+      <w:pPr>
+        <w:ind w:left="4320" w:hanging="180"/>
+      </w:pPr>
+    </w:lvl>
+    <w:lvl w:ilvl="6" w:tplc="FFFFFFFF" w:tentative="1">
+      <w:start w:val="1"/>
+      <w:numFmt w:val="decimal"/>
+      <w:lvlText w:val="%7."/>
+      <w:lvlJc w:val="left"/>
+      <w:pPr>
+        <w:ind w:left="5040" w:hanging="360"/>
+      </w:pPr>
+    </w:lvl>
+    <w:lvl w:ilvl="7" w:tplc="FFFFFFFF" w:tentative="1">
+      <w:start w:val="1"/>
+      <w:numFmt w:val="lowerLetter"/>
+      <w:lvlText w:val="%8."/>
+      <w:lvlJc w:val="left"/>
+      <w:pPr>
+        <w:ind w:left="5760" w:hanging="360"/>
+      </w:pPr>
+    </w:lvl>
+    <w:lvl w:ilvl="8" w:tplc="FFFFFFFF" w:tentative="1">
+      <w:start w:val="1"/>
+      <w:numFmt w:val="lowerRoman"/>
+      <w:lvlText w:val="%9."/>
+      <w:lvlJc w:val="right"/>
+      <w:pPr>
+        <w:ind w:left="6480" w:hanging="180"/>
+      </w:pPr>
+    </w:lvl>
+  </w:abstractNum>
+  <w:abstractNum w:abstractNumId="38" w15:restartNumberingAfterBreak="0">
+    <w:nsid w:val="65F23B97"/>
+    <w:multiLevelType w:val="hybridMultilevel"/>
+    <w:tmpl w:val="47747B36"/>
+    <w:lvl w:ilvl="0" w:tplc="FFFFFFFF">
+      <w:start w:val="1"/>
+      <w:numFmt w:val="decimal"/>
+      <w:lvlText w:val="%1."/>
+      <w:lvlJc w:val="left"/>
+      <w:pPr>
+        <w:ind w:left="720" w:hanging="360"/>
+      </w:pPr>
+      <w:rPr>
+        <w:rFonts w:hint="default"/>
+      </w:rPr>
+    </w:lvl>
+    <w:lvl w:ilvl="1" w:tplc="FFFFFFFF" w:tentative="1">
+      <w:start w:val="1"/>
+      <w:numFmt w:val="lowerLetter"/>
+      <w:lvlText w:val="%2."/>
+      <w:lvlJc w:val="left"/>
+      <w:pPr>
+        <w:ind w:left="1440" w:hanging="360"/>
+      </w:pPr>
+    </w:lvl>
+    <w:lvl w:ilvl="2" w:tplc="FFFFFFFF" w:tentative="1">
+      <w:start w:val="1"/>
+      <w:numFmt w:val="lowerRoman"/>
+      <w:lvlText w:val="%3."/>
+      <w:lvlJc w:val="right"/>
+      <w:pPr>
+        <w:ind w:left="2160" w:hanging="180"/>
+      </w:pPr>
+    </w:lvl>
+    <w:lvl w:ilvl="3" w:tplc="FFFFFFFF" w:tentative="1">
+      <w:start w:val="1"/>
+      <w:numFmt w:val="decimal"/>
+      <w:lvlText w:val="%4."/>
+      <w:lvlJc w:val="left"/>
+      <w:pPr>
+        <w:ind w:left="2880" w:hanging="360"/>
+      </w:pPr>
+    </w:lvl>
+    <w:lvl w:ilvl="4" w:tplc="FFFFFFFF" w:tentative="1">
+      <w:start w:val="1"/>
+      <w:numFmt w:val="lowerLetter"/>
+      <w:lvlText w:val="%5."/>
+      <w:lvlJc w:val="left"/>
+      <w:pPr>
+        <w:ind w:left="3600" w:hanging="360"/>
+      </w:pPr>
+    </w:lvl>
+    <w:lvl w:ilvl="5" w:tplc="FFFFFFFF" w:tentative="1">
+      <w:start w:val="1"/>
+      <w:numFmt w:val="lowerRoman"/>
+      <w:lvlText w:val="%6."/>
+      <w:lvlJc w:val="right"/>
+      <w:pPr>
+        <w:ind w:left="4320" w:hanging="180"/>
+      </w:pPr>
+    </w:lvl>
+    <w:lvl w:ilvl="6" w:tplc="FFFFFFFF" w:tentative="1">
+      <w:start w:val="1"/>
+      <w:numFmt w:val="decimal"/>
+      <w:lvlText w:val="%7."/>
+      <w:lvlJc w:val="left"/>
+      <w:pPr>
+        <w:ind w:left="5040" w:hanging="360"/>
+      </w:pPr>
+    </w:lvl>
+    <w:lvl w:ilvl="7" w:tplc="FFFFFFFF" w:tentative="1">
+      <w:start w:val="1"/>
+      <w:numFmt w:val="lowerLetter"/>
+      <w:lvlText w:val="%8."/>
+      <w:lvlJc w:val="left"/>
+      <w:pPr>
+        <w:ind w:left="5760" w:hanging="360"/>
+      </w:pPr>
+    </w:lvl>
+    <w:lvl w:ilvl="8" w:tplc="FFFFFFFF" w:tentative="1">
+      <w:start w:val="1"/>
+      <w:numFmt w:val="lowerRoman"/>
+      <w:lvlText w:val="%9."/>
+      <w:lvlJc w:val="right"/>
+      <w:pPr>
+        <w:ind w:left="6480" w:hanging="180"/>
+      </w:pPr>
+    </w:lvl>
+  </w:abstractNum>
+  <w:abstractNum w:abstractNumId="39" w15:restartNumberingAfterBreak="0">
+    <w:nsid w:val="6B9B762A"/>
+    <w:multiLevelType w:val="hybridMultilevel"/>
+    <w:tmpl w:val="5D645C4C"/>
+    <w:lvl w:ilvl="0" w:tplc="FFFFFFFF">
+      <w:start w:val="1"/>
+      <w:numFmt w:val="decimal"/>
+      <w:lvlText w:val="%1."/>
+      <w:lvlJc w:val="left"/>
+      <w:pPr>
+        <w:ind w:left="720" w:hanging="360"/>
+      </w:pPr>
+      <w:rPr>
+        <w:rFonts w:hint="default"/>
+      </w:rPr>
+    </w:lvl>
+    <w:lvl w:ilvl="1" w:tplc="FFFFFFFF" w:tentative="1">
+      <w:start w:val="1"/>
+      <w:numFmt w:val="lowerLetter"/>
+      <w:lvlText w:val="%2."/>
+      <w:lvlJc w:val="left"/>
+      <w:pPr>
+        <w:ind w:left="1440" w:hanging="360"/>
+      </w:pPr>
+    </w:lvl>
+    <w:lvl w:ilvl="2" w:tplc="FFFFFFFF" w:tentative="1">
+      <w:start w:val="1"/>
+      <w:numFmt w:val="lowerRoman"/>
+      <w:lvlText w:val="%3."/>
+      <w:lvlJc w:val="right"/>
+      <w:pPr>
+        <w:ind w:left="2160" w:hanging="180"/>
+      </w:pPr>
+    </w:lvl>
+    <w:lvl w:ilvl="3" w:tplc="FFFFFFFF" w:tentative="1">
+      <w:start w:val="1"/>
+      <w:numFmt w:val="decimal"/>
+      <w:lvlText w:val="%4."/>
+      <w:lvlJc w:val="left"/>
+      <w:pPr>
+        <w:ind w:left="2880" w:hanging="360"/>
+      </w:pPr>
+    </w:lvl>
+    <w:lvl w:ilvl="4" w:tplc="FFFFFFFF" w:tentative="1">
+      <w:start w:val="1"/>
+      <w:numFmt w:val="lowerLetter"/>
+      <w:lvlText w:val="%5."/>
+      <w:lvlJc w:val="left"/>
+      <w:pPr>
+        <w:ind w:left="3600" w:hanging="360"/>
+      </w:pPr>
+    </w:lvl>
+    <w:lvl w:ilvl="5" w:tplc="FFFFFFFF" w:tentative="1">
+      <w:start w:val="1"/>
+      <w:numFmt w:val="lowerRoman"/>
+      <w:lvlText w:val="%6."/>
+      <w:lvlJc w:val="right"/>
+      <w:pPr>
+        <w:ind w:left="4320" w:hanging="180"/>
+      </w:pPr>
+    </w:lvl>
+    <w:lvl w:ilvl="6" w:tplc="FFFFFFFF" w:tentative="1">
+      <w:start w:val="1"/>
+      <w:numFmt w:val="decimal"/>
+      <w:lvlText w:val="%7."/>
+      <w:lvlJc w:val="left"/>
+      <w:pPr>
+        <w:ind w:left="5040" w:hanging="360"/>
+      </w:pPr>
+    </w:lvl>
+    <w:lvl w:ilvl="7" w:tplc="FFFFFFFF" w:tentative="1">
+      <w:start w:val="1"/>
+      <w:numFmt w:val="lowerLetter"/>
+      <w:lvlText w:val="%8."/>
+      <w:lvlJc w:val="left"/>
+      <w:pPr>
+        <w:ind w:left="5760" w:hanging="360"/>
+      </w:pPr>
+    </w:lvl>
+    <w:lvl w:ilvl="8" w:tplc="FFFFFFFF" w:tentative="1">
+      <w:start w:val="1"/>
+      <w:numFmt w:val="lowerRoman"/>
+      <w:lvlText w:val="%9."/>
+      <w:lvlJc w:val="right"/>
+      <w:pPr>
+        <w:ind w:left="6480" w:hanging="180"/>
+      </w:pPr>
+    </w:lvl>
+  </w:abstractNum>
+  <w:abstractNum w:abstractNumId="40" w15:restartNumberingAfterBreak="0">
+    <w:nsid w:val="6DEC37BB"/>
+    <w:multiLevelType w:val="hybridMultilevel"/>
+    <w:tmpl w:val="47747B36"/>
+    <w:lvl w:ilvl="0" w:tplc="FFFFFFFF">
+      <w:start w:val="1"/>
+      <w:numFmt w:val="decimal"/>
+      <w:lvlText w:val="%1."/>
+      <w:lvlJc w:val="left"/>
+      <w:pPr>
+        <w:ind w:left="720" w:hanging="360"/>
+      </w:pPr>
+      <w:rPr>
+        <w:rFonts w:hint="default"/>
+      </w:rPr>
+    </w:lvl>
+    <w:lvl w:ilvl="1" w:tplc="FFFFFFFF" w:tentative="1">
+      <w:start w:val="1"/>
+      <w:numFmt w:val="lowerLetter"/>
+      <w:lvlText w:val="%2."/>
+      <w:lvlJc w:val="left"/>
+      <w:pPr>
+        <w:ind w:left="1440" w:hanging="360"/>
+      </w:pPr>
+    </w:lvl>
+    <w:lvl w:ilvl="2" w:tplc="FFFFFFFF" w:tentative="1">
+      <w:start w:val="1"/>
+      <w:numFmt w:val="lowerRoman"/>
+      <w:lvlText w:val="%3."/>
+      <w:lvlJc w:val="right"/>
+      <w:pPr>
+        <w:ind w:left="2160" w:hanging="180"/>
+      </w:pPr>
+    </w:lvl>
+    <w:lvl w:ilvl="3" w:tplc="FFFFFFFF" w:tentative="1">
+      <w:start w:val="1"/>
+      <w:numFmt w:val="decimal"/>
+      <w:lvlText w:val="%4."/>
+      <w:lvlJc w:val="left"/>
+      <w:pPr>
+        <w:ind w:left="2880" w:hanging="360"/>
+      </w:pPr>
+    </w:lvl>
+    <w:lvl w:ilvl="4" w:tplc="FFFFFFFF" w:tentative="1">
+      <w:start w:val="1"/>
+      <w:numFmt w:val="lowerLetter"/>
+      <w:lvlText w:val="%5."/>
+      <w:lvlJc w:val="left"/>
+      <w:pPr>
+        <w:ind w:left="3600" w:hanging="360"/>
+      </w:pPr>
+    </w:lvl>
+    <w:lvl w:ilvl="5" w:tplc="FFFFFFFF" w:tentative="1">
+      <w:start w:val="1"/>
+      <w:numFmt w:val="lowerRoman"/>
+      <w:lvlText w:val="%6."/>
+      <w:lvlJc w:val="right"/>
+      <w:pPr>
+        <w:ind w:left="4320" w:hanging="180"/>
+      </w:pPr>
+    </w:lvl>
+    <w:lvl w:ilvl="6" w:tplc="FFFFFFFF" w:tentative="1">
+      <w:start w:val="1"/>
+      <w:numFmt w:val="decimal"/>
+      <w:lvlText w:val="%7."/>
+      <w:lvlJc w:val="left"/>
+      <w:pPr>
+        <w:ind w:left="5040" w:hanging="360"/>
+      </w:pPr>
+    </w:lvl>
+    <w:lvl w:ilvl="7" w:tplc="FFFFFFFF" w:tentative="1">
+      <w:start w:val="1"/>
+      <w:numFmt w:val="lowerLetter"/>
+      <w:lvlText w:val="%8."/>
+      <w:lvlJc w:val="left"/>
+      <w:pPr>
+        <w:ind w:left="5760" w:hanging="360"/>
+      </w:pPr>
+    </w:lvl>
+    <w:lvl w:ilvl="8" w:tplc="FFFFFFFF" w:tentative="1">
+      <w:start w:val="1"/>
+      <w:numFmt w:val="lowerRoman"/>
+      <w:lvlText w:val="%9."/>
+      <w:lvlJc w:val="right"/>
+      <w:pPr>
+        <w:ind w:left="6480" w:hanging="180"/>
+      </w:pPr>
+    </w:lvl>
+  </w:abstractNum>
+  <w:abstractNum w:abstractNumId="41" w15:restartNumberingAfterBreak="0">
     <w:nsid w:val="73CE75DB"/>
     <w:multiLevelType w:val="hybridMultilevel"/>
     <w:tmpl w:val="3704E778"/>
@@ -5527,7 +8147,96 @@
       </w:pPr>
     </w:lvl>
   </w:abstractNum>
-  <w:abstractNum w:abstractNumId="28" w15:restartNumberingAfterBreak="0">
+  <w:abstractNum w:abstractNumId="42" w15:restartNumberingAfterBreak="0">
+    <w:nsid w:val="73DC1B33"/>
+    <w:multiLevelType w:val="hybridMultilevel"/>
+    <w:tmpl w:val="47747B36"/>
+    <w:lvl w:ilvl="0" w:tplc="FFFFFFFF">
+      <w:start w:val="1"/>
+      <w:numFmt w:val="decimal"/>
+      <w:lvlText w:val="%1."/>
+      <w:lvlJc w:val="left"/>
+      <w:pPr>
+        <w:ind w:left="720" w:hanging="360"/>
+      </w:pPr>
+      <w:rPr>
+        <w:rFonts w:hint="default"/>
+      </w:rPr>
+    </w:lvl>
+    <w:lvl w:ilvl="1" w:tplc="FFFFFFFF" w:tentative="1">
+      <w:start w:val="1"/>
+      <w:numFmt w:val="lowerLetter"/>
+      <w:lvlText w:val="%2."/>
+      <w:lvlJc w:val="left"/>
+      <w:pPr>
+        <w:ind w:left="1440" w:hanging="360"/>
+      </w:pPr>
+    </w:lvl>
+    <w:lvl w:ilvl="2" w:tplc="FFFFFFFF" w:tentative="1">
+      <w:start w:val="1"/>
+      <w:numFmt w:val="lowerRoman"/>
+      <w:lvlText w:val="%3."/>
+      <w:lvlJc w:val="right"/>
+      <w:pPr>
+        <w:ind w:left="2160" w:hanging="180"/>
+      </w:pPr>
+    </w:lvl>
+    <w:lvl w:ilvl="3" w:tplc="FFFFFFFF" w:tentative="1">
+      <w:start w:val="1"/>
+      <w:numFmt w:val="decimal"/>
+      <w:lvlText w:val="%4."/>
+      <w:lvlJc w:val="left"/>
+      <w:pPr>
+        <w:ind w:left="2880" w:hanging="360"/>
+      </w:pPr>
+    </w:lvl>
+    <w:lvl w:ilvl="4" w:tplc="FFFFFFFF" w:tentative="1">
+      <w:start w:val="1"/>
+      <w:numFmt w:val="lowerLetter"/>
+      <w:lvlText w:val="%5."/>
+      <w:lvlJc w:val="left"/>
+      <w:pPr>
+        <w:ind w:left="3600" w:hanging="360"/>
+      </w:pPr>
+    </w:lvl>
+    <w:lvl w:ilvl="5" w:tplc="FFFFFFFF" w:tentative="1">
+      <w:start w:val="1"/>
+      <w:numFmt w:val="lowerRoman"/>
+      <w:lvlText w:val="%6."/>
+      <w:lvlJc w:val="right"/>
+      <w:pPr>
+        <w:ind w:left="4320" w:hanging="180"/>
+      </w:pPr>
+    </w:lvl>
+    <w:lvl w:ilvl="6" w:tplc="FFFFFFFF" w:tentative="1">
+      <w:start w:val="1"/>
+      <w:numFmt w:val="decimal"/>
+      <w:lvlText w:val="%7."/>
+      <w:lvlJc w:val="left"/>
+      <w:pPr>
+        <w:ind w:left="5040" w:hanging="360"/>
+      </w:pPr>
+    </w:lvl>
+    <w:lvl w:ilvl="7" w:tplc="FFFFFFFF" w:tentative="1">
+      <w:start w:val="1"/>
+      <w:numFmt w:val="lowerLetter"/>
+      <w:lvlText w:val="%8."/>
+      <w:lvlJc w:val="left"/>
+      <w:pPr>
+        <w:ind w:left="5760" w:hanging="360"/>
+      </w:pPr>
+    </w:lvl>
+    <w:lvl w:ilvl="8" w:tplc="FFFFFFFF" w:tentative="1">
+      <w:start w:val="1"/>
+      <w:numFmt w:val="lowerRoman"/>
+      <w:lvlText w:val="%9."/>
+      <w:lvlJc w:val="right"/>
+      <w:pPr>
+        <w:ind w:left="6480" w:hanging="180"/>
+      </w:pPr>
+    </w:lvl>
+  </w:abstractNum>
+  <w:abstractNum w:abstractNumId="43" w15:restartNumberingAfterBreak="0">
     <w:nsid w:val="754A6DA3"/>
     <w:multiLevelType w:val="hybridMultilevel"/>
     <w:tmpl w:val="67943264"/>
@@ -5616,7 +8325,7 @@
       </w:pPr>
     </w:lvl>
   </w:abstractNum>
-  <w:abstractNum w:abstractNumId="29" w15:restartNumberingAfterBreak="0">
+  <w:abstractNum w:abstractNumId="44" w15:restartNumberingAfterBreak="0">
     <w:nsid w:val="76520C70"/>
     <w:multiLevelType w:val="hybridMultilevel"/>
     <w:tmpl w:val="C28897EC"/>
@@ -5702,7 +8411,96 @@
       </w:pPr>
     </w:lvl>
   </w:abstractNum>
-  <w:abstractNum w:abstractNumId="30" w15:restartNumberingAfterBreak="0">
+  <w:abstractNum w:abstractNumId="45" w15:restartNumberingAfterBreak="0">
+    <w:nsid w:val="77F55402"/>
+    <w:multiLevelType w:val="hybridMultilevel"/>
+    <w:tmpl w:val="67943264"/>
+    <w:lvl w:ilvl="0" w:tplc="FFFFFFFF">
+      <w:start w:val="1"/>
+      <w:numFmt w:val="decimal"/>
+      <w:lvlText w:val="%1."/>
+      <w:lvlJc w:val="left"/>
+      <w:pPr>
+        <w:ind w:left="720" w:hanging="360"/>
+      </w:pPr>
+      <w:rPr>
+        <w:rFonts w:hint="default"/>
+      </w:rPr>
+    </w:lvl>
+    <w:lvl w:ilvl="1" w:tplc="FFFFFFFF" w:tentative="1">
+      <w:start w:val="1"/>
+      <w:numFmt w:val="lowerLetter"/>
+      <w:lvlText w:val="%2."/>
+      <w:lvlJc w:val="left"/>
+      <w:pPr>
+        <w:ind w:left="1440" w:hanging="360"/>
+      </w:pPr>
+    </w:lvl>
+    <w:lvl w:ilvl="2" w:tplc="FFFFFFFF" w:tentative="1">
+      <w:start w:val="1"/>
+      <w:numFmt w:val="lowerRoman"/>
+      <w:lvlText w:val="%3."/>
+      <w:lvlJc w:val="right"/>
+      <w:pPr>
+        <w:ind w:left="2160" w:hanging="180"/>
+      </w:pPr>
+    </w:lvl>
+    <w:lvl w:ilvl="3" w:tplc="FFFFFFFF" w:tentative="1">
+      <w:start w:val="1"/>
+      <w:numFmt w:val="decimal"/>
+      <w:lvlText w:val="%4."/>
+      <w:lvlJc w:val="left"/>
+      <w:pPr>
+        <w:ind w:left="2880" w:hanging="360"/>
+      </w:pPr>
+    </w:lvl>
+    <w:lvl w:ilvl="4" w:tplc="FFFFFFFF" w:tentative="1">
+      <w:start w:val="1"/>
+      <w:numFmt w:val="lowerLetter"/>
+      <w:lvlText w:val="%5."/>
+      <w:lvlJc w:val="left"/>
+      <w:pPr>
+        <w:ind w:left="3600" w:hanging="360"/>
+      </w:pPr>
+    </w:lvl>
+    <w:lvl w:ilvl="5" w:tplc="FFFFFFFF" w:tentative="1">
+      <w:start w:val="1"/>
+      <w:numFmt w:val="lowerRoman"/>
+      <w:lvlText w:val="%6."/>
+      <w:lvlJc w:val="right"/>
+      <w:pPr>
+        <w:ind w:left="4320" w:hanging="180"/>
+      </w:pPr>
+    </w:lvl>
+    <w:lvl w:ilvl="6" w:tplc="FFFFFFFF" w:tentative="1">
+      <w:start w:val="1"/>
+      <w:numFmt w:val="decimal"/>
+      <w:lvlText w:val="%7."/>
+      <w:lvlJc w:val="left"/>
+      <w:pPr>
+        <w:ind w:left="5040" w:hanging="360"/>
+      </w:pPr>
+    </w:lvl>
+    <w:lvl w:ilvl="7" w:tplc="FFFFFFFF" w:tentative="1">
+      <w:start w:val="1"/>
+      <w:numFmt w:val="lowerLetter"/>
+      <w:lvlText w:val="%8."/>
+      <w:lvlJc w:val="left"/>
+      <w:pPr>
+        <w:ind w:left="5760" w:hanging="360"/>
+      </w:pPr>
+    </w:lvl>
+    <w:lvl w:ilvl="8" w:tplc="FFFFFFFF" w:tentative="1">
+      <w:start w:val="1"/>
+      <w:numFmt w:val="lowerRoman"/>
+      <w:lvlText w:val="%9."/>
+      <w:lvlJc w:val="right"/>
+      <w:pPr>
+        <w:ind w:left="6480" w:hanging="180"/>
+      </w:pPr>
+    </w:lvl>
+  </w:abstractNum>
+  <w:abstractNum w:abstractNumId="46" w15:restartNumberingAfterBreak="0">
     <w:nsid w:val="797F4C85"/>
     <w:multiLevelType w:val="hybridMultilevel"/>
     <w:tmpl w:val="2FCC281C"/>
@@ -5791,7 +8589,7 @@
       </w:pPr>
     </w:lvl>
   </w:abstractNum>
-  <w:abstractNum w:abstractNumId="31" w15:restartNumberingAfterBreak="0">
+  <w:abstractNum w:abstractNumId="47" w15:restartNumberingAfterBreak="0">
     <w:nsid w:val="798079C1"/>
     <w:multiLevelType w:val="hybridMultilevel"/>
     <w:tmpl w:val="6A6C1FD0"/>
@@ -5877,7 +8675,7 @@
       </w:pPr>
     </w:lvl>
   </w:abstractNum>
-  <w:abstractNum w:abstractNumId="32" w15:restartNumberingAfterBreak="0">
+  <w:abstractNum w:abstractNumId="48" w15:restartNumberingAfterBreak="0">
     <w:nsid w:val="7EAE2E3E"/>
     <w:multiLevelType w:val="hybridMultilevel"/>
     <w:tmpl w:val="2FCC281C"/>
@@ -5967,103 +8765,151 @@
     </w:lvl>
   </w:abstractNum>
   <w:num w:numId="1" w16cid:durableId="1156336084">
-    <w:abstractNumId w:val="4"/>
+    <w:abstractNumId w:val="5"/>
   </w:num>
   <w:num w:numId="2" w16cid:durableId="1582522846">
+    <w:abstractNumId w:val="20"/>
+  </w:num>
+  <w:num w:numId="3" w16cid:durableId="461188822">
+    <w:abstractNumId w:val="11"/>
+  </w:num>
+  <w:num w:numId="4" w16cid:durableId="1642230097">
+    <w:abstractNumId w:val="24"/>
+  </w:num>
+  <w:num w:numId="5" w16cid:durableId="1795058492">
     <w:abstractNumId w:val="16"/>
   </w:num>
-  <w:num w:numId="3" w16cid:durableId="461188822">
-    <w:abstractNumId w:val="8"/>
-  </w:num>
-  <w:num w:numId="4" w16cid:durableId="1642230097">
-    <w:abstractNumId w:val="20"/>
-  </w:num>
-  <w:num w:numId="5" w16cid:durableId="1795058492">
-    <w:abstractNumId w:val="12"/>
-  </w:num>
   <w:num w:numId="6" w16cid:durableId="2006665820">
-    <w:abstractNumId w:val="21"/>
+    <w:abstractNumId w:val="25"/>
   </w:num>
   <w:num w:numId="7" w16cid:durableId="304553465">
     <w:abstractNumId w:val="0"/>
   </w:num>
   <w:num w:numId="8" w16cid:durableId="465397582">
+    <w:abstractNumId w:val="19"/>
+  </w:num>
+  <w:num w:numId="9" w16cid:durableId="941299325">
+    <w:abstractNumId w:val="44"/>
+  </w:num>
+  <w:num w:numId="10" w16cid:durableId="176239456">
+    <w:abstractNumId w:val="17"/>
+  </w:num>
+  <w:num w:numId="11" w16cid:durableId="2035841068">
+    <w:abstractNumId w:val="7"/>
+  </w:num>
+  <w:num w:numId="12" w16cid:durableId="2028944099">
+    <w:abstractNumId w:val="10"/>
+  </w:num>
+  <w:num w:numId="13" w16cid:durableId="1170680782">
+    <w:abstractNumId w:val="14"/>
+  </w:num>
+  <w:num w:numId="14" w16cid:durableId="1732146217">
+    <w:abstractNumId w:val="18"/>
+  </w:num>
+  <w:num w:numId="15" w16cid:durableId="1632592837">
+    <w:abstractNumId w:val="46"/>
+  </w:num>
+  <w:num w:numId="16" w16cid:durableId="583413260">
+    <w:abstractNumId w:val="22"/>
+  </w:num>
+  <w:num w:numId="17" w16cid:durableId="1659530784">
+    <w:abstractNumId w:val="21"/>
+  </w:num>
+  <w:num w:numId="18" w16cid:durableId="534006800">
+    <w:abstractNumId w:val="2"/>
+  </w:num>
+  <w:num w:numId="19" w16cid:durableId="968126754">
+    <w:abstractNumId w:val="4"/>
+  </w:num>
+  <w:num w:numId="20" w16cid:durableId="1553224610">
+    <w:abstractNumId w:val="30"/>
+  </w:num>
+  <w:num w:numId="21" w16cid:durableId="2100322992">
+    <w:abstractNumId w:val="31"/>
+  </w:num>
+  <w:num w:numId="22" w16cid:durableId="512383415">
+    <w:abstractNumId w:val="12"/>
+  </w:num>
+  <w:num w:numId="23" w16cid:durableId="1597639659">
+    <w:abstractNumId w:val="47"/>
+  </w:num>
+  <w:num w:numId="24" w16cid:durableId="301085384">
+    <w:abstractNumId w:val="26"/>
+  </w:num>
+  <w:num w:numId="25" w16cid:durableId="1259215891">
+    <w:abstractNumId w:val="28"/>
+  </w:num>
+  <w:num w:numId="26" w16cid:durableId="1942908283">
+    <w:abstractNumId w:val="23"/>
+  </w:num>
+  <w:num w:numId="27" w16cid:durableId="906843712">
+    <w:abstractNumId w:val="41"/>
+  </w:num>
+  <w:num w:numId="28" w16cid:durableId="995649532">
     <w:abstractNumId w:val="15"/>
   </w:num>
-  <w:num w:numId="9" w16cid:durableId="941299325">
-    <w:abstractNumId w:val="29"/>
+  <w:num w:numId="29" w16cid:durableId="1182744798">
+    <w:abstractNumId w:val="43"/>
   </w:num>
-  <w:num w:numId="10" w16cid:durableId="176239456">
+  <w:num w:numId="30" w16cid:durableId="915239554">
+    <w:abstractNumId w:val="48"/>
+  </w:num>
+  <w:num w:numId="31" w16cid:durableId="263539129">
+    <w:abstractNumId w:val="3"/>
+  </w:num>
+  <w:num w:numId="32" w16cid:durableId="1254827101">
+    <w:abstractNumId w:val="34"/>
+  </w:num>
+  <w:num w:numId="33" w16cid:durableId="1878076917">
+    <w:abstractNumId w:val="8"/>
+  </w:num>
+  <w:num w:numId="34" w16cid:durableId="809857252">
+    <w:abstractNumId w:val="6"/>
+  </w:num>
+  <w:num w:numId="35" w16cid:durableId="757290290">
+    <w:abstractNumId w:val="40"/>
+  </w:num>
+  <w:num w:numId="36" w16cid:durableId="52050070">
+    <w:abstractNumId w:val="33"/>
+  </w:num>
+  <w:num w:numId="37" w16cid:durableId="575019621">
+    <w:abstractNumId w:val="32"/>
+  </w:num>
+  <w:num w:numId="38" w16cid:durableId="147064672">
+    <w:abstractNumId w:val="36"/>
+  </w:num>
+  <w:num w:numId="39" w16cid:durableId="1616256584">
+    <w:abstractNumId w:val="38"/>
+  </w:num>
+  <w:num w:numId="40" w16cid:durableId="1368289766">
+    <w:abstractNumId w:val="1"/>
+  </w:num>
+  <w:num w:numId="41" w16cid:durableId="366680934">
+    <w:abstractNumId w:val="27"/>
+  </w:num>
+  <w:num w:numId="42" w16cid:durableId="645819416">
+    <w:abstractNumId w:val="42"/>
+  </w:num>
+  <w:num w:numId="43" w16cid:durableId="1761637897">
+    <w:abstractNumId w:val="9"/>
+  </w:num>
+  <w:num w:numId="44" w16cid:durableId="510098437">
     <w:abstractNumId w:val="13"/>
   </w:num>
-  <w:num w:numId="11" w16cid:durableId="2035841068">
-    <w:abstractNumId w:val="5"/>
+  <w:num w:numId="45" w16cid:durableId="1795907198">
+    <w:abstractNumId w:val="39"/>
   </w:num>
-  <w:num w:numId="12" w16cid:durableId="2028944099">
-    <w:abstractNumId w:val="7"/>
+  <w:num w:numId="46" w16cid:durableId="1208759766">
+    <w:abstractNumId w:val="35"/>
   </w:num>
-  <w:num w:numId="13" w16cid:durableId="1170680782">
-    <w:abstractNumId w:val="10"/>
+  <w:num w:numId="47" w16cid:durableId="826824099">
+    <w:abstractNumId w:val="37"/>
   </w:num>
-  <w:num w:numId="14" w16cid:durableId="1732146217">
-    <w:abstractNumId w:val="14"/>
+  <w:num w:numId="48" w16cid:durableId="148984023">
+    <w:abstractNumId w:val="45"/>
   </w:num>
-  <w:num w:numId="15" w16cid:durableId="1632592837">
-    <w:abstractNumId w:val="30"/>
-  </w:num>
-  <w:num w:numId="16" w16cid:durableId="583413260">
-    <w:abstractNumId w:val="18"/>
-  </w:num>
-  <w:num w:numId="17" w16cid:durableId="1659530784">
-    <w:abstractNumId w:val="17"/>
-  </w:num>
-  <w:num w:numId="18" w16cid:durableId="534006800">
-    <w:abstractNumId w:val="1"/>
-  </w:num>
-  <w:num w:numId="19" w16cid:durableId="968126754">
-    <w:abstractNumId w:val="3"/>
-  </w:num>
-  <w:num w:numId="20" w16cid:durableId="1553224610">
-    <w:abstractNumId w:val="24"/>
-  </w:num>
-  <w:num w:numId="21" w16cid:durableId="2100322992">
-    <w:abstractNumId w:val="25"/>
-  </w:num>
-  <w:num w:numId="22" w16cid:durableId="512383415">
-    <w:abstractNumId w:val="9"/>
-  </w:num>
-  <w:num w:numId="23" w16cid:durableId="1597639659">
-    <w:abstractNumId w:val="31"/>
-  </w:num>
-  <w:num w:numId="24" w16cid:durableId="301085384">
-    <w:abstractNumId w:val="22"/>
-  </w:num>
-  <w:num w:numId="25" w16cid:durableId="1259215891">
-    <w:abstractNumId w:val="23"/>
-  </w:num>
-  <w:num w:numId="26" w16cid:durableId="1942908283">
-    <w:abstractNumId w:val="19"/>
-  </w:num>
-  <w:num w:numId="27" w16cid:durableId="906843712">
-    <w:abstractNumId w:val="27"/>
-  </w:num>
-  <w:num w:numId="28" w16cid:durableId="995649532">
-    <w:abstractNumId w:val="11"/>
-  </w:num>
-  <w:num w:numId="29" w16cid:durableId="1182744798">
-    <w:abstractNumId w:val="28"/>
-  </w:num>
-  <w:num w:numId="30" w16cid:durableId="915239554">
-    <w:abstractNumId w:val="32"/>
-  </w:num>
-  <w:num w:numId="31" w16cid:durableId="263539129">
-    <w:abstractNumId w:val="2"/>
-  </w:num>
-  <w:num w:numId="32" w16cid:durableId="1254827101">
-    <w:abstractNumId w:val="26"/>
-  </w:num>
-  <w:num w:numId="33" w16cid:durableId="1878076917">
-    <w:abstractNumId w:val="6"/>
+  <w:num w:numId="49" w16cid:durableId="359748845">
+    <w:abstractNumId w:val="29"/>
   </w:num>
 </w:numbering>
 </file>
@@ -6468,7 +9314,7 @@
   <w:style w:type="paragraph" w:default="1" w:styleId="Normal">
     <w:name w:val="Normal"/>
     <w:qFormat/>
-    <w:rsid w:val="00720174"/>
+    <w:rsid w:val="00667833"/>
   </w:style>
   <w:style w:type="paragraph" w:styleId="Ttulo1">
     <w:name w:val="heading 1"/>
@@ -6672,7 +9518,6 @@
   <w:style w:type="character" w:default="1" w:styleId="Fuentedeprrafopredeter">
     <w:name w:val="Default Paragraph Font"/>
     <w:uiPriority w:val="1"/>
-    <w:semiHidden/>
     <w:unhideWhenUsed/>
   </w:style>
   <w:style w:type="table" w:default="1" w:styleId="Tablanormal">

</xml_diff>